<commit_message>
docs: remove Qigang Xu from author list (5 authors)
- Authors: Zhuha Zhou*, Chen Weisheng†, Yiqi Cai, Yongyu Bai, Zhuxian Zhou^
- Reaffiliated Zhuxian Zhou to 2 (removed Hepatobiliary affiliation 3)
- Updated manuscript.md, manuscript_bioinformatics.md, cover letters, README, journal_requirements
- Regenerated DOCX (Qigang absent, Chen/Yiqi present)
</commit_message>
<xml_diff>
--- a/05_Submission/manuscript.docx
+++ b/05_Submission/manuscript.docx
@@ -62,16 +62,10 @@
         <w:t xml:space="preserve">1</w:t>
       </w:r>
       <w:r>
-        <w:t xml:space="preserve">, Qigang Xu</w:t>
-      </w:r>
-      <w:r>
-        <w:t xml:space="preserve">2</w:t>
-      </w:r>
-      <w:r>
         <w:t xml:space="preserve">, Zhuxian Zhou</w:t>
       </w:r>
       <w:r>
-        <w:t xml:space="preserve">3,^</w:t>
+        <w:t xml:space="preserve">2,^</w:t>
       </w:r>
     </w:p>
     <w:p>
@@ -105,18 +99,6 @@
       </w:r>
       <w:r>
         <w:t xml:space="preserve">2</w:t>
-      </w:r>
-      <w:r>
-        <w:t xml:space="preserve"> </w:t>
-      </w:r>
-      <w:r>
-        <w:t xml:space="preserve">Department of Hepatobiliary and Pancreatic Surgery, The First Affiliated Hospital of Wenzhou Medical University, Nanbaixiang Street, Ouhai District, 325000 Wenzhou, Zhejiang, China</w:t>
-      </w:r>
-      <w:r>
-        <w:br/>
-      </w:r>
-      <w:r>
-        <w:t xml:space="preserve">3</w:t>
       </w:r>
       <w:r>
         <w:t xml:space="preserve"> </w:t>
@@ -4439,7 +4421,7 @@
         <w:pStyle w:val="FirstParagraph"/>
       </w:pPr>
       <w:r>
-        <w:t xml:space="preserve">Zhuha Zhou and Chen Weisheng: conception, design, data analysis, manuscript writing. Yiqi Cai: data analysis, manuscript writing. Yongyu Bai and Qigang Xu: data interpretation, manuscript revision. Zhuxian Zhou: supervision, manuscript revision. All authors read and approved the final manuscript.</w:t>
+        <w:t xml:space="preserve">Zhuha Zhou and Chen Weisheng: conception, design, data analysis, manuscript writing. Yiqi Cai: data analysis, manuscript writing. Yongyu Bai: data interpretation, manuscript revision. Zhuxian Zhou: supervision, manuscript revision. All authors read and approved the final manuscript.</w:t>
       </w:r>
     </w:p>
     <w:bookmarkEnd w:id="45"/>
@@ -4566,24 +4548,6 @@
       </w:r>
       <w:r>
         <w:t xml:space="preserve">is a surgeon-researcher in the Department of Gastroenterology Surgery at The First Affiliated Hospital of Wenzhou Medical University. His research interests include gastrointestinal oncology and immunoinformatics.</w:t>
-      </w:r>
-    </w:p>
-    <w:p>
-      <w:pPr>
-        <w:pStyle w:val="BodyText"/>
-      </w:pPr>
-      <w:r>
-        <w:rPr>
-          <w:b/>
-          <w:bCs/>
-        </w:rPr>
-        <w:t xml:space="preserve">Qigang Xu</w:t>
-      </w:r>
-      <w:r>
-        <w:t xml:space="preserve"> </w:t>
-      </w:r>
-      <w:r>
-        <w:t xml:space="preserve">is a surgeon in the Department of Hepatobiliary and Pancreatic Surgery at The First Affiliated Hospital of Wenzhou Medical University. His research focuses on hepatobiliary and pancreatic cancer.</w:t>
       </w:r>
     </w:p>
     <w:p>

</xml_diff>

<commit_message>
sync: update scripts, state, and submission DOCX after companion note deletion
- plot_findings_panel.py: findings_panel.pdf now to to_human/ (old dir deleted)
- plot_pan_vs_perallele.py: outputs to 03_Analysis/figures/Figure9_pan_vs_perallele.{png,pdf}
- Regenerated Figure9 pdf + findings_panel pdf at new paths
- research-state.yaml: companion note marked deleted; Figure 9 location updated
- 05_Submission/manuscript.docx: regenerated from merged manuscript_bioinformatics.md
  (verified contains multi-allele: pan16, 0.819, Type B, Multi-Allele)

Co-Authored-By: Claude Sonnet 3.5 <noreply@anthropic.com>
</commit_message>
<xml_diff>
--- a/05_Submission/manuscript.docx
+++ b/05_Submission/manuscript.docx
@@ -2,7 +2,7 @@
 <file path=word/document.xml><?xml version="1.0" encoding="utf-8"?>
 <w:document xmlns:w="http://schemas.openxmlformats.org/wordprocessingml/2006/main" xmlns:m="http://schemas.openxmlformats.org/officeDocument/2006/math" xmlns:r="http://schemas.openxmlformats.org/officeDocument/2006/relationships" xmlns:o="urn:schemas-microsoft-com:office:office" xmlns:v="urn:schemas-microsoft-com:vml" xmlns:w10="urn:schemas-microsoft-com:office:word" xmlns:a="http://schemas.openxmlformats.org/drawingml/2006/main" xmlns:pic="http://schemas.openxmlformats.org/drawingml/2006/picture" xmlns:wp="http://schemas.openxmlformats.org/drawingml/2006/wordprocessingDrawing">
   <w:body>
-    <w:bookmarkStart w:id="91" w:name="X9472a0112dc6d685752c5ae1ecdbaeb4165c804"/>
+    <w:bookmarkStart w:id="57" w:name="X9472a0112dc6d685752c5ae1ecdbaeb4165c804"/>
     <w:p>
       <w:pPr>
         <w:pStyle w:val="Heading1"/>
@@ -14,21 +14,6 @@
     <w:p>
       <w:pPr>
         <w:pStyle w:val="FirstParagraph"/>
-      </w:pPr>
-      <w:r>
-        <w:rPr>
-          <w:b/>
-          <w:bCs/>
-        </w:rPr>
-        <w:t xml:space="preserve">Running head</w:t>
-      </w:r>
-      <w:r>
-        <w:t xml:space="preserve">: Label Contamination Cascade in pMHC Binding Prediction</w:t>
-      </w:r>
-    </w:p>
-    <w:p>
-      <w:pPr>
-        <w:pStyle w:val="BodyText"/>
       </w:pPr>
       <w:r>
         <w:rPr>
@@ -157,7 +142,7 @@
         <w:t xml:space="preserve">Word count</w:t>
       </w:r>
       <w:r>
-        <w:t xml:space="preserve">: ~8,500 (main text) |</w:t>
+        <w:t xml:space="preserve">: ~10,700 (main text) |</w:t>
       </w:r>
       <w:r>
         <w:t xml:space="preserve"> </w:t>
@@ -170,7 +155,7 @@
         <w:t xml:space="preserve">Tables</w:t>
       </w:r>
       <w:r>
-        <w:t xml:space="preserve">: 6 |</w:t>
+        <w:t xml:space="preserve">: 7 |</w:t>
       </w:r>
       <w:r>
         <w:t xml:space="preserve"> </w:t>
@@ -183,7 +168,7 @@
         <w:t xml:space="preserve">Figures</w:t>
       </w:r>
       <w:r>
-        <w:t xml:space="preserve">: 8</w:t>
+        <w:t xml:space="preserve">: 9</w:t>
       </w:r>
     </w:p>
     <w:p>
@@ -253,7 +238,7 @@
         <w:t xml:space="preserve">Conclusions</w:t>
       </w:r>
       <w:r>
-        <w:t xml:space="preserve">: Label provenance defines the achievable performance ceiling for peptide-MHC binding prediction; architecture choice is secondary. The 2.9 ppt gap between deterministic and ML-derived labels — concentrated in the weak binder class — constitutes direct quantitative evidence for a label contamination cascade in which successive predictor generations amplify weak binder ambiguity. The weak binder class serves as an early-warning signal for this cascade, and we propose that future benchmarks report label provenance and per-class WB metrics as standard practice.</w:t>
+        <w:t xml:space="preserve">: Label provenance defines the achievable performance ceiling for peptide-MHC binding prediction; architecture choice is secondary. The 2.9 ppt gap between deterministic and ML-derived labels — concentrated in the weak binder class — constitutes direct quantitative evidence for a label contamination cascade in which successive predictor generations amplify weak binder ambiguity. The weak binder class serves as an early-warning signal for this cascade, and we propose that future benchmarks report label provenance and per-class WB metrics as standard practice. A multi-allele extension shows the recipe generalises: a rebalanced pan-specific Deep FFN matches per-allele specialists across five alleles (and 0.819 pooled sensitivity across a 15-allele panel), while non-canonical binders plateau at ~0.65 sensitivity across sequence- and structure-based predictors alike — the energy-compensated tail (e.g. P2-K, P2-R, P2-H reaching Glu63) remains genuinely prediction-resistant, defining the current frontier.</w:t>
       </w:r>
     </w:p>
     <w:p>
@@ -278,88 +263,6 @@
         </w:pict>
       </w:r>
     </w:p>
-    <w:bookmarkEnd w:id="9"/>
-    <w:bookmarkStart w:id="10" w:name="key-points"/>
-    <w:p>
-      <w:pPr>
-        <w:pStyle w:val="Heading2"/>
-      </w:pPr>
-      <w:r>
-        <w:t xml:space="preserve">Key Points</w:t>
-      </w:r>
-    </w:p>
-    <w:p>
-      <w:pPr>
-        <w:pStyle w:val="Compact"/>
-        <w:numPr>
-          <w:ilvl w:val="0"/>
-          <w:numId w:val="1001"/>
-        </w:numPr>
-      </w:pPr>
-      <w:r>
-        <w:t xml:space="preserve">Label provenance accounts for ~29 percentage points of accuracy variation (PSSM 94.8% vs. random 65.8%) — three times the maximum inter-architecture range — defining the performance ceiling for peptide-MHC binding prediction.</w:t>
-      </w:r>
-    </w:p>
-    <w:p>
-      <w:pPr>
-        <w:pStyle w:val="Compact"/>
-        <w:numPr>
-          <w:ilvl w:val="0"/>
-          <w:numId w:val="1001"/>
-        </w:numPr>
-      </w:pPr>
-      <w:r>
-        <w:t xml:space="preserve">This variation is concentrated exclusively in the weak binder class (F1 0.723–0.925), establishing WB performance as a quantitative sentinel for label contamination. The 2.9 ppt PSSM-MHCflurry gap directly quantifies the extent to which ML-derived training labels compound the inherently ambiguous SB-WB-NB boundary.</w:t>
-      </w:r>
-    </w:p>
-    <w:p>
-      <w:pPr>
-        <w:pStyle w:val="Compact"/>
-        <w:numPr>
-          <w:ilvl w:val="0"/>
-          <w:numId w:val="1001"/>
-        </w:numPr>
-      </w:pPr>
-      <w:r>
-        <w:t xml:space="preserve">ESM-2 t6 per-position embeddings (2,880-dim, 93.3%) modestly outperformed BLOSUM62 (91.9%) in single-split evaluation, but five-fold cross-validation revealed BLOSUM62 generalises substantially better (92.1 ± 0.3% vs. 82.2 ± 1.0%), demonstrating that high-dimensional protein language model embeddings overfit on small training sets. Mean-pooled embeddings collapsed to 65.9%, confirming positional information is essential.</w:t>
-      </w:r>
-    </w:p>
-    <w:p>
-      <w:pPr>
-        <w:pStyle w:val="Compact"/>
-        <w:numPr>
-          <w:ilvl w:val="0"/>
-          <w:numId w:val="1001"/>
-        </w:numPr>
-      </w:pPr>
-      <w:r>
-        <w:t xml:space="preserve">IEDB benchmark: 93.9% sensitivity (46/49, ROC AUC 0.947). All false negatives carried non-canonical p9 anchors; domain-knowledge-informed filtering of homopolymeric false positives improved specificity to 100%.</w:t>
-      </w:r>
-    </w:p>
-    <w:p>
-      <w:pPr>
-        <w:pStyle w:val="Compact"/>
-        <w:numPr>
-          <w:ilvl w:val="0"/>
-          <w:numId w:val="1001"/>
-        </w:numPr>
-      </w:pPr>
-      <w:r>
-        <w:t xml:space="preserve">Template-based structural analysis predicts a K-E63 salt bridge (−30 kcal/mol) compensating for the non-canonical P2 lysine in the KRAS G12V neoepitope. Multi-allele extension: a rebalanced pan Deep FFN generalises to a 15-allele panel (0.819 pooled non-canonical sensitivity; 12/15 alleles ≥0.76), with temporal holdout confirming preserved recognition of post-2022 epitopes. Yet non-canonical binders plateau at ~0.65 across sequence and structure-based predictors (Deep FFN, MHCflurry, MUNIS) — the energy-compensated tail (e.g. P2-K, P2-R, P2-H) remains genuinely prediction-resistant, defining the current frontier.</w:t>
-      </w:r>
-    </w:p>
-    <w:p>
-      <w:pPr>
-        <w:pStyle w:val="Compact"/>
-        <w:numPr>
-          <w:ilvl w:val="0"/>
-          <w:numId w:val="1001"/>
-        </w:numPr>
-      </w:pPr>
-      <w:r>
-        <w:t xml:space="preserve">We propose the weak binder F1 as a standard reporting metric and recommend that future benchmarking studies explicitly report label provenance and quantify the fraction of computationally derived training labels.</w:t>
-      </w:r>
-    </w:p>
     <w:p>
       <w:r>
         <w:pict>
@@ -367,8 +270,8 @@
         </w:pict>
       </w:r>
     </w:p>
-    <w:bookmarkEnd w:id="10"/>
-    <w:bookmarkStart w:id="11" w:name="introduction"/>
+    <w:bookmarkEnd w:id="9"/>
+    <w:bookmarkStart w:id="10" w:name="introduction"/>
     <w:p>
       <w:pPr>
         <w:pStyle w:val="Heading2"/>
@@ -382,39 +285,39 @@
         <w:pStyle w:val="FirstParagraph"/>
       </w:pPr>
       <w:r>
-        <w:t xml:space="preserve">The adaptive immune system relies on the presentation of peptide antigens by major histocompatibility complex class I (MHC-I) molecules on the surface of nucleated cells. These peptide-MHC complexes (pMHC) are surveyed by CD8+ cytotoxic T lymphocytes, which eliminate cells displaying foreign or aberrant peptides arising from viral infection or somatic mutation [1, 2]. The molecular specificity of this surveillance system is governed largely by the physical interaction between the peptide and the MHC-I binding groove [3, 4]. For the most prevalent human MHC-I allele globally, HLA-A*02:01, binding is dominated by two primary anchor positions – position 2 (p2), which preferentially accommodates hydrophobic residues (leucine, methionine, isoleucine, valine), and position 9 (p9), the C-terminal anchor with an even stronger preference for valine and leucine [5, 6].</w:t>
-      </w:r>
-    </w:p>
-    <w:p>
-      <w:pPr>
-        <w:pStyle w:val="BodyText"/>
-      </w:pPr>
-      <w:r>
-        <w:t xml:space="preserve">The ability to computationally predict which peptides will bind to a given MHC allele has been a central challenge in immunoinformatics for over two decades [7, 8]. Early methods employed position-specific scoring matrices [9, 10], followed by machine learning approaches including artificial neural networks such as NetMHC [11] and NetMHCpan [12, 13]. Contemporary methods, including MHCflurry [14, 15], BigMHC [16], and MUNIS [17], increasingly use deep learning architectures and protein language model embeddings [18]; recent reviews document the rapid proliferation of AI-driven epitope prediction tools [19, 20].</w:t>
-      </w:r>
-    </w:p>
-    <w:p>
-      <w:pPr>
-        <w:pStyle w:val="BodyText"/>
-      </w:pPr>
-      <w:r>
-        <w:t xml:space="preserve">Several gaps remain. First, while systematic benchmarking efforts exist — including the IEDB automated benchmark (Trolle et al., 2015) and recent multi-predictor comparisons — head-to-head architecture comparisons under fully controlled conditions (identical training data, encoding, and evaluation protocols) are still uncommon [19]. Second, the impact of training label quality on downstream model performance is seldom quantified, despite emerging evidence that over 55% of IEDB entries are computationally rather than experimentally labelled (Preibisch et al., 2026). Third, the translation of binding prediction models to real-world epitope discovery tasks is often described in principle but rarely demonstrated in a unified, reproducible pipeline. Finally, the advent of protein language models such as ESM-2 (Evolutionary Scale Modeling) [18] offers new peptide encoding strategies, but systematic comparisons against established encodings such as BLOSUM62 under controlled conditions are needed to guide practical tool development.</w:t>
-      </w:r>
-    </w:p>
-    <w:p>
-      <w:pPr>
-        <w:pStyle w:val="BodyText"/>
-      </w:pPr>
-      <w:r>
-        <w:t xml:space="preserve">This study addresses these gaps through a systematic benchmark designed to isolate the effects of architecture choice, label quality, and peptide encoding on binding prediction performance. Building on Jessen’s demonstration that a simple feed-forward neural network could classify peptides with approximately 95% accuracy using netMHCpan-derived labels [21], we contribute: (i) quantification of label quality effects across three labelling strategies (MHCflurry 2.2.0, PSSM, random synthetic), demonstrating that label provenance accounts for more performance variation than architecture choice; (ii) a controlled six-architecture comparison on a common dataset, confirming that simpler architectures with appropriate regularisation match or exceed more complex models for this task; (iii) evaluation of ESM-2 protein language model embeddings against BLOSUM62 encoding, including a mean-pooled ablation that confirms positional information is essential; (iv) external validation against 49 experimentally verified IEDB epitopes; (v) translational application through protein epitope scanning and cancer mutation analysis; and (vi) molecular docking-based structural hypotheses for neoepitope-MHC interactions. All analyses are implemented in a fully reproducible pipeline with open-source code and data.</w:t>
-      </w:r>
-    </w:p>
-    <w:p>
-      <w:pPr>
-        <w:pStyle w:val="BodyText"/>
-      </w:pPr>
-      <w:r>
-        <w:t xml:space="preserve">The translational endpoint of computational epitope prediction is personalized neoantigen cancer vaccination, which has recently entered pivotal clinical trials [50]. mRNA-based personalized vaccines, including mRNA-4157 (V940) now in Phase III evaluation for high-risk melanoma, have demonstrated that computational epitope selection pipelines can enable clinically actionable immunotherapy [51]. These advances underscore the growing need for rigorously benchmarked, reproducible prediction tools — the central contribution of the present study.</w:t>
+        <w:t xml:space="preserve">The adaptive immune system relies on the presentation of peptide antigens by major histocompatibility complex class I (MHC-I) molecules on the surface of nucleated cells. These peptide-MHC complexes (pMHC) are surveyed by CD8+ cytotoxic T lymphocytes, which eliminate cells displaying foreign or aberrant peptides arising from viral infection or somatic mutation (Neefjes et al., 2011; Blum et al., 2013). The molecular specificity of this surveillance system is governed largely by the physical interaction between the peptide and the MHC-I binding groove (Falk et al., 1991; Madden, 1995). For the most prevalent human MHC-I allele globally, HLA-A*02:01, binding is dominated by two primary anchor positions – position 2 (p2), which preferentially accommodates hydrophobic residues (leucine, methionine, isoleucine, valine), and position 9 (p9), the C-terminal anchor with an even stronger preference for valine and leucine (Ruppert et al., 1993; Rammensee et al., 1995).</w:t>
+      </w:r>
+    </w:p>
+    <w:p>
+      <w:pPr>
+        <w:pStyle w:val="BodyText"/>
+      </w:pPr>
+      <w:r>
+        <w:t xml:space="preserve">The ability to computationally predict which peptides will bind to a given MHC allele has been a central challenge in immunoinformatics for over two decades (Lundegaard et al., 2011; Backert and Kohlbacher, 2015). Early methods employed position-specific scoring matrices (Parker et al., 1994; Rammensee et al., 1999), followed by machine learning approaches including artificial neural networks such as NetMHC (Nielsen et al., 2003) and NetMHCpan (Hoof et al., 2009; Reynisson et al., 2020). Contemporary methods, including MHCflurry (O’Donnell et al., 2018; O’Donnell et al., 2020), BigMHC (Albert et al., 2023), and MUNIS (Chen et al., 2025), increasingly use deep learning architectures and protein language model embeddings (Rives et al., 2021); recent reviews document the rapid proliferation of AI-driven epitope prediction tools (Oluwagbemi et al., 2025; Qi et al., 2025).</w:t>
+      </w:r>
+    </w:p>
+    <w:p>
+      <w:pPr>
+        <w:pStyle w:val="BodyText"/>
+      </w:pPr>
+      <w:r>
+        <w:t xml:space="preserve">Several gaps remain. First, while systematic benchmarking efforts exist — including the IEDB automated benchmark (Trolle et al., 2015) and recent multi-predictor comparisons — head-to-head architecture comparisons under fully controlled conditions (identical training data, encoding, and evaluation protocols) are still uncommon (Oluwagbemi et al., 2025). Second, the impact of training label quality on downstream model performance is seldom quantified, despite emerging evidence that over 55% of IEDB entries are computationally rather than experimentally labelled (Preibisch et al., 2026). Third, the translation of binding prediction models to real-world epitope discovery tasks is often described in principle but rarely demonstrated in a unified, reproducible pipeline. Finally, the advent of protein language models such as ESM-2 (Evolutionary Scale Modeling) (Rives et al., 2021) offers new peptide encoding strategies, but systematic comparisons against established encodings such as BLOSUM62 under controlled conditions are needed to guide practical tool development.</w:t>
+      </w:r>
+    </w:p>
+    <w:p>
+      <w:pPr>
+        <w:pStyle w:val="BodyText"/>
+      </w:pPr>
+      <w:r>
+        <w:t xml:space="preserve">This study addresses these gaps through a systematic benchmark designed to isolate the effects of architecture choice, label quality, and peptide encoding on binding prediction performance. Building on Jessen’s demonstration that a simple feed-forward neural network could classify peptides with approximately 95% accuracy using netMHCpan-derived labels (Jessen, 2018), we contribute: (i) quantification of label quality effects across three labelling strategies (MHCflurry 2.2.0, PSSM, random synthetic), demonstrating that label provenance accounts for more performance variation than architecture choice; (ii) a controlled six-architecture comparison on a common dataset, confirming that simpler architectures with appropriate regularisation match or exceed more complex models for this task; (iii) evaluation of ESM-2 protein language model embeddings against BLOSUM62 encoding, including a mean-pooled ablation that confirms positional information is essential; (iv) external validation against 49 experimentally verified IEDB epitopes; (v) translational application through protein epitope scanning and cancer mutation analysis; and (vi) molecular docking-based structural hypotheses for neoepitope-MHC interactions. All analyses are implemented in a fully reproducible pipeline with open-source code and data.</w:t>
+      </w:r>
+    </w:p>
+    <w:p>
+      <w:pPr>
+        <w:pStyle w:val="BodyText"/>
+      </w:pPr>
+      <w:r>
+        <w:t xml:space="preserve">The translational endpoint of computational epitope prediction is personalized neoantigen cancer vaccination, which has recently entered pivotal clinical trials (Katsikis et al., 2023). mRNA-based personalized vaccines, including mRNA-4157 (V940) now in Phase III evaluation for high-risk melanoma, have demonstrated that computational epitope selection pipelines can enable clinically actionable immunotherapy (Yaremenko et al., 2025). These advances underscore the growing need for rigorously benchmarked, reproducible prediction tools — the central contribution of the present study.</w:t>
       </w:r>
     </w:p>
     <w:p>
@@ -432,23 +335,49 @@
         </w:pict>
       </w:r>
     </w:p>
+    <w:bookmarkEnd w:id="10"/>
+    <w:bookmarkStart w:id="21" w:name="methods"/>
+    <w:p>
+      <w:pPr>
+        <w:pStyle w:val="Heading2"/>
+      </w:pPr>
+      <w:r>
+        <w:t xml:space="preserve">2. Methods</w:t>
+      </w:r>
+    </w:p>
+    <w:bookmarkStart w:id="11" w:name="training-data-generation"/>
+    <w:p>
+      <w:pPr>
+        <w:pStyle w:val="Heading3"/>
+      </w:pPr>
+      <w:r>
+        <w:t xml:space="preserve">2.1 Training Data Generation</w:t>
+      </w:r>
+    </w:p>
+    <w:p>
+      <w:pPr>
+        <w:pStyle w:val="FirstParagraph"/>
+      </w:pPr>
+      <w:r>
+        <w:t xml:space="preserve">A total of 100,000 random 9-mer peptides were generated by uniform sampling of the 20 standard amino acids. We note that uniform sampling produces amino acid frequencies that differ from natural proteomes (e.g., Trp and Cys are equally probable as Leu under uniform sampling, whereas in natural proteins, Leu ≈ 9.6% and Trp ≈ 1.3%). This choice ensures coverage of all amino acids at all positions for training a generalizable binding predictor, but means the training distribution differs from the evaluation distribution (natural protein sequences in epitope scanning); this distributional mismatch is unlikely to affect anchor position learning but could influence predictions for peptides with rare residues at non-anchor positions. Each peptide was submitted to MHCflurry 2.2.0 (O’Donnell et al., 2020) for binding affinity prediction against HLA-A*02:01. Peptides were assigned to three classes following the netMHCpan convention (Reynisson et al., 2020): Strong Binder (SB, percentile rank &lt; 0.5%), Weak Binder (WB, 0.5% &lt;= rank &lt; 2.0%), and Non-Binder (NB, rank &gt;= 2.0%). The resulting class distribution (1.7% SB, 5.1% WB, 93.2% NB) was balanced by downsampling to 1,696 per class (total 5,088), then partitioned into training (90%, n = 4,579) and held-out test (10%, n = 509) sets with stratified sampling.</w:t>
+      </w:r>
+    </w:p>
+    <w:p>
+      <w:pPr>
+        <w:pStyle w:val="BodyText"/>
+      </w:pPr>
+      <w:r>
+        <w:t xml:space="preserve">Two comparison labelling strategies were implemented: a position-specific scoring matrix (PSSM) encoding crystallographically determined HLA-A*02:01 anchor preferences, and random synthetic labels with weak anchor bias as a baseline control. Additionally, an external benchmark set of 69 peptides was curated from IEDB (Vita et al., 2018), comprising 49 experimentally validated HLA-A*02:01 T-cell epitopes and 20 homopolymer negative controls.</w:t>
+      </w:r>
+    </w:p>
     <w:bookmarkEnd w:id="11"/>
-    <w:bookmarkStart w:id="19" w:name="methods"/>
-    <w:p>
-      <w:pPr>
-        <w:pStyle w:val="Heading2"/>
-      </w:pPr>
-      <w:r>
-        <w:t xml:space="preserve">2. Methods</w:t>
-      </w:r>
-    </w:p>
-    <w:bookmarkStart w:id="12" w:name="training-data-generation"/>
+    <w:bookmarkStart w:id="12" w:name="peptide-encoding"/>
     <w:p>
       <w:pPr>
         <w:pStyle w:val="Heading3"/>
       </w:pPr>
       <w:r>
-        <w:t xml:space="preserve">2.1 Training Data Generation</w:t>
+        <w:t xml:space="preserve">2.2 Peptide Encoding</w:t>
       </w:r>
     </w:p>
     <w:p>
@@ -456,45 +385,19 @@
         <w:pStyle w:val="FirstParagraph"/>
       </w:pPr>
       <w:r>
-        <w:t xml:space="preserve">A total of 100,000 random 9-mer peptides were generated by uniform sampling of the 20 standard amino acids. We note that uniform sampling produces amino acid frequencies that differ from natural proteomes (e.g., Trp and Cys are equally probable as Leu under uniform sampling, whereas in natural proteins, Leu ≈ 9.6% and Trp ≈ 1.3%). This choice ensures coverage of all amino acids at all positions for training a generalizable binding predictor, but means the training distribution differs from the evaluation distribution (natural protein sequences in epitope scanning); this distributional mismatch is unlikely to affect anchor position learning but could influence predictions for peptides with rare residues at non-anchor positions. Each peptide was submitted to MHCflurry 2.2.0 [15] for binding affinity prediction against HLA-A*02:01. Peptides were assigned to three classes following the netMHCpan convention [13]: Strong Binder (SB, percentile rank &lt; 0.5%), Weak Binder (WB, 0.5% &lt;= rank &lt; 2.0%), and Non-Binder (NB, rank &gt;= 2.0%). The resulting class distribution (1.7% SB, 5.1% WB, 93.2% NB) was balanced by downsampling to 1,696 per class (total 5,088), then partitioned into training (90%, n = 4,579) and held-out test (10%, n = 509) sets with stratified sampling.</w:t>
-      </w:r>
-    </w:p>
-    <w:p>
-      <w:pPr>
-        <w:pStyle w:val="BodyText"/>
-      </w:pPr>
-      <w:r>
-        <w:t xml:space="preserve">Two comparison labelling strategies were implemented: a position-specific scoring matrix (PSSM) encoding crystallographically determined HLA-A*02:01 anchor preferences, and random synthetic labels with weak anchor bias as a baseline control. Additionally, an external benchmark set of 69 peptides was curated from IEDB [22], comprising 49 experimentally validated HLA-A*02:01 T-cell epitopes and 20 homopolymer negative controls.</w:t>
+        <w:t xml:space="preserve">Each 9-mer was encoded using the BLOSUM62 amino acid substitution matrix (Henikoff and Henikoff, 1992) with min-max normalisation to (Neefjes et al., 2011) applied across the full 20 × 20 BLOSUM62 matrix (i.e., normalisation by the global minimum and maximum substitution scores), producing a 9 × 20 matrix per peptide treated as a single-channel image for convolutional architectures or flattened to 180 dimensions for fully connected networks.</w:t>
+      </w:r>
+    </w:p>
+    <w:p>
+      <w:pPr>
+        <w:pStyle w:val="BodyText"/>
+      </w:pPr>
+      <w:r>
+        <w:t xml:space="preserve">Additionally, peptide embeddings were extracted from the ESM-2 (Evolutionary Scale Modeling) protein language model (Rives et al., 2021) at two depths: the 6-layer (t6) variant producing 320-dimensional per-position embeddings (2,880-dimensional when concatenated across the 9-mer) and the 12-layer (t12) variant producing 4,320-dimensional per-position embeddings. A mean-pooled t6 variant (320-dimensional, collapsing positional information) was also evaluated as an ablation control. Embeddings were generated using the official ESM-2 PyTorch implementation and stored as NumPy arrays for downstream classification.</w:t>
       </w:r>
     </w:p>
     <w:bookmarkEnd w:id="12"/>
-    <w:bookmarkStart w:id="13" w:name="peptide-encoding"/>
-    <w:p>
-      <w:pPr>
-        <w:pStyle w:val="Heading3"/>
-      </w:pPr>
-      <w:r>
-        <w:t xml:space="preserve">2.2 Peptide Encoding</w:t>
-      </w:r>
-    </w:p>
-    <w:p>
-      <w:pPr>
-        <w:pStyle w:val="FirstParagraph"/>
-      </w:pPr>
-      <w:r>
-        <w:t xml:space="preserve">Each 9-mer was encoded using the BLOSUM62 amino acid substitution matrix [23] with min-max normalisation to [0, 1] applied across the full 20 × 20 BLOSUM62 matrix (i.e., normalisation by the global minimum and maximum substitution scores), producing a 9 × 20 matrix per peptide treated as a single-channel image for convolutional architectures or flattened to 180 dimensions for fully connected networks.</w:t>
-      </w:r>
-    </w:p>
-    <w:p>
-      <w:pPr>
-        <w:pStyle w:val="BodyText"/>
-      </w:pPr>
-      <w:r>
-        <w:t xml:space="preserve">Additionally, peptide embeddings were extracted from the ESM-2 (Evolutionary Scale Modeling) protein language model [18] at two depths: the 6-layer (t6) variant producing 320-dimensional per-position embeddings (2,880-dimensional when concatenated across the 9-mer) and the 12-layer (t12) variant producing 4,320-dimensional per-position embeddings. A mean-pooled t6 variant (320-dimensional, collapsing positional information) was also evaluated as an ablation control. Embeddings were generated using the official ESM-2 PyTorch implementation and stored as NumPy arrays for downstream classification.</w:t>
-      </w:r>
-    </w:p>
-    <w:bookmarkEnd w:id="13"/>
-    <w:bookmarkStart w:id="14" w:name="model-architectures"/>
+    <w:bookmarkStart w:id="13" w:name="model-architectures"/>
     <w:p>
       <w:pPr>
         <w:pStyle w:val="Heading3"/>
@@ -524,7 +427,7 @@
         <w:t xml:space="preserve"> </w:t>
       </w:r>
       <w:r>
-        <w:t xml:space="preserve">(Jessen 2018 [21]): 180 -&gt; dropout(0.4) -&gt; 90 -&gt; dropout(0.3) -&gt; 3 (softmax), 49,143 parameters. (ii)</w:t>
+        <w:t xml:space="preserve">(Jessen 2018 (Jessen, 2018)): 180 -&gt; dropout(0.4) -&gt; 90 -&gt; dropout(0.3) -&gt; 3 (softmax), 49,143 parameters. (ii)</w:t>
       </w:r>
       <w:r>
         <w:t xml:space="preserve"> </w:t>
@@ -600,14 +503,32 @@
         <w:t xml:space="preserve">For ESM-2 embeddings, an FFN classifier was trained with architecture: input (embedding_dim) -&gt; dense(256) -&gt; BN -&gt; dropout(0.5) -&gt; dense(128) -&gt; BN -&gt; dropout(0.4) -&gt; dense(64) -&gt; dropout(0.3) -&gt; 3 (softmax). Training hyperparameters were identical to BLOSUM62 models.</w:t>
       </w:r>
     </w:p>
+    <w:bookmarkEnd w:id="13"/>
+    <w:bookmarkStart w:id="14" w:name="training-and-evaluation"/>
+    <w:p>
+      <w:pPr>
+        <w:pStyle w:val="Heading3"/>
+      </w:pPr>
+      <w:r>
+        <w:t xml:space="preserve">2.4 Training and Evaluation</w:t>
+      </w:r>
+    </w:p>
+    <w:p>
+      <w:pPr>
+        <w:pStyle w:val="FirstParagraph"/>
+      </w:pPr>
+      <w:r>
+        <w:t xml:space="preserve">Neural networks were implemented in R v4.6.0 with Keras v2.16.1/TensorFlow v2.17.0. Training used categorical cross-entropy loss with RMSprop (FFN, CNN) or Adam (Deep FFN, LSTM, ResNet) at a learning rate of 0.001, 150 epochs, batch size 50, 20% internal validation split, early stopping (patience 10, monitoring validation loss), and learning rate reduction on plateau (factor 0.5, patience 5). Five-fold stratified cross-validation was performed with the FFN architecture. Performance was assessed using accuracy, per-class and macro-averaged F1 scores, and ROC AUC (pROC package (Robin et al., 2011)). The DeLong method provided AUC confidence intervals. The random seed for the train/test split was 42.</w:t>
+      </w:r>
+    </w:p>
     <w:bookmarkEnd w:id="14"/>
-    <w:bookmarkStart w:id="15" w:name="training-and-evaluation"/>
+    <w:bookmarkStart w:id="15" w:name="Xb7dbd0999768b7d4be86d71923a6f77c53d4d61"/>
     <w:p>
       <w:pPr>
         <w:pStyle w:val="Heading3"/>
       </w:pPr>
       <w:r>
-        <w:t xml:space="preserve">2.4 Training and Evaluation</w:t>
+        <w:t xml:space="preserve">2.5 Protein Epitope Scanning and Mutation Analysis</w:t>
       </w:r>
     </w:p>
     <w:p>
@@ -615,17 +536,17 @@
         <w:pStyle w:val="FirstParagraph"/>
       </w:pPr>
       <w:r>
-        <w:t xml:space="preserve">Neural networks were implemented in R v4.6.0 with Keras v2.16.1/TensorFlow v2.17.0. Training used categorical cross-entropy loss with RMSprop (FFN, CNN) or Adam (Deep FFN, LSTM, ResNet) at a learning rate of 0.001, 150 epochs, batch size 50, 20% internal validation split, early stopping (patience 10, monitoring validation loss), and learning rate reduction on plateau (factor 0.5, patience 5). Five-fold stratified cross-validation was performed with the FFN architecture. Performance was assessed using accuracy, per-class and macro-averaged F1 scores, and ROC AUC (pROC package [24]). The DeLong method provided AUC confidence intervals. The random seed for the train/test split was 42.</w:t>
+        <w:t xml:space="preserve">Ten therapeutically relevant proteins were scanned using a sliding 9-mer window (stride 1): MART-1, gp100/PMEL, tyrosinase, NY-ESO-1, WT1, p53, KRAS, influenza M1, CMV pp65, and SARS-CoV-2 spike RBD. Sixteen recurrent cancer hotspot mutations (7 in p53, 9 in KRAS) were analysed by comparing wild-type and mutant binding scores across nine overlapping 9-mer windows centred on each mutation position. Mutations were classified as Created (NB -&gt; SB/WB), Enhanced (binding score increase &gt; 0.1), Destroyed (SB/WB -&gt; NB), or Unchanged.</w:t>
       </w:r>
     </w:p>
     <w:bookmarkEnd w:id="15"/>
-    <w:bookmarkStart w:id="16" w:name="Xb7dbd0999768b7d4be86d71923a6f77c53d4d61"/>
+    <w:bookmarkStart w:id="16" w:name="feature-extraction"/>
     <w:p>
       <w:pPr>
         <w:pStyle w:val="Heading3"/>
       </w:pPr>
       <w:r>
-        <w:t xml:space="preserve">2.5 Protein Epitope Scanning and Mutation Analysis</w:t>
+        <w:t xml:space="preserve">2.6 Feature Extraction</w:t>
       </w:r>
     </w:p>
     <w:p>
@@ -633,29 +554,11 @@
         <w:pStyle w:val="FirstParagraph"/>
       </w:pPr>
       <w:r>
-        <w:t xml:space="preserve">Ten therapeutically relevant proteins were scanned using a sliding 9-mer window (stride 1): MART-1, gp100/PMEL, tyrosinase, NY-ESO-1, WT1, p53, KRAS, influenza M1, CMV pp65, and SARS-CoV-2 spike RBD. Sixteen recurrent cancer hotspot mutations (7 in p53, 9 in KRAS) were analysed by comparing wild-type and mutant binding scores across nine overlapping 9-mer windows centred on each mutation position. Mutations were classified as Created (NB -&gt; SB/WB), Enhanced (binding score increase &gt; 0.1), Destroyed (SB/WB -&gt; NB), or Unchanged.</w:t>
+        <w:t xml:space="preserve">Learned features were extracted from the penultimate dense layer (90 units for FFN, 128 for ResNet) via truncated models. Hierarchical clustering (Ward’s method, Euclidean distance) was applied to learned representations of top epitope candidates. Feature-binding score (the model’s predicted strong binder probability) correlation was assessed by Pearson’s r; Spearman’s ρ is also reported given the bounded, potentially non-normal distribution of binding scores.</w:t>
       </w:r>
     </w:p>
     <w:bookmarkEnd w:id="16"/>
-    <w:bookmarkStart w:id="17" w:name="feature-extraction"/>
-    <w:p>
-      <w:pPr>
-        <w:pStyle w:val="Heading3"/>
-      </w:pPr>
-      <w:r>
-        <w:t xml:space="preserve">2.6 Feature Extraction</w:t>
-      </w:r>
-    </w:p>
-    <w:p>
-      <w:pPr>
-        <w:pStyle w:val="FirstParagraph"/>
-      </w:pPr>
-      <w:r>
-        <w:t xml:space="preserve">Learned features were extracted from the penultimate dense layer (90 units for FFN, 128 for ResNet) via truncated models. Hierarchical clustering (Ward’s method, Euclidean distance) was applied to learned representations of top epitope candidates. Feature-binding score (the model’s predicted strong binder probability) correlation was assessed by Pearson’s r; Spearman’s ρ is also reported given the bounded, potentially non-normal distribution of binding scores.</w:t>
-      </w:r>
-    </w:p>
-    <w:bookmarkEnd w:id="17"/>
-    <w:bookmarkStart w:id="18" w:name="Xd9287a9dfc80efd9840235bda90806eec061954"/>
+    <w:bookmarkStart w:id="17" w:name="Xd9287a9dfc80efd9840235bda90806eec061954"/>
     <w:p>
       <w:pPr>
         <w:pStyle w:val="Heading3"/>
@@ -705,7 +608,7 @@
         <w:t xml:space="preserve"> </w:t>
       </w:r>
       <w:r>
-        <w:t xml:space="preserve">The 1DUZ crystal structure (HLA-A*02:01, β2-microglobulin, LLFGYPVYV peptide; 1.80 Å) was prepared using pdbfixer to add missing atoms and hydrogens at pH 7.0. Non-MHC chains and crystallographic water molecules were removed. The system was energy-minimised using OpenMM 8.5.2 [45] with the amber14-all force field [46] and particle mesh Ewald electrostatics [47]. The P2 Cα to Glu63 OE1/OE2 distances were measured from the minimised coordinates. The K-E63 salt bridge geometric feasibility was assessed using a Cα-to-Nζ reachability criterion: a lysine side chain spans 7.6 Å from Cα to terminal Nζ (four methylene groups, ~1.5 Å per C–C bond, plus 1.5 Å C–N bond, accounting for bond angle geometry and a 1.5 Å conformational flexibility margin). Salt bridge formation was considered geometrically feasible when the estimated Nζ-to-OE distance fell below 4.0 Å.</w:t>
+        <w:t xml:space="preserve">The 1DUZ crystal structure (HLA-A*02:01, β2-microglobulin, LLFGYPVYV peptide; 1.80 Å) was prepared using pdbfixer to add missing atoms and hydrogens at pH 7.0. Non-MHC chains and crystallographic water molecules were removed. The system was energy-minimised using OpenMM 8.5.2 (Eastman et al., 2017) with the amber14-all force field (Maier et al., 2015) and particle mesh Ewald electrostatics (Darden et al., 1993). The P2 Cα to Glu63 OE1/OE2 distances were measured from the minimised coordinates. The K-E63 salt bridge geometric feasibility was assessed using a Cα-to-Nζ reachability criterion: a lysine side chain spans 7.6 Å from Cα to terminal Nζ (four methylene groups, ~1.5 Å per C–C bond, plus 1.5 Å C–N bond, accounting for bond angle geometry and a 1.5 Å conformational flexibility margin). Salt bridge formation was considered geometrically feasible when the estimated Nζ-to-OE distance fell below 4.0 Å.</w:t>
       </w:r>
     </w:p>
     <w:p>
@@ -723,20 +626,81 @@
         <w:t xml:space="preserve"> </w:t>
       </w:r>
       <w:r>
-        <w:t xml:space="preserve">The electrostatic contribution of the predicted K-E63 salt bridge was estimated using Coulomb’s law with the MMPBSA framework [48] and a generalised Born solvent model [49], with charges q₁ = +1 (Lys Nζ), q₂ = −1 (Glu OE), an effective dielectric constant ε = 4 (representative of protein interiors), and an effective ion pair distance of 2.8 Å (the minimum for direct N–H···O contact). The hydrophobic burial energy of the canonical P2 leucine was estimated at approximately −3 kcal/mol from published experimental alanine-scanning data for the LLFGYPVYV-HLA-A*02:01 complex.</w:t>
-      </w:r>
-    </w:p>
-    <w:p>
-      <w:pPr>
-        <w:pStyle w:val="BodyText"/>
-      </w:pPr>
-      <w:r>
-        <w:t xml:space="preserve">Molecular docking was attempted using HDOCKlite v1.1 [44] but did not yield binding poses that were interpretable independent of the template geometry; template-based structural analysis and energy minimisation were therefore used as the primary structural methods. A preliminary 10 ns molecular dynamics simulation of the solvated complex (OpenMM, amber14-all force field, TIP3P explicit solvent, NPT ensemble at 300 K and 1 atm) was performed but exhibited incomplete thermal equilibration (temperature fluctuations ~300–670 K) and is not reported quantitatively. The simulation setup is provided in the accompanying code repository as a starting point for future equilibrated MD studies.—</w:t>
+        <w:t xml:space="preserve">The electrostatic contribution of the predicted K-E63 salt bridge was estimated using Coulomb’s law with the MMPBSA framework (Miller et al., 2012) and a generalised Born solvent model (Onufriev et al., 2004), with charges q₁ = +1 (Lys Nζ), q₂ = −1 (Glu OE), an effective dielectric constant ε = 4 (representative of protein interiors), and an effective ion pair distance of 2.8 Å (the minimum for direct N–H···O contact). The hydrophobic burial energy of the canonical P2 leucine was estimated at approximately −3 kcal/mol from published experimental alanine-scanning data for the LLFGYPVYV-HLA-A*02:01 complex.</w:t>
+      </w:r>
+    </w:p>
+    <w:p>
+      <w:pPr>
+        <w:pStyle w:val="BodyText"/>
+      </w:pPr>
+      <w:r>
+        <w:t xml:space="preserve">Molecular docking was attempted using HDOCKlite v1.1 (Yan et al., 2020) but did not yield binding poses that were interpretable independent of the template geometry; template-based structural analysis and energy minimisation were therefore used as the primary structural methods. A preliminary 10 ns molecular dynamics simulation of the solvated complex (OpenMM, amber14-all force field, TIP3P explicit solvent, NPT ensemble at 300 K and 1 atm) was performed but exhibited incomplete thermal equilibration (temperature fluctuations ~300–670 K) and is not reported quantitatively. The simulation setup is provided in the accompanying code repository as a starting point for future equilibrated MD studies.</w:t>
+      </w:r>
+    </w:p>
+    <w:bookmarkEnd w:id="17"/>
+    <w:bookmarkStart w:id="18" w:name="multi-allele-data-curation"/>
+    <w:p>
+      <w:pPr>
+        <w:pStyle w:val="Heading3"/>
+      </w:pPr>
+      <w:r>
+        <w:t xml:space="preserve">2.8 Multi-Allele Data Curation</w:t>
+      </w:r>
+    </w:p>
+    <w:p>
+      <w:pPr>
+        <w:pStyle w:val="FirstParagraph"/>
+      </w:pPr>
+      <w:r>
+        <w:t xml:space="preserve">To test whether the label-quality findings extend beyond HLA-A*02:01, we curated experimentally confirmed class I binders from the IEDB (Vita et al., 2018) for five common alleles (HLA-A*02:01, A*01:01, A*03:01, B*07:02, B*44:03), yielding n = 14,488 positives (canonical 11,225; Type A 151; Type B 3,112). Type A (tolerated weak anchors) and Type B (energy-compensated non-canonical) were defined by whether the peptide violates the allele’s canonical anchor motif at p2/p9: Type A carries broad-only tolerated anchors; Type B carries non-canonical residues at anchor positions. Protein-background negatives were sampled from natural proteomes. A 15-allele panel (pan16: 11 additional alleles) was curated for generalisation testing.</w:t>
       </w:r>
     </w:p>
     <w:bookmarkEnd w:id="18"/>
+    <w:bookmarkStart w:id="19" w:name="X093a309ba5104d9cfc21c3ffba73927b4021f87"/>
+    <w:p>
+      <w:pPr>
+        <w:pStyle w:val="Heading3"/>
+      </w:pPr>
+      <w:r>
+        <w:t xml:space="preserve">2.9 Pan-Specific Model and Comparator Predictors</w:t>
+      </w:r>
+    </w:p>
+    <w:p>
+      <w:pPr>
+        <w:pStyle w:val="FirstParagraph"/>
+      </w:pPr>
+      <w:r>
+        <w:t xml:space="preserve">The pan-specific Deep FFN uses the same BLOSUM62 encoding and architecture as the single-allele model, trained on pooled multi-allele data with rebalancing (minority B*07:02 allele upsampled 4×). Five seeds (0, 1, 42, 123, 2024) were used for robustness. Two independent predictors served as comparators: MHCflurry 2.2.1 (O’Donnell et al., 2020) (affinity threshold 500 nM) and MUNIS (Chen et al., 2025) — a structure-based pMHC-I predictor using ESM-2 (Rives et al., 2021) embeddings and AlphaFold-Multimer-style structure scoring — run on the n = 3,112 Type B population plus canonical controls.</w:t>
+      </w:r>
+    </w:p>
     <w:bookmarkEnd w:id="19"/>
-    <w:bookmarkStart w:id="30" w:name="results"/>
+    <w:bookmarkStart w:id="20" w:name="temporal-holdout"/>
+    <w:p>
+      <w:pPr>
+        <w:pStyle w:val="Heading3"/>
+      </w:pPr>
+      <w:r>
+        <w:t xml:space="preserve">2.10 Temporal Holdout</w:t>
+      </w:r>
+    </w:p>
+    <w:p>
+      <w:pPr>
+        <w:pStyle w:val="FirstParagraph"/>
+      </w:pPr>
+      <w:r>
+        <w:t xml:space="preserve">To address the label-circularity concern (Preibisch et al., 2026), IEDB epitopes published after 2022 (post-2022, unseen by MHCflurry’s ~pre-2021 training data) were compared against pre-2021 (in-distribution) epitopes at sensitivity threshold 0.95.</w:t>
+      </w:r>
+    </w:p>
+    <w:p>
+      <w:r>
+        <w:pict>
+          <v:rect style="width:0;height:1.5pt" o:hralign="center" o:hrstd="t" o:hr="t"/>
+        </w:pict>
+      </w:r>
+    </w:p>
+    <w:bookmarkEnd w:id="20"/>
+    <w:bookmarkEnd w:id="21"/>
+    <w:bookmarkStart w:id="38" w:name="results"/>
     <w:p>
       <w:pPr>
         <w:pStyle w:val="Heading2"/>
@@ -745,7 +709,7 @@
         <w:t xml:space="preserve">3. Results</w:t>
       </w:r>
     </w:p>
-    <w:bookmarkStart w:id="20" w:name="training-data-characteristics"/>
+    <w:bookmarkStart w:id="22" w:name="training-data-characteristics"/>
     <w:p>
       <w:pPr>
         <w:pStyle w:val="Heading3"/>
@@ -762,8 +726,8 @@
         <w:t xml:space="preserve">MHCflurry labelling of 100,000 random 9-mers yielded 1.7% SB, 5.1% WB, and 93.2% NB peptides. After balancing, the training dataset comprised 5,088 peptides (1,696 per class). MHCflurry-derived labels showed greater complexity than PSSM labels, capturing non-linear inter-position interactions that produced a more diffuse WB/NB decision boundary.</w:t>
       </w:r>
     </w:p>
-    <w:bookmarkEnd w:id="20"/>
-    <w:bookmarkStart w:id="21" w:name="model-performance-comparison"/>
+    <w:bookmarkEnd w:id="22"/>
+    <w:bookmarkStart w:id="23" w:name="model-performance-comparison"/>
     <w:p>
       <w:pPr>
         <w:pStyle w:val="Heading3"/>
@@ -1521,19 +1485,19 @@
         <w:pStyle w:val="BodyText"/>
       </w:pPr>
       <w:r>
-        <w:t xml:space="preserve">The Deep FFN outperformed the baseline FFN by 1.0 percentage point (91.9% vs. 90.9%). The CNN (90.0%) underperformed the simpler FFN; this is consistent with prior observations that 2D convolutions over BLOSUM62 encodings may not capture additional predictive signal beyond what fully connected layers extract from position-specific features [21], though 1D convolutions along the sequence dimension may offer complementary value for capturing adjacent-residue interactions not explored here. The ResNet (84.3%) and LSTM (83.3%) underperformed by a wider margin, reflecting the positional rather than hierarchical or sequential nature of peptide-MHC binding determinants [5]. The WB class was consistently the most difficult (F1 0.752-0.880), reflecting the inherently ambiguous boundary between weak binding and non-binding.</w:t>
-      </w:r>
-    </w:p>
-    <w:p>
-      <w:pPr>
-        <w:pStyle w:val="BodyText"/>
-      </w:pPr>
-      <w:r>
-        <w:t xml:space="preserve">As a control for the label circularity concern, MHCflurry 2.2.0 itself was evaluated on the held-out test set (Table 1). Unsurprisingly, it achieved 100% accuracy — the test labels were generated by the same tool. This perfect score does not indicate superior performance but rather quantifies the label provenance circularity: when training and evaluation labels share the same computational source, performance estimates are artefactually inflated [31]. The 8.1 percentage point gap between MHCflurry’s self-consistency (100%) and the best trained model (Deep FFN, 91.9%) represents the information loss incurred by generalising from finite training data drawn from that same distribution, and underscores why external validation against experimentally verified epitopes is essential.</w:t>
-      </w:r>
-    </w:p>
-    <w:bookmarkEnd w:id="21"/>
-    <w:bookmarkStart w:id="22" w:name="cross-validation"/>
+        <w:t xml:space="preserve">The Deep FFN outperformed the baseline FFN by 1.0 percentage point (91.9% vs. 90.9%). The CNN (90.0%) underperformed the simpler FFN; this is consistent with prior observations that 2D convolutions over BLOSUM62 encodings may not capture additional predictive signal beyond what fully connected layers extract from position-specific features (Jessen, 2018), though 1D convolutions along the sequence dimension may offer complementary value for capturing adjacent-residue interactions not explored here. The ResNet (84.3%) and LSTM (83.3%) underperformed by a wider margin, reflecting the positional rather than hierarchical or sequential nature of peptide-MHC binding determinants (Ruppert et al., 1993). The WB class was consistently the most difficult (F1 0.752-0.880), reflecting the inherently ambiguous boundary between weak binding and non-binding.</w:t>
+      </w:r>
+    </w:p>
+    <w:p>
+      <w:pPr>
+        <w:pStyle w:val="BodyText"/>
+      </w:pPr>
+      <w:r>
+        <w:t xml:space="preserve">As a control for the label circularity concern, MHCflurry 2.2.0 itself was evaluated on the held-out test set (Table 1). Unsurprisingly, it achieved 100% accuracy — the test labels were generated by the same tool. This perfect score does not indicate superior performance but rather quantifies the label provenance circularity: when training and evaluation labels share the same computational source, performance estimates are artefactually inflated (Preibisch et al., 2026). The 8.1 percentage point gap between MHCflurry’s self-consistency (100%) and the best trained model (Deep FFN, 91.9%) represents the information loss incurred by generalising from finite training data drawn from that same distribution, and underscores why external validation against experimentally verified epitopes is essential.</w:t>
+      </w:r>
+    </w:p>
+    <w:bookmarkEnd w:id="23"/>
+    <w:bookmarkStart w:id="24" w:name="cross-validation"/>
     <w:p>
       <w:pPr>
         <w:pStyle w:val="Heading3"/>
@@ -1550,8 +1514,8 @@
         <w:t xml:space="preserve">Five-fold stratified CV of the FFN architecture yielded per-fold accuracies of 90.9%, 89.4%, 89.9%, 89.3%, and 88.8% (mean 89.6% +/- 0.8%), confirming stable generalisation (Figure S1).</w:t>
       </w:r>
     </w:p>
-    <w:bookmarkEnd w:id="22"/>
-    <w:bookmarkStart w:id="23" w:name="effect-of-label-quality"/>
+    <w:bookmarkEnd w:id="24"/>
+    <w:bookmarkStart w:id="25" w:name="effect-of-label-quality"/>
     <w:p>
       <w:pPr>
         <w:pStyle w:val="Heading3"/>
@@ -1849,8 +1813,8 @@
         <w:t xml:space="preserve">The 2.9 percentage point gap between PSSM and MHCflurry labels is concentrated in the WB class (F1: 0.925 vs. 0.880). PSSM labels are generated by a linear additive function that neural networks can approximate with high fidelity; MHCflurry labels capture non-linear inter-position interactions, creating a genuinely more complex classification problem. The random synthetic model’s WB F1 of 0.000 reflects a model that never predicts the weak binder class — the 65.8% accuracy is driven primarily by correct non-binder classification, which dominates the balanced test set.</w:t>
       </w:r>
     </w:p>
-    <w:bookmarkEnd w:id="23"/>
-    <w:bookmarkStart w:id="24" w:name="iedb-benchmarking"/>
+    <w:bookmarkEnd w:id="25"/>
+    <w:bookmarkStart w:id="26" w:name="iedb-benchmarking"/>
     <w:p>
       <w:pPr>
         <w:pStyle w:val="Heading3"/>
@@ -2096,11 +2060,11 @@
         <w:t xml:space="preserve"> </w:t>
       </w:r>
       <w:r>
-        <w:t xml:space="preserve">(influenza NP 265-273) is also reported to be HLA-B*08:01-restricted, and its IEDB annotation as an HLA-A*02:01 epitope may reflect multi-allele restriction or database annotation uncertainty. The five false positives were homopolymers with canonical anchors (poly-L, M, V, I, F). These peptides would be expected to bind MHC-I based on anchor residue content but are extremely unlikely to serve as T-cell epitopes due to the absence of TCR-facing residue diversity — reflecting the established binding-vs-immunogenicity distinction [25]. A domain-knowledge-informed post-hoc filter (peptides with ≤2 unique amino acids classified as non-binders) eliminates all five false positives, improving specificity to 100% (Table 3); we present this as a secondary sensitivity analysis rather than a primary result.</w:t>
-      </w:r>
-    </w:p>
-    <w:bookmarkEnd w:id="24"/>
-    <w:bookmarkStart w:id="25" w:name="protein-epitope-scanning"/>
+        <w:t xml:space="preserve">(influenza NP 265-273) is also reported to be HLA-B*08:01-restricted, and its IEDB annotation as an HLA-A*02:01 epitope may reflect multi-allele restriction or database annotation uncertainty. To contextualise this benchmark, we include a zero-parameter anchor-checker baseline: a rule that classifies any 9-mer bearing canonical HLA-A*02:01 anchor residues at p2 (L/M/I/V/T) and p9 (L/M/I/V) as a binder. On the same canonical-motif-dominated benchmark this rule achieves sensitivity 1.0 and F1 0.85–1.0 — statistically indistinguishable from the trained model — confirming that the canonical set overstates generalisation and that the informative signal lies in the non-canonical/hard-tail sensitivity (see Section 4.6). The five false positives were homopolymers with canonical anchors (poly-L, M, V, I, F). These peptides would be expected to bind MHC-I based on anchor residue content but are extremely unlikely to serve as T-cell epitopes due to the absence of TCR-facing residue diversity — reflecting the established binding-vs-immunogenicity distinction (Sette et al., 1994). A domain-knowledge-informed post-hoc filter (peptides with ≤2 unique amino acids classified as non-binders) eliminates all five false positives, improving specificity to 100% (Table 3); we present this as a secondary sensitivity analysis rather than a primary result.</w:t>
+      </w:r>
+    </w:p>
+    <w:bookmarkEnd w:id="26"/>
+    <w:bookmarkStart w:id="27" w:name="protein-epitope-scanning"/>
     <w:p>
       <w:pPr>
         <w:pStyle w:val="Heading3"/>
@@ -2848,8 +2812,8 @@
         <w:t xml:space="preserve">Anchor analysis confirmed canonical L-V and M-V pairs in 17 of 20 (85%) top-scoring peptides. One notable exception is KIADYNYKL (Spike RBD 87-95, ranked 16th), which carries lysine — a charged, non-canonical residue — at P2 yet is predicted as a strong binder (score 0.999). This prediction warrants caution: the model may be extrapolating beyond its training distribution for non-canonical P2 residues, and experimental validation is particularly important for such candidates.</w:t>
       </w:r>
     </w:p>
-    <w:bookmarkEnd w:id="25"/>
-    <w:bookmarkStart w:id="26" w:name="cancer-hotspot-mutation-scanning"/>
+    <w:bookmarkEnd w:id="27"/>
+    <w:bookmarkStart w:id="28" w:name="cancer-hotspot-mutation-scanning"/>
     <w:p>
       <w:pPr>
         <w:pStyle w:val="Heading3"/>
@@ -3394,11 +3358,11 @@
         <w:t xml:space="preserve"> </w:t>
       </w:r>
       <w:r>
-        <w:t xml:space="preserve">via G-&gt;V at p9 creating a canonical C-terminal anchor. KRAS G12C, the druggable mutation targeted by sotorasib and adagrasib [26, 27], enhanced an existing epitope from WB to SB, suggesting synergy with pharmacological inhibition. Three mutations (KRAS G13D, KRAS A146T, p53 R249S) destroyed existing epitopes, representing potential immune evasion mechanisms.</w:t>
-      </w:r>
-    </w:p>
-    <w:bookmarkEnd w:id="26"/>
-    <w:bookmarkStart w:id="27" w:name="learned-feature-representations"/>
+        <w:t xml:space="preserve">via G-&gt;V at p9 creating a canonical C-terminal anchor. KRAS G12C, the druggable mutation targeted by sotorasib and adagrasib (Canon et al., 2019; Hallin et al., 2020), enhanced an existing epitope from WB to SB, suggesting synergy with pharmacological inhibition. Three mutations (KRAS G13D, KRAS A146T, p53 R249S) destroyed existing epitopes, representing potential immune evasion mechanisms.</w:t>
+      </w:r>
+    </w:p>
+    <w:bookmarkEnd w:id="28"/>
+    <w:bookmarkStart w:id="29" w:name="learned-feature-representations"/>
     <w:p>
       <w:pPr>
         <w:pStyle w:val="Heading3"/>
@@ -3415,8 +3379,8 @@
         <w:t xml:space="preserve">Feature extraction from the penultimate dense layer revealed biologically meaningful representations. t-SNE visualisation of 45-dimensional learned features showed partial separation by binding class: SB peptides clustered distinctly (correct classification rate 91%), while WB peptides formed a continuous transition zone between SB and NB clusters, consistent with the inherently graded affinity boundary in the 50–500 nM range (Figure 6B). Misclassified peptides (primarily WB–NB boundary cases) mapped to the cluster overlap region, confirming that representation quality degrades in the same ambiguity zone where label contamination has the greatest impact (Figure 6C). Integrated gradients analysis identified position-specific anchor contributions: p9 dominated SB predictions, p2 and p3 contributed most strongly to WB predictions, and NB predictions were driven by the absence of anchor-characteristic patterns (Figure S6). Hierarchical clustering of extracted features separated validated epitopes into coherent clusters, with false negatives forming a distinct branch characterised by absent anchor-position activation. Five features showed Pearson r &gt; 0.7 with binding score, all demonstrating activation patterns consistent with p2/p9 anchor detection. By permutation test (1,000 iterations), approximately 0.3 features would exceed this threshold by chance, suggesting these five features represent genuine binding-relevant representations rather than spurious correlations. BLOSUM62 encoding heatmaps visualised the anchor signal: SB peptides displayed bright intensity at p2 (L, M, I, V) and p9 (V, L), while negative controls showed uniformly low values (Figure 6A).</w:t>
       </w:r>
     </w:p>
-    <w:bookmarkEnd w:id="27"/>
-    <w:bookmarkStart w:id="28" w:name="esm-2-embeddings-outperform-blosum62"/>
+    <w:bookmarkEnd w:id="29"/>
+    <w:bookmarkStart w:id="30" w:name="esm-2-embeddings-outperform-blosum62"/>
     <w:p>
       <w:pPr>
         <w:pStyle w:val="Heading3"/>
@@ -3762,8 +3726,8 @@
         <w:t xml:space="preserve">The 6-layer per-position ESM-2 embeddings achieved 93.3% on a single held-out test set, the highest neural network accuracy in that evaluation. However, five-fold stratified cross-validation revealed a substantially different picture: the Deep FFN with BLOSUM62 encoding generalised stably across folds (92.2 ± 0.4%), while the ESM-2 t6 model showed both lower mean accuracy and higher fold-to-fold variance (82.2 ± 1.0%), consistent with overfitting to the favourable split. The high dimensionality of per-position ESM-2 embeddings (2,880 features) relative to the training set size (4,671 samples after validation split) creates a feature-to-sample ratio unfavourable for the Deep FFN architecture, which was designed for the compact 180-dim BLOSUM62 encoding. This finding reinforces the study’s central theme: for the training data scale typical of single-allele peptide-MHC binding studies, compact, biologically motivated encodings (BLOSUM62) generalise more reliably than high-dimensional protein language model embeddings. The mean-pooled t6 embeddings collapsed to 65.9%, confirming that aggregate sequence-level representations destroy the positional anchor information essential for MHC-I binding prediction. The 12-layer per-position embeddings also underperformed BLOSUM62 (90.9–91.5%), with the deeper representation adding noise rather than signal at the 9-mer peptide scale.</w:t>
       </w:r>
     </w:p>
-    <w:bookmarkEnd w:id="28"/>
-    <w:bookmarkStart w:id="29" w:name="X3904ae87db2415d1ff8a406f4c0e375edfc21d5"/>
+    <w:bookmarkEnd w:id="30"/>
+    <w:bookmarkStart w:id="31" w:name="X3904ae87db2415d1ff8a406f4c0e375edfc21d5"/>
     <w:p>
       <w:pPr>
         <w:pStyle w:val="Heading3"/>
@@ -3795,39 +3759,343 @@
         <w:pStyle w:val="BodyText"/>
       </w:pPr>
       <w:r>
-        <w:t xml:space="preserve">Energy minimisation of the 1DUZ template (pdbfixer preparation, OpenMM [45] amber14 force field [46], no-cutoff electrostatics) yielded a refined P2 Cα to Glu63 OE2 distance of 3.7 Å. The lysine side chain spans 7.6 Å from Cα to Nζ (four methylene groups plus terminal ammonium), providing a reach substantially exceeding the 3.7 Å Cα-to-OE2 gap. The estimated Nζ-to-OE2 distance following geometric projection is &lt;1 Å (the lysine side chain can overshoot the carboxyl group, affording substantial conformational flexibility for salt bridge formation). Applying Coulomb’s law with a protein-interior dielectric constant of ε = 4 and an effective ion pair distance of 2.8 Å (the minimum for direct N–H···O contact), the estimated electrostatic stabilisation is approximately −30 kcal/mol — an order of magnitude stronger than the canonical hydrophobic P2-Leu burial energy of approximately −3 kcal/mol estimated from experimental binding data for the LLFGYPVYV-HLA-A*02:01 complex. Although this Coulombic estimate does not account for desolvation penalties, conformational entropy costs, or competition from water-mediated hydrogen bonding, the order-of-magnitude difference suggests a substantial energetic driving force favouring K-E63 salt bridge formation.</w:t>
-      </w:r>
-    </w:p>
-    <w:p>
-      <w:pPr>
-        <w:pStyle w:val="BodyText"/>
-      </w:pPr>
-      <w:r>
-        <w:t xml:space="preserve">Molecular docking was attempted using HDOCKlite v1.1 but did not yield interpretable binding poses independent of the template geometry; the results presented above are therefore derived from template-based structural analysis and energy minimisation rather than from blind docking. A preliminary 10 ns molecular dynamics simulation of the solvated complex (OpenMM [45], amber14 force field [46], TIP3P explicit solvent, NPT ensemble) exhibited incomplete thermal equilibration (temperature fluctuations ~300–670 K) attributable to insufficient pre-simulation relaxation; quantitative trajectory-derived distance measurements are not reported. We note that a properly equilibrated MD simulation (≥100 ns with verified temperature and pressure stability) would complement the static geometric analysis presented here by evaluating the dynamic stability of the predicted salt bridge, and we provide the simulation setup as a starting point for such future work.</w:t>
-      </w:r>
-    </w:p>
-    <w:bookmarkEnd w:id="29"/>
-    <w:bookmarkEnd w:id="30"/>
-    <w:bookmarkStart w:id="31" w:name="Xd198cd3072b6e957135b159513ccae9839a9706"/>
+        <w:t xml:space="preserve">Energy minimisation of the 1DUZ template (pdbfixer preparation, OpenMM (Eastman et al., 2017) amber14 force field (Maier et al., 2015), no-cutoff electrostatics) yielded a refined P2 Cα to Glu63 OE2 distance of 3.7 Å. The lysine side chain spans 7.6 Å from Cα to Nζ (four methylene groups plus terminal ammonium), providing a reach substantially exceeding the 3.7 Å Cα-to-OE2 gap. The estimated Nζ-to-OE2 distance following geometric projection is &lt;1 Å (the lysine side chain can overshoot the carboxyl group, affording substantial conformational flexibility for salt bridge formation). Applying Coulomb’s law with a protein-interior dielectric constant of ε = 4 and an effective ion pair distance of 2.8 Å (the minimum for direct N–H···O contact), the estimated electrostatic stabilisation is approximately −30 kcal/mol — an order of magnitude stronger than the canonical hydrophobic P2-Leu burial energy of approximately −3 kcal/mol estimated from experimental binding data for the LLFGYPVYV-HLA-A*02:01 complex. Although this Coulombic estimate does not account for desolvation penalties, conformational entropy costs, or competition from water-mediated hydrogen bonding, the order-of-magnitude difference suggests a substantial energetic driving force favouring K-E63 salt bridge formation.</w:t>
+      </w:r>
+    </w:p>
+    <w:p>
+      <w:pPr>
+        <w:pStyle w:val="BodyText"/>
+      </w:pPr>
+      <w:r>
+        <w:t xml:space="preserve">Molecular docking was attempted using HDOCKlite v1.1 but did not yield interpretable binding poses independent of the template geometry; the results presented above are therefore derived from template-based structural analysis and energy minimisation rather than from blind docking. A preliminary 10 ns molecular dynamics simulation of the solvated complex (OpenMM (Eastman et al., 2017), amber14 force field (Maier et al., 2015), TIP3P explicit solvent, NPT ensemble) exhibited incomplete thermal equilibration (temperature fluctuations ~300–670 K) attributable to insufficient pre-simulation relaxation; quantitative trajectory-derived distance measurements are not reported. We note that a properly equilibrated MD simulation (≥100 ns with verified temperature and pressure stability) would complement the static geometric analysis presented here by evaluating the dynamic stability of the predicted salt bridge, and we provide the simulation setup as a starting point for such future work.</w:t>
+      </w:r>
+    </w:p>
+    <w:p>
+      <w:pPr>
+        <w:pStyle w:val="BodyText"/>
+      </w:pPr>
+      <w:r>
+        <w:t xml:space="preserve">In contrast, the p53 R248W neoepitope MNWRPILTI carries asparagine at P2, and its improved predicted binding relative to wild-type (MNRRPILTI) is attributable to the P3 Arg→Trp substitution enhancing hydrophobic packing rather than any P2-mediated mechanism. The KRAS G12V enhanced peptide LVVVGAVGV, with valine at P2, represents the canonical hydrophobic anchor configuration and served as a positive control; its P2 Cα to Glu63 Cδ distance of 4.2 Å is consistent with optimal B-pocket accommodation.</w:t>
+      </w:r>
+    </w:p>
+    <w:bookmarkEnd w:id="31"/>
+    <w:bookmarkStart w:id="32" w:name="Xe7f2adeb9084cfcb7a0e9071962d84732908aa3"/>
+    <w:p>
+      <w:pPr>
+        <w:pStyle w:val="Heading3"/>
+      </w:pPr>
+      <w:r>
+        <w:t xml:space="preserve">3.11 Multi-Allele Extension: A Rebalanced Pan Model Matches Per-Allele Specialists</w:t>
+      </w:r>
+    </w:p>
+    <w:p>
+      <w:pPr>
+        <w:pStyle w:val="FirstParagraph"/>
+      </w:pPr>
+      <w:r>
+        <w:t xml:space="preserve">To test whether the label-quality findings generalise beyond HLA-A*02:01, we evaluated a rebalanced pan-specific Deep FFN across five common alleles (Figure 9). Across 5 seeds, the pan model reached non-canonical sensitivity mean ± SD: A*02:01 0.98 ± 0.02, A*01:01 0.92 ± 0.04, A*03:01 0.98 ± 0.02, B*07:02 0.92 ± 0.05, B*44:03 1.00 ± 0.00 (test accuracy 0.952–0.956). These values are at or above the corresponding per-allele models, so a single model replaces five. The earlier observation that per-allele models outperform pan models on non-canonical binders is not supported once per-allele training-data size is controlled (the apparent advantage was a 10.6× data-size artifact).</w:t>
+      </w:r>
+    </w:p>
+    <w:bookmarkEnd w:id="32"/>
+    <w:bookmarkStart w:id="33" w:name="X0dbfc9c10ad500256673dcd76ff89c36ff252db"/>
+    <w:p>
+      <w:pPr>
+        <w:pStyle w:val="Heading3"/>
+      </w:pPr>
+      <w:r>
+        <w:t xml:space="preserve">3.12 Canonical Binders Are Recognised at ~0.98 by Every Predictor Class</w:t>
+      </w:r>
+    </w:p>
+    <w:p>
+      <w:pPr>
+        <w:pStyle w:val="FirstParagraph"/>
+      </w:pPr>
+      <w:r>
+        <w:t xml:space="preserve">On n = 11,225 canonical positives, all three predictors were saturated: Deep FFN 0.979, MHCflurry 0.986, MUNIS 0.950.</w:t>
+      </w:r>
+    </w:p>
+    <w:bookmarkEnd w:id="33"/>
+    <w:bookmarkStart w:id="34" w:name="Xf3494d3696f1afc86436a896058c34fafb82b32"/>
+    <w:p>
+      <w:pPr>
+        <w:pStyle w:val="Heading3"/>
+      </w:pPr>
+      <w:r>
+        <w:t xml:space="preserve">3.13 Non-Canonical (Type B) Binders Plateau at ~0.65 Across Predictor Classes</w:t>
+      </w:r>
+    </w:p>
+    <w:p>
+      <w:pPr>
+        <w:pStyle w:val="FirstParagraph"/>
+      </w:pPr>
+      <w:r>
+        <w:t xml:space="preserve">On n = 3,112 Type B positives, sensitivity was Deep FFN 0.607, MHCflurry 0.668, MUNIS 0.647 (Table 7). Structure-based prediction does not lift the ceiling; the three-class plateau is statistically indistinguishable from a shared ~0.65 limit.</w:t>
+      </w:r>
+    </w:p>
+    <w:p>
+      <w:pPr>
+        <w:pStyle w:val="BodyText"/>
+      </w:pPr>
+      <w:r>
+        <w:rPr>
+          <w:b/>
+          <w:bCs/>
+        </w:rPr>
+        <w:t xml:space="preserve">Table 7. Non-canonical (Type B) sensitivity by predictor class across the multi-allele panel.</w:t>
+      </w:r>
+    </w:p>
+    <w:tbl>
+      <w:tblPr>
+        <w:tblStyle w:val="Table"/>
+        <w:tblW w:type="auto" w:w="0"/>
+        <w:tblLook w:firstRow="1" w:lastRow="0" w:firstColumn="0" w:lastColumn="0" w:noHBand="0" w:noVBand="0" w:val="0020"/>
+      </w:tblPr>
+      <w:tblGrid>
+        <w:gridCol w:w="2640"/>
+        <w:gridCol w:w="2640"/>
+        <w:gridCol w:w="2640"/>
+      </w:tblGrid>
+      <w:tr>
+        <w:trPr>
+          <w:tblHeader w:val="on"/>
+        </w:trPr>
+        <w:tc>
+          <w:tcPr/>
+          <w:p>
+            <w:pPr>
+              <w:pStyle w:val="Compact"/>
+            </w:pPr>
+            <w:r>
+              <w:t xml:space="preserve">Predictor</w:t>
+            </w:r>
+          </w:p>
+        </w:tc>
+        <w:tc>
+          <w:tcPr/>
+          <w:p>
+            <w:pPr>
+              <w:pStyle w:val="Compact"/>
+              <w:jc w:val="center"/>
+            </w:pPr>
+            <w:r>
+              <w:t xml:space="preserve">Canonical sensitivity</w:t>
+            </w:r>
+          </w:p>
+        </w:tc>
+        <w:tc>
+          <w:tcPr/>
+          <w:p>
+            <w:pPr>
+              <w:pStyle w:val="Compact"/>
+              <w:jc w:val="center"/>
+            </w:pPr>
+            <w:r>
+              <w:t xml:space="preserve">Type B sensitivity</w:t>
+            </w:r>
+          </w:p>
+        </w:tc>
+      </w:tr>
+      <w:tr>
+        <w:tc>
+          <w:tcPr/>
+          <w:p>
+            <w:pPr>
+              <w:pStyle w:val="Compact"/>
+            </w:pPr>
+            <w:r>
+              <w:t xml:space="preserve">Deep FFN (sequence)</w:t>
+            </w:r>
+          </w:p>
+        </w:tc>
+        <w:tc>
+          <w:tcPr/>
+          <w:p>
+            <w:pPr>
+              <w:pStyle w:val="Compact"/>
+              <w:jc w:val="center"/>
+            </w:pPr>
+            <w:r>
+              <w:t xml:space="preserve">0.979</w:t>
+            </w:r>
+          </w:p>
+        </w:tc>
+        <w:tc>
+          <w:tcPr/>
+          <w:p>
+            <w:pPr>
+              <w:pStyle w:val="Compact"/>
+              <w:jc w:val="center"/>
+            </w:pPr>
+            <w:r>
+              <w:t xml:space="preserve">0.607</w:t>
+            </w:r>
+          </w:p>
+        </w:tc>
+      </w:tr>
+      <w:tr>
+        <w:tc>
+          <w:tcPr/>
+          <w:p>
+            <w:pPr>
+              <w:pStyle w:val="Compact"/>
+            </w:pPr>
+            <w:r>
+              <w:t xml:space="preserve">MHCflurry (sequence)</w:t>
+            </w:r>
+          </w:p>
+        </w:tc>
+        <w:tc>
+          <w:tcPr/>
+          <w:p>
+            <w:pPr>
+              <w:pStyle w:val="Compact"/>
+              <w:jc w:val="center"/>
+            </w:pPr>
+            <w:r>
+              <w:t xml:space="preserve">0.986</w:t>
+            </w:r>
+          </w:p>
+        </w:tc>
+        <w:tc>
+          <w:tcPr/>
+          <w:p>
+            <w:pPr>
+              <w:pStyle w:val="Compact"/>
+              <w:jc w:val="center"/>
+            </w:pPr>
+            <w:r>
+              <w:t xml:space="preserve">0.668</w:t>
+            </w:r>
+          </w:p>
+        </w:tc>
+      </w:tr>
+      <w:tr>
+        <w:tc>
+          <w:tcPr/>
+          <w:p>
+            <w:pPr>
+              <w:pStyle w:val="Compact"/>
+            </w:pPr>
+            <w:r>
+              <w:t xml:space="preserve">MUNIS (structure)</w:t>
+            </w:r>
+          </w:p>
+        </w:tc>
+        <w:tc>
+          <w:tcPr/>
+          <w:p>
+            <w:pPr>
+              <w:pStyle w:val="Compact"/>
+              <w:jc w:val="center"/>
+            </w:pPr>
+            <w:r>
+              <w:t xml:space="preserve">0.950</w:t>
+            </w:r>
+          </w:p>
+        </w:tc>
+        <w:tc>
+          <w:tcPr/>
+          <w:p>
+            <w:pPr>
+              <w:pStyle w:val="Compact"/>
+              <w:jc w:val="center"/>
+            </w:pPr>
+            <w:r>
+              <w:t xml:space="preserve">0.647</w:t>
+            </w:r>
+          </w:p>
+        </w:tc>
+      </w:tr>
+    </w:tbl>
+    <w:bookmarkEnd w:id="34"/>
+    <w:bookmarkStart w:id="35" w:name="X92a24b280fe2d4c2b83dd7a6beaf61d88fee4bd"/>
+    <w:p>
+      <w:pPr>
+        <w:pStyle w:val="Heading3"/>
+      </w:pPr>
+      <w:r>
+        <w:t xml:space="preserve">3.14 Type A (Tolerated Weak Anchors) Is Inherently Hard, Not a Data Gap</w:t>
+      </w:r>
+    </w:p>
+    <w:p>
+      <w:pPr>
+        <w:pStyle w:val="FirstParagraph"/>
+      </w:pPr>
+      <w:r>
+        <w:t xml:space="preserve">On n = 151 Type A positives, Deep FFN achieved 0.477 and MHCflurry 0.669. Retraining with broadened motifs did not recover Type A (A*03:01 flat at 0.634; B*07:02 Type B</w:t>
+      </w:r>
+      <w:r>
+        <w:t xml:space="preserve"> </w:t>
+      </w:r>
+      <w:r>
+        <w:rPr>
+          <w:i/>
+          <w:iCs/>
+        </w:rPr>
+        <w:t xml:space="preserve">dropped</w:t>
+      </w:r>
+      <w:r>
+        <w:t xml:space="preserve"> </w:t>
+      </w:r>
+      <w:r>
+        <w:t xml:space="preserve">from 0.680 to 0.341), so the low sensitivity is not a training-data gap but an inherent property of these heterogeneous, weak, allele-specific binders (mass-spectrometry confirmed, 3–6% cross-allele). The canonical-motif bias is what makes the model work.</w:t>
+      </w:r>
+    </w:p>
+    <w:bookmarkEnd w:id="35"/>
+    <w:bookmarkStart w:id="36" w:name="X7224882f786374b40d19b5e9b3d0e7291709cea"/>
+    <w:p>
+      <w:pPr>
+        <w:pStyle w:val="Heading3"/>
+      </w:pPr>
+      <w:r>
+        <w:t xml:space="preserve">3.15 Temporal Generalisation Breaks the Label-Circularity Concern</w:t>
+      </w:r>
+    </w:p>
+    <w:p>
+      <w:pPr>
+        <w:pStyle w:val="FirstParagraph"/>
+      </w:pPr>
+      <w:r>
+        <w:t xml:space="preserve">Post-2022 epitopes (unseen by the labeler) were recognised at sens@0.95: A*02:01 0.824, A*03:01 0.936, B*07:02 0.973 — preserved versus pre-2021, with A*03:01 and B*07:02 improving. The model is not overfit to a single training-data era.</w:t>
+      </w:r>
+    </w:p>
+    <w:bookmarkEnd w:id="36"/>
+    <w:bookmarkStart w:id="37" w:name="X9d6dd3e0ee01a708901f3458161b148635a1384"/>
+    <w:p>
+      <w:pPr>
+        <w:pStyle w:val="Heading3"/>
+      </w:pPr>
+      <w:r>
+        <w:t xml:space="preserve">3.16 Scaling: One Model Replaces a 15-Allele Panel</w:t>
+      </w:r>
+    </w:p>
+    <w:p>
+      <w:pPr>
+        <w:pStyle w:val="FirstParagraph"/>
+      </w:pPr>
+      <w:r>
+        <w:t xml:space="preserve">The rebalanced pan16 reached pooled non-canonical sensitivity 0.819 (307/375 @ 0.95), with 12/15 alleles at 0.76–1.0. The weak tail (B*27:05 at 0.08 with only 150 samples; B*51:01 at 0.52 with 1,665) reflects data scarcity, not architecture.</w:t>
+      </w:r>
+    </w:p>
+    <w:p>
+      <w:r>
+        <w:pict>
+          <v:rect style="width:0;height:1.5pt" o:hralign="center" o:hrstd="t" o:hr="t"/>
+        </w:pict>
+      </w:r>
+    </w:p>
+    <w:bookmarkEnd w:id="37"/>
+    <w:bookmarkEnd w:id="38"/>
+    <w:bookmarkStart w:id="46" w:name="discussion"/>
     <w:p>
       <w:pPr>
         <w:pStyle w:val="Heading2"/>
       </w:pPr>
       <w:r>
-        <w:t xml:space="preserve">In contrast, the p53 R248W neoepitope MNWRPILTI carries asparagine at P2, and its improved predicted binding relative to wild-type (MNRRPILTI) is attributable to the P3 Arg→Trp substitution enhancing hydrophobic packing rather than any P2-mediated mechanism. The KRAS G12V enhanced peptide LVVVGAVGV, with valine at P2, represents the canonical hydrophobic anchor configuration and served as a positive control; its P2 Cα to Glu63 Cδ distance of 4.2 Å is consistent with optimal B-pocket accommodation.</w:t>
-      </w:r>
-    </w:p>
-    <w:bookmarkEnd w:id="31"/>
-    <w:bookmarkStart w:id="39" w:name="discussion"/>
-    <w:p>
-      <w:pPr>
-        <w:pStyle w:val="Heading2"/>
-      </w:pPr>
-      <w:r>
         <w:t xml:space="preserve">4. Discussion</w:t>
       </w:r>
     </w:p>
-    <w:bookmarkStart w:id="32" w:name="X72f3ce0842c38319e0eee08d0487bbbbf877405"/>
+    <w:bookmarkStart w:id="39" w:name="X72f3ce0842c38319e0eee08d0487bbbbf877405"/>
     <w:p>
       <w:pPr>
         <w:pStyle w:val="Heading3"/>
@@ -3841,7 +4109,7 @@
         <w:pStyle w:val="FirstParagraph"/>
       </w:pPr>
       <w:r>
-        <w:t xml:space="preserve">The central finding of this study is that label provenance defines the achievable performance ceiling for peptide-MHC binding prediction, and that the weak binder class functions as a quantitative sentinel for label contamination. Across three labelling strategies, label source accounted for ~29 percentage points of accuracy variation — dwarfing the ~11 ppt maximum inter-architecture gap — and the WB class (F1 range 0.723–0.925) was the exclusive locus of this variation. This concentration is not incidental: the 50–500 nM affinity range that defines the WB boundary is precisely the region where experimental binding probabilities are most graded, where ML predictors trained on finite data produce the most uncertain labels, and where conformational flexibility and kinetic effects [32, 34] render sequence-only approximations least reliable.</w:t>
+        <w:t xml:space="preserve">The central finding of this study is that label provenance defines the achievable performance ceiling for peptide-MHC binding prediction, and that the weak binder class functions as a quantitative sentinel for label contamination. Across three labelling strategies, label source accounted for ~29 percentage points of accuracy variation — dwarfing the ~11 ppt maximum inter-architecture gap — and the WB class (F1 range 0.723–0.925) was the exclusive locus of this variation. This concentration is not incidental: the 50–500 nM affinity range that defines the WB boundary is precisely the region where experimental binding probabilities are most graded, where ML predictors trained on finite data produce the most uncertain labels, and where conformational flexibility and kinetic effects (Harndahl et al., 2012; Jorgensen et al., 2014) render sequence-only approximations least reliable.</w:t>
       </w:r>
     </w:p>
     <w:p>
@@ -3865,11 +4133,11 @@
         <w:t xml:space="preserve"> </w:t>
       </w:r>
       <w:r>
-        <w:t xml:space="preserve">with the WB class at its epicentre. (i) Deterministic biophysical rules (PSSM) produce the cleanest decision boundary because the model is learning a ground-truth additive function. (ii) ML-derived labels (MHCflurry), which are themselves trained on IEDB data that is &gt;55% computationally labelled [31], already encode non-linear inter-position dependencies that reduce apparent model performance even when the downstream classifier is identical; the 2.9 ppt gap between PSSM and MHCflurry represents the information loss incurred by learning to approximate an approximation. (iii) If such predictions are re-deposited into public databases, each successive predictor generation compounds these biases, progressively eroding the distinction between true binding signals and inherited label noise. The WB class is the most vulnerable node in this cascade because its boundary is simultaneously the most ambiguous biologically and the most dependent on training label fidelity. We propose that the WB F1 — a metric that collapses to zero when a model effectively ignores the class — should be reported as a standard diagnostic in future benchmarking studies: a declining WB F1 across successive predictor generations would function as an early-warning signal for accelerating label contamination.</w:t>
-      </w:r>
-    </w:p>
-    <w:bookmarkEnd w:id="32"/>
-    <w:bookmarkStart w:id="33" w:name="X2b4c8db51d4ca9762027f85387c272b03049535"/>
+        <w:t xml:space="preserve">with the WB class at its epicentre. (i) Deterministic biophysical rules (PSSM) produce the cleanest decision boundary because the model is learning a ground-truth additive function. (ii) ML-derived labels (MHCflurry), which are themselves trained on IEDB data that is &gt;55% computationally labelled (Preibisch et al., 2026), already encode non-linear inter-position dependencies that reduce apparent model performance even when the downstream classifier is identical; the 2.9 ppt gap between PSSM and MHCflurry represents the information loss incurred by learning to approximate an approximation. (iii) If such predictions are re-deposited into public databases, each successive predictor generation compounds these biases, progressively eroding the distinction between true binding signals and inherited label noise. The WB class is the most vulnerable node in this cascade because its boundary is simultaneously the most ambiguous biologically and the most dependent on training label fidelity. We propose that the WB F1 — a metric that collapses to zero when a model effectively ignores the class — should be reported as a standard diagnostic in future benchmarking studies: a declining WB F1 across successive predictor generations would function as an early-warning signal for accelerating label contamination.</w:t>
+      </w:r>
+    </w:p>
+    <w:bookmarkEnd w:id="39"/>
+    <w:bookmarkStart w:id="40" w:name="X2b4c8db51d4ca9762027f85387c272b03049535"/>
     <w:p>
       <w:pPr>
         <w:pStyle w:val="Heading3"/>
@@ -3883,19 +4151,19 @@
         <w:pStyle w:val="FirstParagraph"/>
       </w:pPr>
       <w:r>
-        <w:t xml:space="preserve">The better performance of the Deep FFN over more complex architectures reflects fundamental properties of peptide-MHC interactions. Peptide BLOSUM62 encodings lack translational invariance and hierarchical features exploited by CNNs in natural images [28] – in peptide binding, position p2 is always position p2, and mixing positional information through convolution degrades predictive signal. The LSTM’s underperformance reflects the dominance of two discrete anchor positions (p2, p9) with relatively independent contributions [5]; sequential context contributes minimally to binding affinity. The ResNet’s underperformance is consistent with residual connections providing benefit only in deeper networks than warranted by 9 × 20 input tensors [29]. These findings confirm that for well-characterised alleles with simple anchor motifs, architectural complexity beyond additional depth with batch normalisation provides diminishing returns. We note that a simple position-specific scoring matrix baseline achieved 94.8% accuracy (Table 2) – higher than any neural architecture – underscoring that biophysical knowledge should be included as a comparator in computational benchmarking and that deep learning adds relatively modest predictive value for alleles whose binding determinants are already well understood.</w:t>
-      </w:r>
-    </w:p>
-    <w:p>
-      <w:pPr>
-        <w:pStyle w:val="BodyText"/>
-      </w:pPr>
-      <w:r>
-        <w:t xml:space="preserve">Beyond architecture selection, BLOSUM62 proved more reliable than ESM-2 t6 per-position embeddings under cross-validation (92.2 ± 0.4% vs. 82.2 ± 1.0%), despite ESM-2’s single-split advantage (93.3%). The per-position format was essential: mean-pooled embeddings collapsed to 65.9%, confirming that residue-position-specific features are needed for MHC-I binding prediction. The shallower 6-layer model outperformed the deeper 12-layer variant, possibly because t12’s additional transformer layers encode long-range protein-level interactions that introduce noise at the short 9-mer peptide scale. The 2,880-dimensional per-position ESM-2 features create an unfavourable feature-to-sample ratio for the 4,579-sample training set; the single-split 93.3% result reflects a favourable train/test partition rather than a genuine encoding advantage. For training data at the scale typical of single-allele studies, compact, biologically motivated encodings such as BLOSUM62 remain the more robust choice, and the ESM-2 representational advantage documented in protein-scale tasks [18] may require substantially larger peptide-MHC training corpora to materialise.</w:t>
-      </w:r>
-    </w:p>
-    <w:bookmarkEnd w:id="33"/>
-    <w:bookmarkStart w:id="34" w:name="Xd5c8c32747bd5e200fd757aa287248c01801802"/>
+        <w:t xml:space="preserve">The better performance of the Deep FFN over more complex architectures reflects fundamental properties of peptide-MHC interactions. Peptide BLOSUM62 encodings lack translational invariance and hierarchical features exploited by CNNs in natural images (Krizhevsky et al., 2012) – in peptide binding, position p2 is always position p2, and mixing positional information through convolution degrades predictive signal. The LSTM’s underperformance reflects the dominance of two discrete anchor positions (p2, p9) with relatively independent contributions (Ruppert et al., 1993); sequential context contributes minimally to binding affinity. The ResNet’s underperformance is consistent with residual connections providing benefit only in deeper networks than warranted by 9 × 20 input tensors (He et al., 2016). These findings confirm that for well-characterised alleles with simple anchor motifs, architectural complexity beyond additional depth with batch normalisation provides diminishing returns. We note that a simple position-specific scoring matrix baseline achieved 94.8% accuracy (Table 2) – higher than any neural architecture – underscoring that biophysical knowledge should be included as a comparator in computational benchmarking and that deep learning adds relatively modest predictive value for alleles whose binding determinants are already well understood.</w:t>
+      </w:r>
+    </w:p>
+    <w:p>
+      <w:pPr>
+        <w:pStyle w:val="BodyText"/>
+      </w:pPr>
+      <w:r>
+        <w:t xml:space="preserve">Beyond architecture selection, BLOSUM62 proved more reliable than ESM-2 t6 per-position embeddings under cross-validation (92.2 ± 0.4% vs. 82.2 ± 1.0%), despite ESM-2’s single-split advantage (93.3%). The per-position format was essential: mean-pooled embeddings collapsed to 65.9%, confirming that residue-position-specific features are needed for MHC-I binding prediction. The shallower 6-layer model outperformed the deeper 12-layer variant, possibly because t12’s additional transformer layers encode long-range protein-level interactions that introduce noise at the short 9-mer peptide scale. The 2,880-dimensional per-position ESM-2 features create an unfavourable feature-to-sample ratio for the 4,579-sample training set; the single-split 93.3% result reflects a favourable train/test partition rather than a genuine encoding advantage. For training data at the scale typical of single-allele studies, compact, biologically motivated encodings such as BLOSUM62 remain the more robust choice, and the ESM-2 representational advantage documented in protein-scale tasks (Rives et al., 2021) may require substantially larger peptide-MHC training corpora to materialise.</w:t>
+      </w:r>
+    </w:p>
+    <w:bookmarkEnd w:id="40"/>
+    <w:bookmarkStart w:id="41" w:name="Xd5c8c32747bd5e200fd757aa287248c01801802"/>
     <w:p>
       <w:pPr>
         <w:pStyle w:val="Heading3"/>
@@ -3909,15 +4177,15 @@
         <w:pStyle w:val="FirstParagraph"/>
       </w:pPr>
       <w:r>
-        <w:t xml:space="preserve">WB classification was the primary source of error across all architectures, and the label contamination cascade converges on the same class for the same structural reason: the 50–500 nM affinity range is where conformational flexibility determines presentation outcomes [32, 34] and where sequence-only approximations are least reliable. The IEDB results reinforce this convergence: all three false negatives carry non-canonical anchor residues at p9, suggesting that current training distributions systematically underrepresent the conformational plasticity that allows atypical anchors to achieve stable binding.</w:t>
-      </w:r>
-    </w:p>
-    <w:p>
-      <w:pPr>
-        <w:pStyle w:val="BodyText"/>
-      </w:pPr>
-      <w:r>
-        <w:t xml:space="preserve">The confluence of three recent developments offers a path forward. First, AlphaFold2 and AlphaFold3 now provide accurate pMHC structural models [33], enabling structure-conditioned binding assessment independent of sequence motifs. Second, structure-guided diffusion models can generate physically valid pMHC-I complexes that sequence-based predictors fail to recognise (AUROCs 0.06–0.22 [52]), exposing the fundamental blind spot of sequence-only approaches. Third, the K-E63 salt bridge predicted here demonstrates that structural analysis can capture non-canonical binding configurations invisible to training distributions. We propose a</w:t>
+        <w:t xml:space="preserve">WB classification was the primary source of error across all architectures, and the label contamination cascade converges on the same class for the same structural reason: the 50–500 nM affinity range is where conformational flexibility determines presentation outcomes (Harndahl et al., 2012; Jorgensen et al., 2014) and where sequence-only approximations are least reliable. The IEDB results reinforce this convergence: all three false negatives carry non-canonical anchor residues at p9, suggesting that current training distributions systematically underrepresent the conformational plasticity that allows atypical anchors to achieve stable binding.</w:t>
+      </w:r>
+    </w:p>
+    <w:p>
+      <w:pPr>
+        <w:pStyle w:val="BodyText"/>
+      </w:pPr>
+      <w:r>
+        <w:t xml:space="preserve">The confluence of three recent developments offers a path forward. First, AlphaFold2 and AlphaFold3 now provide accurate pMHC structural models (Jumper et al., 2021), enabling structure-conditioned binding assessment independent of sequence motifs. Second, structure-guided diffusion models can generate physically valid pMHC-I complexes that sequence-based predictors fail to recognise (AUROCs 0.06–0.22 (Mares et al., 2025)), exposing the fundamental blind spot of sequence-only approaches. Third, the K-E63 salt bridge predicted here demonstrates that structural analysis can capture non-canonical binding configurations invisible to training distributions. We propose a</w:t>
       </w:r>
       <w:r>
         <w:t xml:space="preserve"> </w:t>
@@ -3936,8 +4204,8 @@
         <w:t xml:space="preserve">that integrates these advances: (Tier 1) sequence-based binding prediction for high-throughput initial filtering; (Tier 2) AlphaFold3-predicted pMHC structural scoring of Tier 1 candidates with non-canonical anchors; (Tier 3) template-based energy minimisation or short MD simulation for structural plausibility assessment of the highest-priority candidates, followed by experimental validation. We note, however, that in our own multi-allele evaluation a structure-based predictor (MUNIS) did not lift non-canonical binder sensitivity above the sequence-model plateau (~0.65), so this tiered approach remains a hypothesis for the energy-compensated tail rather than a demonstrated solution; experimental validation will be required to establish whether structural scoring genuinely rescues these configurations.</w:t>
       </w:r>
     </w:p>
-    <w:bookmarkEnd w:id="34"/>
-    <w:bookmarkStart w:id="35" w:name="binding-versus-immunogenicity"/>
+    <w:bookmarkEnd w:id="41"/>
+    <w:bookmarkStart w:id="42" w:name="binding-versus-immunogenicity"/>
     <w:p>
       <w:pPr>
         <w:pStyle w:val="Heading3"/>
@@ -3951,11 +4219,11 @@
         <w:pStyle w:val="FirstParagraph"/>
       </w:pPr>
       <w:r>
-        <w:t xml:space="preserve">The model’s classification of homopolymeric anchor peptides as binders is correct behavior for a binding predictor [25]. The TESLA consortium found that only ~6% of top-predicted MHC-I binders were confirmed immunogenic [35], and recent benchmarks confirm high sensitivity for binding but lower precision for immunogenicity [36, 37]. A systematic evaluation by Zaghla et al. further quantified this gap, reporting a 78% false-positive rate in neoepitope predictions and identifying cross-reactivity with common viral epitopes (e.g., CMV) as a previously underappreciated confounder in neoepitope specificity assessment [53]. These findings underscore that the binding-to-immunogenicity gap remains the central bottleneck in translating computational epitope prediction to clinical vaccine design. Bridging this gap requires not only integrating proteasomal cleavage [38], TAP transport [39], and TCR-pMHC binding prediction [40] into end-to-end models, but also raising the specificity of the binding prediction step itself — which the present study’s label quality quantification directly addresses.</w:t>
-      </w:r>
-    </w:p>
-    <w:bookmarkEnd w:id="35"/>
-    <w:bookmarkStart w:id="36" w:name="X3353341ef3870cc420226d4fd6e772c8ff2cc78"/>
+        <w:t xml:space="preserve">The model’s classification of homopolymeric anchor peptides as binders is correct behavior for a binding predictor (Sette et al., 1994). The TESLA consortium found that only ~6% of top-predicted MHC-I binders were confirmed immunogenic (Wells et al., 2020), and recent benchmarks confirm high sensitivity for binding but lower precision for immunogenicity (Zaghla et al., 2025; Zeng et al., 2025). A systematic evaluation by Zaghla et al. further quantified this gap, reporting a 78% false-positive rate in neoepitope predictions and identifying cross-reactivity with common viral epitopes (e.g., CMV) as a previously underappreciated confounder in neoepitope specificity assessment (Zaghla et al., 2025). These findings underscore that the binding-to-immunogenicity gap remains the central bottleneck in translating computational epitope prediction to clinical vaccine design. Bridging this gap requires not only integrating proteasomal cleavage (Nielsen et al., 2005), TAP transport (Peters et al., 2003), and TCR-pMHC binding prediction (Zhao et al., 2025) into end-to-end models, but also raising the specificity of the binding prediction step itself — which the present study’s label quality quantification directly addresses.</w:t>
+      </w:r>
+    </w:p>
+    <w:bookmarkEnd w:id="42"/>
+    <w:bookmarkStart w:id="43" w:name="X3353341ef3870cc420226d4fd6e772c8ff2cc78"/>
     <w:p>
       <w:pPr>
         <w:pStyle w:val="Heading3"/>
@@ -3984,7 +4252,7 @@
         <w:t xml:space="preserve"> </w:t>
       </w:r>
       <w:r>
-        <w:t xml:space="preserve">is of particular interest: R248W is one of the most frequent TP53 missense mutations across all human cancers, representing approximately 3.5% of all somatic TP53 mutations in the IARC database (765 of 21,687 registered mutations) and ranking among the eight most common TP53 hotspots [41] (Figure S5). It is the most frequent TP53 mutation in skin squamous cell carcinoma and ranks second in colorectal, oesophageal adenocarcinoma, and basal cell carcinoma. The mutation has documented gain-of-function oncogenic activity [42]. A vaccine targeting this neoepitope would be applicable across multiple tumour types, though experimental validation of immunogenicity (e.g., IFN-γ ELISpot using HLA-A*02:01+ donor PBMCs) is required before clinical development. The KRAS G12C epitope enhancement, combined with pharmacological G12C inhibition [26, 27], suggests a rational combination immunotherapy strategy warranting preclinical investigation. The three epitope-destroying mutations represent potential immune evasion mechanisms. We performed an exploratory TCGA analysis comparing MHC-I component expression (HLA-A/B/C, B2M, TAP1/2) and CD8 T cell marker expression (CD8A/B) between mutation carriers and wild-type tumours (SKCM, COADREAD, ESCA for p53 R248W; PAAD, LUAD, COADREAD for KRAS G12V). After Benjamini-Hochberg correction, no gene reached statistical significance in any comparison (all adjusted p &gt; 0.98). The numerical trends were inconsistent across cohorts, and sample sizes for p53 R248W were limited (N = 2–7 per cohort). Larger, transcriptome-wide analyses are needed to determine whether these mutations are associated with differential immune engagement.</w:t>
+        <w:t xml:space="preserve">is of particular interest: R248W is one of the most frequent TP53 missense mutations across all human cancers, representing approximately 3.5% of all somatic TP53 mutations in the IARC database (765 of 21,687 registered mutations) and ranking among the eight most common TP53 hotspots (Bouaoun et al., 2016) (Figure S5). It is the most frequent TP53 mutation in skin squamous cell carcinoma and ranks second in colorectal, oesophageal adenocarcinoma, and basal cell carcinoma. The mutation has documented gain-of-function oncogenic activity (Muller and Vousden, 2014). A vaccine targeting this neoepitope would be applicable across multiple tumour types, though experimental validation of immunogenicity (e.g., IFN-γ ELISpot using HLA-A*02:01+ donor PBMCs) is required before clinical development. The KRAS G12C epitope enhancement, combined with pharmacological G12C inhibition (Canon et al., 2019; Hallin et al., 2020), suggests a rational combination immunotherapy strategy warranting preclinical investigation. The three epitope-destroying mutations represent potential immune evasion mechanisms. We performed an exploratory TCGA analysis comparing MHC-I component expression (HLA-A/B/C, B2M, TAP1/2) and CD8 T cell marker expression (CD8A/B) between mutation carriers and wild-type tumours (SKCM, COADREAD, ESCA for p53 R248W; PAAD, LUAD, COADREAD for KRAS G12V). After Benjamini-Hochberg correction, no gene reached statistical significance in any comparison (all adjusted p &gt; 0.98). The numerical trends were inconsistent across cohorts, and sample sizes for p53 R248W were limited (N = 2–7 per cohort). Larger, transcriptome-wide analyses are needed to determine whether these mutations are associated with differential immune engagement.</w:t>
       </w:r>
     </w:p>
     <w:p>
@@ -4018,7 +4286,7 @@
         <w:pStyle w:val="BodyText"/>
       </w:pPr>
       <w:r>
-        <w:t xml:space="preserve">The K-E63 salt bridge also highlights a broader challenge in computational epitope prediction: sequence-based predictors, including those benchmarked here, are trained predominantly on peptides with canonical anchor residues and may systematically underestimate binding affinity for non-canonical configurations. Recent work by Mares et al. demonstrated that structure-guided diffusion models can generate pMHC-I complexes with valid three-dimensional conformations yet achieve AUROCs of only 0.06–0.22 when scored by state-of-the-art sequence-based binding predictors, revealing fundamental blind spots in current training distributions [52]. The K-E63 salt bridge — a structurally plausible but sequence-non-canonical configuration in which a charged lysine at P2 replaces the canonical hydrophobic anchor — represents a concrete instance of this class of</w:t>
+        <w:t xml:space="preserve">The K-E63 salt bridge also highlights a broader challenge in computational epitope prediction: sequence-based predictors, including those benchmarked here, are trained predominantly on peptides with canonical anchor residues and may systematically underestimate binding affinity for non-canonical configurations. Recent work by Mares et al. demonstrated that structure-guided diffusion models can generate pMHC-I complexes with valid three-dimensional conformations yet achieve AUROCs of only 0.06–0.22 when scored by state-of-the-art sequence-based binding predictors, revealing fundamental blind spots in current training distributions (Mares et al., 2025). The K-E63 salt bridge — a structurally plausible but sequence-non-canonical configuration in which a charged lysine at P2 replaces the canonical hydrophobic anchor — represents a concrete instance of this class of</w:t>
       </w:r>
       <w:r>
         <w:t xml:space="preserve"> </w:t>
@@ -4033,8 +4301,8 @@
         <w:t xml:space="preserve">neoepitopes. This suggests that integrating structural information, whether from template-based modelling, AlphaFold-predicted pMHC complexes, or diffusion-generated conformations, may be necessary to capture binding configurations that fall outside the sequence-space distribution of existing training data.</w:t>
       </w:r>
     </w:p>
-    <w:bookmarkEnd w:id="36"/>
-    <w:bookmarkStart w:id="37" w:name="limitations"/>
+    <w:bookmarkEnd w:id="43"/>
+    <w:bookmarkStart w:id="44" w:name="limitations"/>
     <w:p>
       <w:pPr>
         <w:pStyle w:val="Heading3"/>
@@ -4080,11 +4348,11 @@
         <w:pStyle w:val="BodyText"/>
       </w:pPr>
       <w:r>
-        <w:t xml:space="preserve">Third, all protein scanning and mutation predictions are purely computational and require experimental validation. The cancer neoepitope candidates identified here should be tested by IFN-γ ELISpot or tetramer staining using HLA-A*02:01+ donor PBMCs before any translational claims can be substantiated. Fourth, antigen processing steps (proteasomal cleavage, TAP transport, tapasin loading [43]) are not modelled; integration of these steps is needed to move from binding prediction toward epitope identification. Fifth, the IEDB benchmark specificity assessment used homopolymer negative controls – these assess the binding-vs-immunogenicity distinction rather than binding prediction specificity per se. A broader set of experimentally validated non-binders would strengthen future benchmarking efforts. Finally, the structural analysis of the K-E63 salt bridge — while supported by convergent evidence from crystal structure comparisons, energy minimisation, and Coulombic estimation — remains computational. The Coulombic estimate does not incorporate desolvation penalties, conformational entropy costs, or the dynamic behaviour of water molecules in the B-pocket; a properly equilibrated MD simulation (≥100 ns) or free energy perturbation calculation would provide a more complete thermodynamic profile. Experimental structure determination (X-ray crystallography or cryo-EM of the YKLVVVGAV-HLA-A*02:01 complex) is required to confirm the predicted salt bridge.</w:t>
-      </w:r>
-    </w:p>
-    <w:bookmarkEnd w:id="37"/>
-    <w:bookmarkStart w:id="38" w:name="conclusions"/>
+        <w:t xml:space="preserve">Third, all protein scanning and mutation predictions are purely computational and require experimental validation. The cancer neoepitope candidates identified here should be tested by IFN-γ ELISpot or tetramer staining using HLA-A*02:01+ donor PBMCs before any translational claims can be substantiated. Fourth, antigen processing steps (proteasomal cleavage, TAP transport, tapasin loading (Stranzl et al., 2010)) are not modelled; integration of these steps is needed to move from binding prediction toward epitope identification. Fifth, the IEDB benchmark specificity assessment used homopolymer negative controls – these assess the binding-vs-immunogenicity distinction rather than binding prediction specificity per se. A broader set of experimentally validated non-binders would strengthen future benchmarking efforts. Sixth, non-canonical (motif-failing) binders plateau at ~0.65 sensitivity across two independent sequence predictors (our Deep FFN, MHCflurry) and a structure-based predictor (MUNIS) in our multi-allele evaluation; structure-based prediction does not currently rescue what sequence models miss. The extreme energy-compensated tail — e.g. the KRAS G12V P2-K configuration analysed here, where positive-charge P2 residues (K, R, H) can all reach the acidic B-pocket Glu63 (3.83 Å) — is prediction-resistant to every method tested. Finally, the structural analysis of the K-E63 salt bridge — while supported by convergent evidence from crystal structure comparisons, energy minimisation, and Coulombic estimation — remains computational. The Coulombic estimate does not incorporate desolvation penalties, conformational entropy costs, or the dynamic behaviour of water molecules in the B-pocket; a properly equilibrated MD simulation (≥100 ns) or free energy perturbation calculation would provide a more complete thermodynamic profile. Experimental structure determination (X-ray crystallography or cryo-EM of the YKLVVVGAV-HLA-A*02:01 complex) is required to confirm the predicted salt bridge.</w:t>
+      </w:r>
+    </w:p>
+    <w:bookmarkEnd w:id="44"/>
+    <w:bookmarkStart w:id="45" w:name="conclusions"/>
     <w:p>
       <w:pPr>
         <w:pStyle w:val="Heading3"/>
@@ -4136,9 +4404,9 @@
         </w:pict>
       </w:r>
     </w:p>
-    <w:bookmarkEnd w:id="38"/>
-    <w:bookmarkEnd w:id="39"/>
-    <w:bookmarkStart w:id="40" w:name="data-and-code-availability"/>
+    <w:bookmarkEnd w:id="45"/>
+    <w:bookmarkEnd w:id="46"/>
+    <w:bookmarkStart w:id="47" w:name="data-and-code-availability"/>
     <w:p>
       <w:pPr>
         <w:pStyle w:val="Heading2"/>
@@ -4160,7 +4428,7 @@
         <w:pStyle w:val="Compact"/>
         <w:numPr>
           <w:ilvl w:val="0"/>
-          <w:numId w:val="1002"/>
+          <w:numId w:val="1001"/>
         </w:numPr>
       </w:pPr>
       <w:r>
@@ -4179,7 +4447,7 @@
         <w:pStyle w:val="Compact"/>
         <w:numPr>
           <w:ilvl w:val="0"/>
-          <w:numId w:val="1002"/>
+          <w:numId w:val="1001"/>
         </w:numPr>
       </w:pPr>
       <w:r>
@@ -4198,7 +4466,7 @@
         <w:pStyle w:val="Compact"/>
         <w:numPr>
           <w:ilvl w:val="0"/>
-          <w:numId w:val="1002"/>
+          <w:numId w:val="1001"/>
         </w:numPr>
       </w:pPr>
       <w:r>
@@ -4232,7 +4500,7 @@
         <w:pStyle w:val="Compact"/>
         <w:numPr>
           <w:ilvl w:val="0"/>
-          <w:numId w:val="1002"/>
+          <w:numId w:val="1001"/>
         </w:numPr>
       </w:pPr>
       <w:r>
@@ -4260,7 +4528,28 @@
         <w:t xml:space="preserve">manuscript_data_package.tar.gz</w:t>
       </w:r>
       <w:r>
-        <w:t xml:space="preserve">) contains: (1) all trained model files (HDF5/RDS format); (2) feature matrices in CSV format (</w:t>
+        <w:t xml:space="preserve">) contains: (1) all trained model files (HDF5/RDS format), including the multi-allele pan models (</w:t>
+      </w:r>
+      <w:r>
+        <w:rPr>
+          <w:rStyle w:val="VerbatimChar"/>
+        </w:rPr>
+        <w:t xml:space="preserve">deep_ffn_pan_seed*.keras</w:t>
+      </w:r>
+      <w:r>
+        <w:t xml:space="preserve">,</w:t>
+      </w:r>
+      <w:r>
+        <w:t xml:space="preserve"> </w:t>
+      </w:r>
+      <w:r>
+        <w:rPr>
+          <w:rStyle w:val="VerbatimChar"/>
+        </w:rPr>
+        <w:t xml:space="preserve">deep_ffn_pan16.keras</w:t>
+      </w:r>
+      <w:r>
+        <w:t xml:space="preserve">); (2) feature matrices in CSV format (</w:t>
       </w:r>
       <w:r>
         <w:rPr>
@@ -4281,7 +4570,16 @@
         <w:t xml:space="preserve">feature_resnet.csv</w:t>
       </w:r>
       <w:r>
-        <w:t xml:space="preserve">, 5,088 × 315); (3) comprehensive prediction results for 10-protein epitope scan (3,536 peptides), IEDB benchmark (69 peptides), cancer mutation scan (144 windows), and new peptide predictions; (4) reproducible R and Python source code; (5) all publication-quality figures in PNG/PDF format.</w:t>
+        <w:t xml:space="preserve">, 5,088 × 315); (3) comprehensive prediction results for 10-protein epitope scan (3,536 peptides), IEDB benchmark (69 peptides), cancer mutation scan (144 windows), and new peptide predictions; (4) the curated multi-allele dataset (</w:t>
+      </w:r>
+      <w:r>
+        <w:rPr>
+          <w:rStyle w:val="VerbatimChar"/>
+        </w:rPr>
+        <w:t xml:space="preserve">type_ab_dataset.json</w:t>
+      </w:r>
+      <w:r>
+        <w:t xml:space="preserve">, 14,488 positives) and predictor scores; (5) reproducible R and Python source code; (6) all publication-quality figures in PNG/PDF format.</w:t>
       </w:r>
     </w:p>
     <w:p>
@@ -4307,7 +4605,7 @@
         </w:pict>
       </w:r>
     </w:p>
-    <w:bookmarkEnd w:id="40"/>
+    <w:bookmarkEnd w:id="47"/>
     <w:bookmarkStart w:id="48" w:name="declarations"/>
     <w:p>
       <w:pPr>
@@ -4317,13 +4615,14 @@
         <w:t xml:space="preserve">Declarations</w:t>
       </w:r>
     </w:p>
-    <w:bookmarkStart w:id="41" w:name="acknowledgments"/>
-    <w:p>
-      <w:pPr>
-        <w:pStyle w:val="Heading3"/>
-      </w:pPr>
-      <w:r>
-        <w:t xml:space="preserve">Acknowledgments</w:t>
+    <w:bookmarkEnd w:id="48"/>
+    <w:bookmarkStart w:id="49" w:name="acknowledgements"/>
+    <w:p>
+      <w:pPr>
+        <w:pStyle w:val="Heading2"/>
+      </w:pPr>
+      <w:r>
+        <w:t xml:space="preserve">Acknowledgements</w:t>
       </w:r>
     </w:p>
     <w:p>
@@ -4334,14 +4633,14 @@
         <w:t xml:space="preserve">We thank colleagues in the Department of Gastroenterology Surgery, The First Affiliated Hospital of Wenzhou Medical University, and the Center for Bionanoengineering, Zhejiang University, for their support and insightful discussions. We also acknowledge the developers and maintainers of MHCflurry, the Immune Epitope Database (IEDB), and the ESM-2 protein language model for making their tools and data publicly available.</w:t>
       </w:r>
     </w:p>
-    <w:bookmarkEnd w:id="41"/>
-    <w:bookmarkStart w:id="42" w:name="consent-for-publication"/>
-    <w:p>
-      <w:pPr>
-        <w:pStyle w:val="Heading3"/>
-      </w:pPr>
-      <w:r>
-        <w:t xml:space="preserve">Consent for Publication</w:t>
+    <w:bookmarkEnd w:id="49"/>
+    <w:bookmarkStart w:id="50" w:name="funding"/>
+    <w:p>
+      <w:pPr>
+        <w:pStyle w:val="Heading2"/>
+      </w:pPr>
+      <w:r>
+        <w:t xml:space="preserve">Funding</w:t>
       </w:r>
     </w:p>
     <w:p>
@@ -4349,35 +4648,17 @@
         <w:pStyle w:val="FirstParagraph"/>
       </w:pPr>
       <w:r>
-        <w:t xml:space="preserve">Not applicable.</w:t>
-      </w:r>
-    </w:p>
-    <w:bookmarkEnd w:id="42"/>
-    <w:bookmarkStart w:id="43" w:name="funding"/>
-    <w:p>
-      <w:pPr>
-        <w:pStyle w:val="Heading3"/>
-      </w:pPr>
-      <w:r>
-        <w:t xml:space="preserve">Funding</w:t>
-      </w:r>
-    </w:p>
-    <w:p>
-      <w:pPr>
-        <w:pStyle w:val="FirstParagraph"/>
-      </w:pPr>
-      <w:r>
         <w:t xml:space="preserve">This research did not receive any specific grant from funding agencies in the public, commercial, or not-for-profit sectors.</w:t>
       </w:r>
     </w:p>
-    <w:bookmarkEnd w:id="43"/>
-    <w:bookmarkStart w:id="44" w:name="data-availability"/>
-    <w:p>
-      <w:pPr>
-        <w:pStyle w:val="Heading3"/>
-      </w:pPr>
-      <w:r>
-        <w:t xml:space="preserve">Data Availability</w:t>
+    <w:bookmarkEnd w:id="50"/>
+    <w:bookmarkStart w:id="51" w:name="data-availability"/>
+    <w:p>
+      <w:pPr>
+        <w:pStyle w:val="Heading2"/>
+      </w:pPr>
+      <w:r>
+        <w:t xml:space="preserve">Data availability</w:t>
       </w:r>
     </w:p>
     <w:p>
@@ -4406,14 +4687,14 @@
         <w:t xml:space="preserve">, 1,700+ lines) is documented and modular. MHCflurry 2.2.0 is available at https://github.com/openvax/mhcflurry.</w:t>
       </w:r>
     </w:p>
-    <w:bookmarkEnd w:id="44"/>
-    <w:bookmarkStart w:id="45" w:name="authors-contributions"/>
-    <w:p>
-      <w:pPr>
-        <w:pStyle w:val="Heading3"/>
-      </w:pPr>
-      <w:r>
-        <w:t xml:space="preserve">Authors’ Contributions</w:t>
+    <w:bookmarkEnd w:id="51"/>
+    <w:bookmarkStart w:id="52" w:name="author-contributions"/>
+    <w:p>
+      <w:pPr>
+        <w:pStyle w:val="Heading2"/>
+      </w:pPr>
+      <w:r>
+        <w:t xml:space="preserve">Author contributions</w:t>
       </w:r>
     </w:p>
     <w:p>
@@ -4424,14 +4705,14 @@
         <w:t xml:space="preserve">Zhuha Zhou and Chen Weisheng: conception, design, data analysis, manuscript writing. Yiqi Cai: data analysis, manuscript writing. Yongyu Bai: data interpretation, manuscript revision. Zhuxian Zhou: supervision, manuscript revision. All authors read and approved the final manuscript.</w:t>
       </w:r>
     </w:p>
-    <w:bookmarkEnd w:id="45"/>
-    <w:bookmarkStart w:id="46" w:name="competing-interests"/>
-    <w:p>
-      <w:pPr>
-        <w:pStyle w:val="Heading3"/>
-      </w:pPr>
-      <w:r>
-        <w:t xml:space="preserve">Competing Interests</w:t>
+    <w:bookmarkEnd w:id="52"/>
+    <w:bookmarkStart w:id="53" w:name="conflict-of-interest"/>
+    <w:p>
+      <w:pPr>
+        <w:pStyle w:val="Heading2"/>
+      </w:pPr>
+      <w:r>
+        <w:t xml:space="preserve">Conflict of interest</w:t>
       </w:r>
     </w:p>
     <w:p>
@@ -4442,22 +4723,14 @@
         <w:t xml:space="preserve">The authors declare that they have no competing interests.</w:t>
       </w:r>
     </w:p>
-    <w:bookmarkEnd w:id="46"/>
-    <w:bookmarkStart w:id="47" w:name="Xd182db0490b2de20bd2b4e4cc8698599182035f"/>
-    <w:p>
-      <w:pPr>
-        <w:pStyle w:val="Heading3"/>
-      </w:pPr>
-      <w:r>
-        <w:t xml:space="preserve">Ethics Approval and Consent to Participate</w:t>
-      </w:r>
-    </w:p>
-    <w:p>
-      <w:pPr>
-        <w:pStyle w:val="FirstParagraph"/>
-      </w:pPr>
-      <w:r>
-        <w:t xml:space="preserve">Not applicable.</w:t>
+    <w:bookmarkEnd w:id="53"/>
+    <w:bookmarkStart w:id="54" w:name="ethics-approval"/>
+    <w:p>
+      <w:pPr>
+        <w:pStyle w:val="Heading2"/>
+      </w:pPr>
+      <w:r>
+        <w:t xml:space="preserve">Ethics approval</w:t>
       </w:r>
     </w:p>
     <w:p>
@@ -4467,9 +4740,8 @@
         </w:pict>
       </w:r>
     </w:p>
-    <w:bookmarkEnd w:id="47"/>
-    <w:bookmarkEnd w:id="48"/>
-    <w:bookmarkStart w:id="49" w:name="author-biographies"/>
+    <w:bookmarkEnd w:id="54"/>
+    <w:bookmarkStart w:id="55" w:name="author-biographies"/>
     <w:p>
       <w:pPr>
         <w:pStyle w:val="Heading2"/>
@@ -4575,8 +4847,8 @@
         </w:pict>
       </w:r>
     </w:p>
-    <w:bookmarkEnd w:id="49"/>
-    <w:bookmarkStart w:id="50" w:name="references"/>
+    <w:bookmarkEnd w:id="55"/>
+    <w:bookmarkStart w:id="56" w:name="references"/>
     <w:p>
       <w:pPr>
         <w:pStyle w:val="Heading2"/>
@@ -4587,11 +4859,223 @@
     </w:p>
     <w:p>
       <w:pPr>
-        <w:pStyle w:val="Compact"/>
-        <w:numPr>
-          <w:ilvl w:val="0"/>
-          <w:numId w:val="1003"/>
-        </w:numPr>
+        <w:pStyle w:val="FirstParagraph"/>
+      </w:pPr>
+      <w:r>
+        <w:t xml:space="preserve">Albert BA, Yang Y, Shao XM, et al. BigMHC: deep learning-based prediction of MHC-I epitope presentation. bioRxiv 2023.</w:t>
+      </w:r>
+    </w:p>
+    <w:p>
+      <w:pPr>
+        <w:pStyle w:val="BodyText"/>
+      </w:pPr>
+      <w:r>
+        <w:t xml:space="preserve">Backert L, Kohlbacher O. Immunoinformatics and epitope prediction in the age of genomic medicine. Genome Med 2015;7:119.</w:t>
+      </w:r>
+    </w:p>
+    <w:p>
+      <w:pPr>
+        <w:pStyle w:val="BodyText"/>
+      </w:pPr>
+      <w:r>
+        <w:t xml:space="preserve">Blum JS, Wearsch PA, Cresswell P. Pathways of antigen processing. Annu Rev Immunol 2013;31:443-473.</w:t>
+      </w:r>
+    </w:p>
+    <w:p>
+      <w:pPr>
+        <w:pStyle w:val="BodyText"/>
+      </w:pPr>
+      <w:r>
+        <w:t xml:space="preserve">Bouaoun L, Sonberath D, Ardin M, et al. TP53 variations in human cancers: new lessons from the IARC TP53 database and genomics data. Hum Mutat 2016;37:865-876.</w:t>
+      </w:r>
+    </w:p>
+    <w:p>
+      <w:pPr>
+        <w:pStyle w:val="BodyText"/>
+      </w:pPr>
+      <w:r>
+        <w:t xml:space="preserve">Canon J, Rex K, Saiki AY, et al. The clinical KRAS(G12C) inhibitor AMG 510 drives anti-tumour immunity. Nature 2019;575:217-223.</w:t>
+      </w:r>
+    </w:p>
+    <w:p>
+      <w:pPr>
+        <w:pStyle w:val="BodyText"/>
+      </w:pPr>
+      <w:r>
+        <w:t xml:space="preserve">Chelvanayagam G. A roadmap for HLA-A, HLA-B, and HLA-C peptide binding specificities. Immunogenetics 1996;45:15-26.</w:t>
+      </w:r>
+    </w:p>
+    <w:p>
+      <w:pPr>
+        <w:pStyle w:val="BodyText"/>
+      </w:pPr>
+      <w:r>
+        <w:t xml:space="preserve">Chen B, Khodadoust MS, Olsson N, et al. MUNIS: a deep learning model for predicting MHC-I epitope presentation. Nat Biotechnol 2025;43:123-132.</w:t>
+      </w:r>
+    </w:p>
+    <w:p>
+      <w:pPr>
+        <w:pStyle w:val="BodyText"/>
+      </w:pPr>
+      <w:r>
+        <w:t xml:space="preserve">Darden T, York D, Pedersen L. Particle mesh Ewald: An N·log(N) method for Ewald sums in large systems. J Chem Phys 1993;98:10089-10092.</w:t>
+      </w:r>
+    </w:p>
+    <w:p>
+      <w:pPr>
+        <w:pStyle w:val="BodyText"/>
+      </w:pPr>
+      <w:r>
+        <w:t xml:space="preserve">Eastman P, Swails J, Chodera JD, et al. OpenMM 7: Rapid development of high performance algorithms for molecular dynamics. PLoS Comput Biol 2017;13:e1005659.</w:t>
+      </w:r>
+    </w:p>
+    <w:p>
+      <w:pPr>
+        <w:pStyle w:val="BodyText"/>
+      </w:pPr>
+      <w:r>
+        <w:t xml:space="preserve">Editorial Board. Comprehensive evaluation and interpretative insights of peptide-HLA binding prediction tools. bioRxiv 2025. doi:10.1101/2025.04.10.648169.</w:t>
+      </w:r>
+    </w:p>
+    <w:p>
+      <w:pPr>
+        <w:pStyle w:val="BodyText"/>
+      </w:pPr>
+      <w:r>
+        <w:t xml:space="preserve">Falk K, Rotzschke O, Stevanovic S, et al. Allele-specific motifs revealed by sequencing of self-peptides eluted from MHC molecules. Nature 1991;351:290-296.</w:t>
+      </w:r>
+    </w:p>
+    <w:p>
+      <w:pPr>
+        <w:pStyle w:val="BodyText"/>
+      </w:pPr>
+      <w:r>
+        <w:t xml:space="preserve">Hallin J, Engstrom LD, Hargis L, et al. The KRAS G12C inhibitor MRTX849 provides insight toward therapeutic susceptibility of KRAS-mutant cancers in mouse models and patients. Cancer Discov 2020;10:54-71.</w:t>
+      </w:r>
+    </w:p>
+    <w:p>
+      <w:pPr>
+        <w:pStyle w:val="BodyText"/>
+      </w:pPr>
+      <w:r>
+        <w:t xml:space="preserve">Harndahl M, Rasmussen M, Roder G, et al. Peptide-MHC class I stability is a better predictor than peptide affinity of CTL immunogenicity. Eur J Immunol 2012;42:1405-1416.</w:t>
+      </w:r>
+    </w:p>
+    <w:p>
+      <w:pPr>
+        <w:pStyle w:val="BodyText"/>
+      </w:pPr>
+      <w:r>
+        <w:t xml:space="preserve">He K, Zhang X, Ren S, et al. Deep residual learning for image recognition. Proc IEEE Conf Comput Vis Pattern Recognit 2016:770-778.</w:t>
+      </w:r>
+    </w:p>
+    <w:p>
+      <w:pPr>
+        <w:pStyle w:val="BodyText"/>
+      </w:pPr>
+      <w:r>
+        <w:t xml:space="preserve">Henikoff S, Henikoff JG. Amino acid substitution matrices from protein blocks. Proc Natl Acad Sci USA 1992;89:10915-10919.</w:t>
+      </w:r>
+    </w:p>
+    <w:p>
+      <w:pPr>
+        <w:pStyle w:val="BodyText"/>
+      </w:pPr>
+      <w:r>
+        <w:t xml:space="preserve">Hoof I, Peters B, Sidney J, et al. NetMHCpan, a method for MHC class I binding prediction beyond humans. Immunogenetics 2009;61:1-13.</w:t>
+      </w:r>
+    </w:p>
+    <w:p>
+      <w:pPr>
+        <w:pStyle w:val="BodyText"/>
+      </w:pPr>
+      <w:r>
+        <w:t xml:space="preserve">Jessen LE. Deep learning for cancer immunotherapy. RStudio AI Blog 2018. [blog post; non-peer-reviewed]</w:t>
+      </w:r>
+    </w:p>
+    <w:p>
+      <w:pPr>
+        <w:pStyle w:val="BodyText"/>
+      </w:pPr>
+      <w:r>
+        <w:t xml:space="preserve">Jorgensen KW, Rasmussen M, Buus S, et al. NetMHCstab – predicting stability of peptide-MHC-I complexes; impacts for cytotoxic T lymphocyte epitope discovery. Immunology 2014;141:18-26.</w:t>
+      </w:r>
+    </w:p>
+    <w:p>
+      <w:pPr>
+        <w:pStyle w:val="BodyText"/>
+      </w:pPr>
+      <w:r>
+        <w:t xml:space="preserve">Jumper J, Evans R, Pritzel A, et al. Highly accurate protein structure prediction with AlphaFold. Nature 2021;596:583-589.</w:t>
+      </w:r>
+    </w:p>
+    <w:p>
+      <w:pPr>
+        <w:pStyle w:val="BodyText"/>
+      </w:pPr>
+      <w:r>
+        <w:t xml:space="preserve">Katsikis PD, Ishii KJ, Schliehe C. Challenges in developing personalized neoantigen cancer vaccines. Nat Rev Immunol 2023;23:745-760.</w:t>
+      </w:r>
+    </w:p>
+    <w:p>
+      <w:pPr>
+        <w:pStyle w:val="BodyText"/>
+      </w:pPr>
+      <w:r>
+        <w:t xml:space="preserve">Krizhevsky A, Sutskever I, Hinton GE. ImageNet classification with deep convolutional neural networks. Adv Neural Inf Process Syst 2012;25:1097-1105.</w:t>
+      </w:r>
+    </w:p>
+    <w:p>
+      <w:pPr>
+        <w:pStyle w:val="BodyText"/>
+      </w:pPr>
+      <w:r>
+        <w:t xml:space="preserve">Lundegaard C, Lund O, Nielsen M. State of the art and challenges in sequence based T-cell epitope prediction. Immunome Res 2011;6(Suppl 2):S3.</w:t>
+      </w:r>
+    </w:p>
+    <w:p>
+      <w:pPr>
+        <w:pStyle w:val="BodyText"/>
+      </w:pPr>
+      <w:r>
+        <w:t xml:space="preserve">Madden DR. The three-dimensional structure of peptide-MHC complexes. Annu Rev Immunol 1995;13:587-622.</w:t>
+      </w:r>
+    </w:p>
+    <w:p>
+      <w:pPr>
+        <w:pStyle w:val="BodyText"/>
+      </w:pPr>
+      <w:r>
+        <w:t xml:space="preserve">Maier JA, Martinez C, Kasavajhala K, et al. ff14SB: Improving the accuracy of protein side chain and backbone parameters from ff99SB. J Chem Theory Comput 2015;11:3696-3713.</w:t>
+      </w:r>
+    </w:p>
+    <w:p>
+      <w:pPr>
+        <w:pStyle w:val="BodyText"/>
+      </w:pPr>
+      <w:r>
+        <w:t xml:space="preserve">Mares S, Miao Z, Grzeskowiak CL, et al. Generation of structure-guided pMHC-I libraries using diffusion models. Proc Int Conf Mach Learn 2025. arXiv:2507.08902.</w:t>
+      </w:r>
+    </w:p>
+    <w:p>
+      <w:pPr>
+        <w:pStyle w:val="BodyText"/>
+      </w:pPr>
+      <w:r>
+        <w:t xml:space="preserve">Miller BR 3rd, McGee TD Jr, Swails JM, et al. MMPBSA.py: An efficient program for end-state free energy calculations. J Chem Theory Comput 2012;8:3314-3321.</w:t>
+      </w:r>
+    </w:p>
+    <w:p>
+      <w:pPr>
+        <w:pStyle w:val="BodyText"/>
+      </w:pPr>
+      <w:r>
+        <w:t xml:space="preserve">Muller PAJ, Vousden KH. Mutant p53 in cancer: new functions and therapeutic opportunities. Cancer Cell 2014;25:304-317.</w:t>
+      </w:r>
+    </w:p>
+    <w:p>
+      <w:pPr>
+        <w:pStyle w:val="BodyText"/>
       </w:pPr>
       <w:r>
         <w:t xml:space="preserve">Neefjes J, Jongsma MLM, Paul P, et al. Towards a systems understanding of MHC class I and MHC class II antigen presentation. Nat Rev Immunol 2011;11:823-836.</w:t>
@@ -4599,47 +5083,127 @@
     </w:p>
     <w:p>
       <w:pPr>
-        <w:pStyle w:val="Compact"/>
-        <w:numPr>
-          <w:ilvl w:val="0"/>
-          <w:numId w:val="1003"/>
-        </w:numPr>
-      </w:pPr>
-      <w:r>
-        <w:t xml:space="preserve">Blum JS, Wearsch PA, Cresswell P. Pathways of antigen processing. Annu Rev Immunol 2013;31:443-473.</w:t>
-      </w:r>
-    </w:p>
-    <w:p>
-      <w:pPr>
-        <w:pStyle w:val="Compact"/>
-        <w:numPr>
-          <w:ilvl w:val="0"/>
-          <w:numId w:val="1003"/>
-        </w:numPr>
-      </w:pPr>
-      <w:r>
-        <w:t xml:space="preserve">Falk K, Rotzschke O, Stevanovic S, et al. Allele-specific motifs revealed by sequencing of self-peptides eluted from MHC molecules. Nature 1991;351:290-296.</w:t>
-      </w:r>
-    </w:p>
-    <w:p>
-      <w:pPr>
-        <w:pStyle w:val="Compact"/>
-        <w:numPr>
-          <w:ilvl w:val="0"/>
-          <w:numId w:val="1003"/>
-        </w:numPr>
-      </w:pPr>
-      <w:r>
-        <w:t xml:space="preserve">Madden DR. The three-dimensional structure of peptide-MHC complexes. Annu Rev Immunol 1995;13:587-622.</w:t>
-      </w:r>
-    </w:p>
-    <w:p>
-      <w:pPr>
-        <w:pStyle w:val="Compact"/>
-        <w:numPr>
-          <w:ilvl w:val="0"/>
-          <w:numId w:val="1003"/>
-        </w:numPr>
+        <w:pStyle w:val="BodyText"/>
+      </w:pPr>
+      <w:r>
+        <w:t xml:space="preserve">Nielsen M, Lundegaard C, Worning P, et al. Reliable prediction of T-cell epitopes using neural networks with novel sequence representations. Protein Sci 2003;12:1007-1017.</w:t>
+      </w:r>
+    </w:p>
+    <w:p>
+      <w:pPr>
+        <w:pStyle w:val="BodyText"/>
+      </w:pPr>
+      <w:r>
+        <w:t xml:space="preserve">Nielsen M, Lundegaard C, Lund O, et al. The role of the proteasome in generating cytotoxic T-cell epitopes: insights obtained from improved predictions of proteasomal cleavage. Immunogenetics 2005;57:33-41.</w:t>
+      </w:r>
+    </w:p>
+    <w:p>
+      <w:pPr>
+        <w:pStyle w:val="BodyText"/>
+      </w:pPr>
+      <w:r>
+        <w:t xml:space="preserve">O’Donnell TJ, Rubinsteyn A, Bonsack M, et al. MHCflurry: open-source class I MHC binding affinity prediction. Cell Syst 2018;7:129-132.</w:t>
+      </w:r>
+    </w:p>
+    <w:p>
+      <w:pPr>
+        <w:pStyle w:val="BodyText"/>
+      </w:pPr>
+      <w:r>
+        <w:t xml:space="preserve">O’Donnell TJ, Rubinsteyn A, Laserson U. MHCflurry 2.0: improved pan-allele prediction of MHC class I-presented peptides by incorporating antigen processing. Cell Syst 2020;11:42-48.</w:t>
+      </w:r>
+    </w:p>
+    <w:p>
+      <w:pPr>
+        <w:pStyle w:val="BodyText"/>
+      </w:pPr>
+      <w:r>
+        <w:t xml:space="preserve">Oluwagbemi O, Oladipo E, Dairo E, et al. AI-driven epitope prediction: a systematic review, comparative analysis, and practical guide for vaccine development. npj Vaccines 2025;10:258.</w:t>
+      </w:r>
+    </w:p>
+    <w:p>
+      <w:pPr>
+        <w:pStyle w:val="BodyText"/>
+      </w:pPr>
+      <w:r>
+        <w:t xml:space="preserve">Onufriev A, Bashford D, Case DA. Exploring protein native states and large-scale conformational changes with a modified generalized Born model. Proteins 2004;55:383-394.</w:t>
+      </w:r>
+    </w:p>
+    <w:p>
+      <w:pPr>
+        <w:pStyle w:val="BodyText"/>
+      </w:pPr>
+      <w:r>
+        <w:t xml:space="preserve">Parker KC, Bednarek MA, Coligan JE. Scheme for ranking potential HLA-A2 binding peptides based on independent binding of individual peptide side-chains. J Immunol 1994;152:163-175.</w:t>
+      </w:r>
+    </w:p>
+    <w:p>
+      <w:pPr>
+        <w:pStyle w:val="BodyText"/>
+      </w:pPr>
+      <w:r>
+        <w:t xml:space="preserve">Peters B, Bulik S, Tampe R, et al. Identifying MHC class I epitopes by predicting the TAP transport efficiency of epitope precursors. J Immunol 2003;171:1741-1749.</w:t>
+      </w:r>
+    </w:p>
+    <w:p>
+      <w:pPr>
+        <w:pStyle w:val="BodyText"/>
+      </w:pPr>
+      <w:r>
+        <w:t xml:space="preserve">Preibisch J, Becker JP, Kohlbacher O. Resolution of recursive data corruption to transform T-cell epitope discovery. bioRxiv 2026. [preprint]</w:t>
+      </w:r>
+    </w:p>
+    <w:p>
+      <w:pPr>
+        <w:pStyle w:val="BodyText"/>
+      </w:pPr>
+      <w:r>
+        <w:t xml:space="preserve">Qi J, Zhang L, Chen K, et al. A roadmap for T cell receptor-peptide-bound major histocompatibility complex binding prediction by machine learning: glimpse and foresight. Brief Bioinform 2025;26:bbag032.</w:t>
+      </w:r>
+    </w:p>
+    <w:p>
+      <w:pPr>
+        <w:pStyle w:val="BodyText"/>
+      </w:pPr>
+      <w:r>
+        <w:t xml:space="preserve">Rammensee HG, Friede T, Stevanovic S. MHC ligands and peptide motifs: first listing. Immunogenetics 1995;41:178-228.</w:t>
+      </w:r>
+    </w:p>
+    <w:p>
+      <w:pPr>
+        <w:pStyle w:val="BodyText"/>
+      </w:pPr>
+      <w:r>
+        <w:t xml:space="preserve">Rammensee HG, Bachmann J, Emmerich NPN, et al. SYFPEITHI: database for MHC ligands and peptide motifs. Immunogenetics 1999;50:213-219.</w:t>
+      </w:r>
+    </w:p>
+    <w:p>
+      <w:pPr>
+        <w:pStyle w:val="BodyText"/>
+      </w:pPr>
+      <w:r>
+        <w:t xml:space="preserve">Reynisson B, Alvarez B, Paul S, et al. NetMHCpan-4.1 and NetMHCIIpan-4.0: improved predictions of MHC antigen presentation by concurrent motif deconvolution and integration of MS MHC eluted ligand data. Nucleic Acids Res 2020;48:W449-W454.</w:t>
+      </w:r>
+    </w:p>
+    <w:p>
+      <w:pPr>
+        <w:pStyle w:val="BodyText"/>
+      </w:pPr>
+      <w:r>
+        <w:t xml:space="preserve">Rives A, Meier J, Sercu T, et al. Biological structure and function emerge from scaling unsupervised learning to 250 million protein sequences. Proc Natl Acad Sci USA 2021;118:e2016239118.</w:t>
+      </w:r>
+    </w:p>
+    <w:p>
+      <w:pPr>
+        <w:pStyle w:val="BodyText"/>
+      </w:pPr>
+      <w:r>
+        <w:t xml:space="preserve">Robin X, Turck N, Hainard A, et al. pROC: an open-source package for R and S+ to analyze and compare ROC curves. BMC Bioinformatics 2011;12:77.</w:t>
+      </w:r>
+    </w:p>
+    <w:p>
+      <w:pPr>
+        <w:pStyle w:val="BodyText"/>
       </w:pPr>
       <w:r>
         <w:t xml:space="preserve">Ruppert J, Sidney J, Celis E, et al. Prominent role of secondary anchor residues in peptide binding to HLA-A2.1 molecules. Cell 1993;74:929-937.</w:t>
@@ -4647,203 +5211,23 @@
     </w:p>
     <w:p>
       <w:pPr>
-        <w:pStyle w:val="Compact"/>
-        <w:numPr>
-          <w:ilvl w:val="0"/>
-          <w:numId w:val="1003"/>
-        </w:numPr>
-      </w:pPr>
-      <w:r>
-        <w:t xml:space="preserve">Rammensee HG, Friede T, Stevanovic S. MHC ligands and peptide motifs: first listing. Immunogenetics 1995;41:178-228.</w:t>
-      </w:r>
-    </w:p>
-    <w:p>
-      <w:pPr>
-        <w:pStyle w:val="Compact"/>
-        <w:numPr>
-          <w:ilvl w:val="0"/>
-          <w:numId w:val="1003"/>
-        </w:numPr>
-      </w:pPr>
-      <w:r>
-        <w:t xml:space="preserve">Lundegaard C, Lund O, Nielsen M. State of the art and challenges in sequence based T-cell epitope prediction. Immunome Res 2011;6(Suppl 2):S3.</w:t>
-      </w:r>
-    </w:p>
-    <w:p>
-      <w:pPr>
-        <w:pStyle w:val="Compact"/>
-        <w:numPr>
-          <w:ilvl w:val="0"/>
-          <w:numId w:val="1003"/>
-        </w:numPr>
-      </w:pPr>
-      <w:r>
-        <w:t xml:space="preserve">Backert L, Kohlbacher O. Immunoinformatics and epitope prediction in the age of genomic medicine. Genome Med 2015;7:119.</w:t>
-      </w:r>
-    </w:p>
-    <w:p>
-      <w:pPr>
-        <w:pStyle w:val="Compact"/>
-        <w:numPr>
-          <w:ilvl w:val="0"/>
-          <w:numId w:val="1003"/>
-        </w:numPr>
-      </w:pPr>
-      <w:r>
-        <w:t xml:space="preserve">Parker KC, Bednarek MA, Coligan JE. Scheme for ranking potential HLA-A2 binding peptides based on independent binding of individual peptide side-chains. J Immunol 1994;152:163-175.</w:t>
-      </w:r>
-    </w:p>
-    <w:p>
-      <w:pPr>
-        <w:pStyle w:val="Compact"/>
-        <w:numPr>
-          <w:ilvl w:val="0"/>
-          <w:numId w:val="1003"/>
-        </w:numPr>
-      </w:pPr>
-      <w:r>
-        <w:t xml:space="preserve">Rammensee HG, Bachmann J, Emmerich NPN, et al. SYFPEITHI: database for MHC ligands and peptide motifs. Immunogenetics 1999;50:213-219.</w:t>
-      </w:r>
-    </w:p>
-    <w:p>
-      <w:pPr>
-        <w:pStyle w:val="Compact"/>
-        <w:numPr>
-          <w:ilvl w:val="0"/>
-          <w:numId w:val="1003"/>
-        </w:numPr>
-      </w:pPr>
-      <w:r>
-        <w:t xml:space="preserve">Nielsen M, Lundegaard C, Worning P, et al. Reliable prediction of T-cell epitopes using neural networks with novel sequence representations. Protein Sci 2003;12:1007-1017.</w:t>
-      </w:r>
-    </w:p>
-    <w:p>
-      <w:pPr>
-        <w:pStyle w:val="Compact"/>
-        <w:numPr>
-          <w:ilvl w:val="0"/>
-          <w:numId w:val="1003"/>
-        </w:numPr>
-      </w:pPr>
-      <w:r>
-        <w:t xml:space="preserve">Hoof I, Peters B, Sidney J, et al. NetMHCpan, a method for MHC class I binding prediction beyond humans. Immunogenetics 2009;61:1-13.</w:t>
-      </w:r>
-    </w:p>
-    <w:p>
-      <w:pPr>
-        <w:pStyle w:val="Compact"/>
-        <w:numPr>
-          <w:ilvl w:val="0"/>
-          <w:numId w:val="1003"/>
-        </w:numPr>
-      </w:pPr>
-      <w:r>
-        <w:t xml:space="preserve">Reynisson B, Alvarez B, Paul S, et al. NetMHCpan-4.1 and NetMHCIIpan-4.0: improved predictions of MHC antigen presentation by concurrent motif deconvolution and integration of MS MHC eluted ligand data. Nucleic Acids Res 2020;48:W449-W454.</w:t>
-      </w:r>
-    </w:p>
-    <w:p>
-      <w:pPr>
-        <w:pStyle w:val="Compact"/>
-        <w:numPr>
-          <w:ilvl w:val="0"/>
-          <w:numId w:val="1003"/>
-        </w:numPr>
-      </w:pPr>
-      <w:r>
-        <w:t xml:space="preserve">O’Donnell TJ, Rubinsteyn A, Bonsack M, et al. MHCflurry: open-source class I MHC binding affinity prediction. Cell Syst 2018;7:129-132.</w:t>
-      </w:r>
-    </w:p>
-    <w:p>
-      <w:pPr>
-        <w:pStyle w:val="Compact"/>
-        <w:numPr>
-          <w:ilvl w:val="0"/>
-          <w:numId w:val="1003"/>
-        </w:numPr>
-      </w:pPr>
-      <w:r>
-        <w:t xml:space="preserve">O’Donnell TJ, Rubinsteyn A, Laserson U. MHCflurry 2.0: improved pan-allele prediction of MHC class I-presented peptides by incorporating antigen processing. Cell Syst 2020;11:42-48.</w:t>
-      </w:r>
-    </w:p>
-    <w:p>
-      <w:pPr>
-        <w:pStyle w:val="Compact"/>
-        <w:numPr>
-          <w:ilvl w:val="0"/>
-          <w:numId w:val="1003"/>
-        </w:numPr>
-      </w:pPr>
-      <w:r>
-        <w:t xml:space="preserve">Albert BA, Yang Y, Shao XM, et al. BigMHC: deep learning-based prediction of MHC-I epitope presentation. bioRxiv 2023.</w:t>
-      </w:r>
-    </w:p>
-    <w:p>
-      <w:pPr>
-        <w:pStyle w:val="Compact"/>
-        <w:numPr>
-          <w:ilvl w:val="0"/>
-          <w:numId w:val="1003"/>
-        </w:numPr>
-      </w:pPr>
-      <w:r>
-        <w:t xml:space="preserve">Chen B, Khodadoust MS, Olsson N, et al. MUNIS: a deep learning model for predicting MHC-I epitope presentation. Nat Biotechnol 2025;43:123-132.</w:t>
-      </w:r>
-    </w:p>
-    <w:p>
-      <w:pPr>
-        <w:pStyle w:val="Compact"/>
-        <w:numPr>
-          <w:ilvl w:val="0"/>
-          <w:numId w:val="1003"/>
-        </w:numPr>
-      </w:pPr>
-      <w:r>
-        <w:t xml:space="preserve">Rives A, Meier J, Sercu T, et al. Biological structure and function emerge from scaling unsupervised learning to 250 million protein sequences. Proc Natl Acad Sci USA 2021;118:e2016239118.</w:t>
-      </w:r>
-    </w:p>
-    <w:p>
-      <w:pPr>
-        <w:pStyle w:val="Compact"/>
-        <w:numPr>
-          <w:ilvl w:val="0"/>
-          <w:numId w:val="1003"/>
-        </w:numPr>
-      </w:pPr>
-      <w:r>
-        <w:t xml:space="preserve">Oluwagbemi O, Oladipo E, Dairo E, et al. AI-driven epitope prediction: a systematic review, comparative analysis, and practical guide for vaccine development. npj Vaccines 2025;10:258.</w:t>
-      </w:r>
-    </w:p>
-    <w:p>
-      <w:pPr>
-        <w:pStyle w:val="Compact"/>
-        <w:numPr>
-          <w:ilvl w:val="0"/>
-          <w:numId w:val="1003"/>
-        </w:numPr>
-      </w:pPr>
-      <w:r>
-        <w:t xml:space="preserve">Qi J, Zhang L, Chen K, et al. A roadmap for T cell receptor-peptide-bound major histocompatibility complex binding prediction by machine learning: glimpse and foresight. Brief Bioinform 2025;26:bbag032.</w:t>
-      </w:r>
-    </w:p>
-    <w:p>
-      <w:pPr>
-        <w:pStyle w:val="Compact"/>
-        <w:numPr>
-          <w:ilvl w:val="0"/>
-          <w:numId w:val="1003"/>
-        </w:numPr>
-      </w:pPr>
-      <w:r>
-        <w:t xml:space="preserve">Jessen LE. Deep learning for cancer immunotherapy. RStudio AI Blog 2018. [blog post; non-peer-reviewed]</w:t>
-      </w:r>
-    </w:p>
-    <w:p>
-      <w:pPr>
-        <w:pStyle w:val="Compact"/>
-        <w:numPr>
-          <w:ilvl w:val="0"/>
-          <w:numId w:val="1003"/>
-        </w:numPr>
+        <w:pStyle w:val="BodyText"/>
+      </w:pPr>
+      <w:r>
+        <w:t xml:space="preserve">Sette A, Vitiello A, Reherman B, et al. The relationship between class I binding affinity and immunogenicity of potential cytotoxic T cell epitopes. J Immunol 1994;153:5586-5592.</w:t>
+      </w:r>
+    </w:p>
+    <w:p>
+      <w:pPr>
+        <w:pStyle w:val="BodyText"/>
+      </w:pPr>
+      <w:r>
+        <w:t xml:space="preserve">Stranzl T, Larsen MV, Lundegaard C, et al. NetCTLpan: pan-specific MHC class I pathway epitope predictions. Immunogenetics 2010;62:357-368.</w:t>
+      </w:r>
+    </w:p>
+    <w:p>
+      <w:pPr>
+        <w:pStyle w:val="BodyText"/>
       </w:pPr>
       <w:r>
         <w:t xml:space="preserve">Vita R, Mahajan S, Overton JA, et al. The Immune Epitope Database (IEDB): 2018 update. Nucleic Acids Res 2019;47:D339-D343.</w:t>
@@ -4851,155 +5235,7 @@
     </w:p>
     <w:p>
       <w:pPr>
-        <w:pStyle w:val="Compact"/>
-        <w:numPr>
-          <w:ilvl w:val="0"/>
-          <w:numId w:val="1003"/>
-        </w:numPr>
-      </w:pPr>
-      <w:r>
-        <w:t xml:space="preserve">Henikoff S, Henikoff JG. Amino acid substitution matrices from protein blocks. Proc Natl Acad Sci USA 1992;89:10915-10919.</w:t>
-      </w:r>
-    </w:p>
-    <w:p>
-      <w:pPr>
-        <w:pStyle w:val="Compact"/>
-        <w:numPr>
-          <w:ilvl w:val="0"/>
-          <w:numId w:val="1003"/>
-        </w:numPr>
-      </w:pPr>
-      <w:r>
-        <w:t xml:space="preserve">Robin X, Turck N, Hainard A, et al. pROC: an open-source package for R and S+ to analyze and compare ROC curves. BMC Bioinformatics 2011;12:77.</w:t>
-      </w:r>
-    </w:p>
-    <w:p>
-      <w:pPr>
-        <w:pStyle w:val="Compact"/>
-        <w:numPr>
-          <w:ilvl w:val="0"/>
-          <w:numId w:val="1003"/>
-        </w:numPr>
-      </w:pPr>
-      <w:r>
-        <w:t xml:space="preserve">Sette A, Vitiello A, Reherman B, et al. The relationship between class I binding affinity and immunogenicity of potential cytotoxic T cell epitopes. J Immunol 1994;153:5586-5592.</w:t>
-      </w:r>
-    </w:p>
-    <w:p>
-      <w:pPr>
-        <w:pStyle w:val="Compact"/>
-        <w:numPr>
-          <w:ilvl w:val="0"/>
-          <w:numId w:val="1003"/>
-        </w:numPr>
-      </w:pPr>
-      <w:r>
-        <w:t xml:space="preserve">Canon J, Rex K, Saiki AY, et al. The clinical KRAS(G12C) inhibitor AMG 510 drives anti-tumour immunity. Nature 2019;575:217-223.</w:t>
-      </w:r>
-    </w:p>
-    <w:p>
-      <w:pPr>
-        <w:pStyle w:val="Compact"/>
-        <w:numPr>
-          <w:ilvl w:val="0"/>
-          <w:numId w:val="1003"/>
-        </w:numPr>
-      </w:pPr>
-      <w:r>
-        <w:t xml:space="preserve">Hallin J, Engstrom LD, Hargis L, et al. The KRAS G12C inhibitor MRTX849 provides insight toward therapeutic susceptibility of KRAS-mutant cancers in mouse models and patients. Cancer Discov 2020;10:54-71.</w:t>
-      </w:r>
-    </w:p>
-    <w:p>
-      <w:pPr>
-        <w:pStyle w:val="Compact"/>
-        <w:numPr>
-          <w:ilvl w:val="0"/>
-          <w:numId w:val="1003"/>
-        </w:numPr>
-      </w:pPr>
-      <w:r>
-        <w:t xml:space="preserve">Krizhevsky A, Sutskever I, Hinton GE. ImageNet classification with deep convolutional neural networks. Adv Neural Inf Process Syst 2012;25:1097-1105.</w:t>
-      </w:r>
-    </w:p>
-    <w:p>
-      <w:pPr>
-        <w:pStyle w:val="Compact"/>
-        <w:numPr>
-          <w:ilvl w:val="0"/>
-          <w:numId w:val="1003"/>
-        </w:numPr>
-      </w:pPr>
-      <w:r>
-        <w:t xml:space="preserve">He K, Zhang X, Ren S, et al. Deep residual learning for image recognition. Proc IEEE Conf Comput Vis Pattern Recognit 2016:770-778.</w:t>
-      </w:r>
-    </w:p>
-    <w:p>
-      <w:pPr>
-        <w:pStyle w:val="Compact"/>
-        <w:numPr>
-          <w:ilvl w:val="0"/>
-          <w:numId w:val="1003"/>
-        </w:numPr>
-      </w:pPr>
-      <w:r>
-        <w:t xml:space="preserve">Chelvanayagam G. A roadmap for HLA-A, HLA-B, and HLA-C peptide binding specificities. Immunogenetics 1996;45:15-26.</w:t>
-      </w:r>
-    </w:p>
-    <w:p>
-      <w:pPr>
-        <w:pStyle w:val="Compact"/>
-        <w:numPr>
-          <w:ilvl w:val="0"/>
-          <w:numId w:val="1003"/>
-        </w:numPr>
-      </w:pPr>
-      <w:r>
-        <w:t xml:space="preserve">Preibisch J, Becker JP, Kohlbacher O. Resolution of recursive data corruption to transform T-cell epitope discovery. bioRxiv 2026. [preprint]</w:t>
-      </w:r>
-    </w:p>
-    <w:p>
-      <w:pPr>
-        <w:pStyle w:val="Compact"/>
-        <w:numPr>
-          <w:ilvl w:val="0"/>
-          <w:numId w:val="1003"/>
-        </w:numPr>
-      </w:pPr>
-      <w:r>
-        <w:t xml:space="preserve">Harndahl M, Rasmussen M, Roder G, et al. Peptide-MHC class I stability is a better predictor than peptide affinity of CTL immunogenicity. Eur J Immunol 2012;42:1405-1416.</w:t>
-      </w:r>
-    </w:p>
-    <w:p>
-      <w:pPr>
-        <w:pStyle w:val="Compact"/>
-        <w:numPr>
-          <w:ilvl w:val="0"/>
-          <w:numId w:val="1003"/>
-        </w:numPr>
-      </w:pPr>
-      <w:r>
-        <w:t xml:space="preserve">Jumper J, Evans R, Pritzel A, et al. Highly accurate protein structure prediction with AlphaFold. Nature 2021;596:583-589.</w:t>
-      </w:r>
-    </w:p>
-    <w:p>
-      <w:pPr>
-        <w:pStyle w:val="Compact"/>
-        <w:numPr>
-          <w:ilvl w:val="0"/>
-          <w:numId w:val="1003"/>
-        </w:numPr>
-      </w:pPr>
-      <w:r>
-        <w:t xml:space="preserve">Jorgensen KW, Rasmussen M, Buus S, et al. NetMHCstab – predicting stability of peptide-MHC-I complexes; impacts for cytotoxic T lymphocyte epitope discovery. Immunology 2014;141:18-26.</w:t>
-      </w:r>
-    </w:p>
-    <w:p>
-      <w:pPr>
-        <w:pStyle w:val="Compact"/>
-        <w:numPr>
-          <w:ilvl w:val="0"/>
-          <w:numId w:val="1003"/>
-        </w:numPr>
+        <w:pStyle w:val="BodyText"/>
       </w:pPr>
       <w:r>
         <w:t xml:space="preserve">Wells DK, van Buuren MM, Dang KK, et al. Key parameters of tumor epitope immunogenicity revealed through a consortium approach improve neoantigen prediction. Cell 2020;183:818-834.</w:t>
@@ -5007,11 +5243,23 @@
     </w:p>
     <w:p>
       <w:pPr>
-        <w:pStyle w:val="Compact"/>
-        <w:numPr>
-          <w:ilvl w:val="0"/>
-          <w:numId w:val="1003"/>
-        </w:numPr>
+        <w:pStyle w:val="BodyText"/>
+      </w:pPr>
+      <w:r>
+        <w:t xml:space="preserve">Yan Y, Tao H, He J, Huang SY. The HDOCK server for integrated protein-protein docking. Nat Protoc 2020;15:1829-1852.</w:t>
+      </w:r>
+    </w:p>
+    <w:p>
+      <w:pPr>
+        <w:pStyle w:val="BodyText"/>
+      </w:pPr>
+      <w:r>
+        <w:t xml:space="preserve">Yaremenko AV, Zherebyatyeva OI, Belyaeva AA, et al. Clinical advances of mRNA vaccines for cancer immunotherapy. Med 2025;6:100315.</w:t>
+      </w:r>
+    </w:p>
+    <w:p>
+      <w:pPr>
+        <w:pStyle w:val="BodyText"/>
       </w:pPr>
       <w:r>
         <w:t xml:space="preserve">Zaghla N, Loffler MW, Kowalewski DJ. Systematic evaluation of (neo)epitope predictions and their correlation with clinically observed T-cell responses and immune evasion mechanisms. PhD Thesis, FU Berlin 2025. [PhD thesis; verify public accessibility and provide persistent identifier if available]</w:t>
@@ -5019,11 +5267,15 @@
     </w:p>
     <w:p>
       <w:pPr>
-        <w:pStyle w:val="Compact"/>
-        <w:numPr>
-          <w:ilvl w:val="0"/>
-          <w:numId w:val="1003"/>
-        </w:numPr>
+        <w:pStyle w:val="BodyText"/>
+      </w:pPr>
+      <w:r>
+        <w:t xml:space="preserve">Zaghla N, Loffler MW, Kowalewski DJ. Systematic evaluation of (neo)epitope predictions and their correlation with clinically observed T-cell responses and immune evasion mechanisms. Doctoral thesis, Freie Universität Berlin, 2025.</w:t>
+      </w:r>
+    </w:p>
+    <w:p>
+      <w:pPr>
+        <w:pStyle w:val="BodyText"/>
       </w:pPr>
       <w:r>
         <w:t xml:space="preserve">Zeng J, Li Y, Wang H, et al. Leveraging artificial intelligence for neoantigen prediction. Cancer Res 2025;85:2512-2525.</w:t>
@@ -5031,1226 +5283,14 @@
     </w:p>
     <w:p>
       <w:pPr>
-        <w:pStyle w:val="Compact"/>
-        <w:numPr>
-          <w:ilvl w:val="0"/>
-          <w:numId w:val="1003"/>
-        </w:numPr>
-      </w:pPr>
-      <w:r>
-        <w:t xml:space="preserve">Nielsen M, Lundegaard C, Lund O, et al. The role of the proteasome in generating cytotoxic T-cell epitopes: insights obtained from improved predictions of proteasomal cleavage. Immunogenetics 2005;57:33-41.</w:t>
-      </w:r>
-    </w:p>
-    <w:p>
-      <w:pPr>
-        <w:pStyle w:val="Compact"/>
-        <w:numPr>
-          <w:ilvl w:val="0"/>
-          <w:numId w:val="1003"/>
-        </w:numPr>
-      </w:pPr>
-      <w:r>
-        <w:t xml:space="preserve">Peters B, Bulik S, Tampe R, et al. Identifying MHC class I epitopes by predicting the TAP transport efficiency of epitope precursors. J Immunol 2003;171:1741-1749.</w:t>
-      </w:r>
-    </w:p>
-    <w:p>
-      <w:pPr>
-        <w:pStyle w:val="Compact"/>
-        <w:numPr>
-          <w:ilvl w:val="0"/>
-          <w:numId w:val="1003"/>
-        </w:numPr>
+        <w:pStyle w:val="BodyText"/>
       </w:pPr>
       <w:r>
         <w:t xml:space="preserve">Zhao H, Bhatt A, Cooper L, et al. UniPMT: a unified deep learning framework for peptide-MHC-TCR binding prediction. Nat Mach Intell 2025;7:234-243.</w:t>
       </w:r>
     </w:p>
-    <w:p>
-      <w:pPr>
-        <w:pStyle w:val="Compact"/>
-        <w:numPr>
-          <w:ilvl w:val="0"/>
-          <w:numId w:val="1003"/>
-        </w:numPr>
-      </w:pPr>
-      <w:r>
-        <w:t xml:space="preserve">Bouaoun L, Sonberath D, Ardin M, et al. TP53 variations in human cancers: new lessons from the IARC TP53 database and genomics data. Hum Mutat 2016;37:865-876.</w:t>
-      </w:r>
-    </w:p>
-    <w:p>
-      <w:pPr>
-        <w:pStyle w:val="Compact"/>
-        <w:numPr>
-          <w:ilvl w:val="0"/>
-          <w:numId w:val="1003"/>
-        </w:numPr>
-      </w:pPr>
-      <w:r>
-        <w:t xml:space="preserve">Muller PAJ, Vousden KH. Mutant p53 in cancer: new functions and therapeutic opportunities. Cancer Cell 2014;25:304-317.</w:t>
-      </w:r>
-    </w:p>
-    <w:p>
-      <w:pPr>
-        <w:pStyle w:val="Compact"/>
-        <w:numPr>
-          <w:ilvl w:val="0"/>
-          <w:numId w:val="1003"/>
-        </w:numPr>
-      </w:pPr>
-      <w:r>
-        <w:t xml:space="preserve">Stranzl T, Larsen MV, Lundegaard C, et al. NetCTLpan: pan-specific MHC class I pathway epitope predictions. Immunogenetics 2010;62:357-368.</w:t>
-      </w:r>
-    </w:p>
-    <w:p>
-      <w:pPr>
-        <w:pStyle w:val="Compact"/>
-        <w:numPr>
-          <w:ilvl w:val="0"/>
-          <w:numId w:val="1003"/>
-        </w:numPr>
-      </w:pPr>
-      <w:r>
-        <w:t xml:space="preserve">Yan Y, Tao H, He J, Huang SY. The HDOCK server for integrated protein-protein docking. Nat Protoc 2020;15:1829-1852.</w:t>
-      </w:r>
-    </w:p>
-    <w:p>
-      <w:pPr>
-        <w:pStyle w:val="Compact"/>
-        <w:numPr>
-          <w:ilvl w:val="0"/>
-          <w:numId w:val="1003"/>
-        </w:numPr>
-      </w:pPr>
-      <w:r>
-        <w:t xml:space="preserve">Eastman P, Swails J, Chodera JD, et al. OpenMM 7: Rapid development of high performance algorithms for molecular dynamics. PLoS Comput Biol 2017;13:e1005659.</w:t>
-      </w:r>
-    </w:p>
-    <w:p>
-      <w:pPr>
-        <w:pStyle w:val="Compact"/>
-        <w:numPr>
-          <w:ilvl w:val="0"/>
-          <w:numId w:val="1003"/>
-        </w:numPr>
-      </w:pPr>
-      <w:r>
-        <w:t xml:space="preserve">Maier JA, Martinez C, Kasavajhala K, et al. ff14SB: Improving the accuracy of protein side chain and backbone parameters from ff99SB. J Chem Theory Comput 2015;11:3696-3713.</w:t>
-      </w:r>
-    </w:p>
-    <w:p>
-      <w:pPr>
-        <w:pStyle w:val="Compact"/>
-        <w:numPr>
-          <w:ilvl w:val="0"/>
-          <w:numId w:val="1003"/>
-        </w:numPr>
-      </w:pPr>
-      <w:r>
-        <w:t xml:space="preserve">Darden T, York D, Pedersen L. Particle mesh Ewald: An N·log(N) method for Ewald sums in large systems. J Chem Phys 1993;98:10089-10092.</w:t>
-      </w:r>
-    </w:p>
-    <w:p>
-      <w:pPr>
-        <w:pStyle w:val="Compact"/>
-        <w:numPr>
-          <w:ilvl w:val="0"/>
-          <w:numId w:val="1003"/>
-        </w:numPr>
-      </w:pPr>
-      <w:r>
-        <w:t xml:space="preserve">Miller BR 3rd, McGee TD Jr, Swails JM, et al. MMPBSA.py: An efficient program for end-state free energy calculations. J Chem Theory Comput 2012;8:3314-3321.</w:t>
-      </w:r>
-    </w:p>
-    <w:p>
-      <w:pPr>
-        <w:pStyle w:val="Compact"/>
-        <w:numPr>
-          <w:ilvl w:val="0"/>
-          <w:numId w:val="1003"/>
-        </w:numPr>
-      </w:pPr>
-      <w:r>
-        <w:t xml:space="preserve">Onufriev A, Bashford D, Case DA. Exploring protein native states and large-scale conformational changes with a modified generalized Born model. Proteins 2004;55:383-394.</w:t>
-      </w:r>
-    </w:p>
-    <w:p>
-      <w:pPr>
-        <w:pStyle w:val="Compact"/>
-        <w:numPr>
-          <w:ilvl w:val="0"/>
-          <w:numId w:val="1003"/>
-        </w:numPr>
-      </w:pPr>
-      <w:r>
-        <w:t xml:space="preserve">Katsikis PD, Ishii KJ, Schliehe C. Challenges in developing personalized neoantigen cancer vaccines. Nat Rev Immunol 2023;23:745-760.</w:t>
-      </w:r>
-    </w:p>
-    <w:p>
-      <w:pPr>
-        <w:pStyle w:val="Compact"/>
-        <w:numPr>
-          <w:ilvl w:val="0"/>
-          <w:numId w:val="1003"/>
-        </w:numPr>
-      </w:pPr>
-      <w:r>
-        <w:t xml:space="preserve">Yaremenko AV, Zherebyatyeva OI, Belyaeva AA, et al. Clinical advances of mRNA vaccines for cancer immunotherapy. Med 2025;6:100315.</w:t>
-      </w:r>
-    </w:p>
-    <w:p>
-      <w:pPr>
-        <w:pStyle w:val="Compact"/>
-        <w:numPr>
-          <w:ilvl w:val="0"/>
-          <w:numId w:val="1003"/>
-        </w:numPr>
-      </w:pPr>
-      <w:r>
-        <w:t xml:space="preserve">Mares S, Miao Z, Grzeskowiak CL, et al. Generation of structure-guided pMHC-I libraries using diffusion models. Proc Int Conf Mach Learn 2025. arXiv:2507.08902.</w:t>
-      </w:r>
-    </w:p>
-    <w:p>
-      <w:pPr>
-        <w:pStyle w:val="Compact"/>
-        <w:numPr>
-          <w:ilvl w:val="0"/>
-          <w:numId w:val="1003"/>
-        </w:numPr>
-      </w:pPr>
-      <w:r>
-        <w:t xml:space="preserve">Zaghla N, Loffler MW, Kowalewski DJ. Systematic evaluation of (neo)epitope predictions and their correlation with clinically observed T-cell responses and immune evasion mechanisms. Doctoral thesis, Freie Universität Berlin, 2025.</w:t>
-      </w:r>
-    </w:p>
-    <w:p>
-      <w:pPr>
-        <w:pStyle w:val="Compact"/>
-        <w:numPr>
-          <w:ilvl w:val="0"/>
-          <w:numId w:val="1003"/>
-        </w:numPr>
-      </w:pPr>
-      <w:r>
-        <w:t xml:space="preserve">Editorial Board. Comprehensive evaluation and interpretative insights of peptide-HLA binding prediction tools. bioRxiv 2025. doi:10.1101/2025.04.10.648169.</w:t>
-      </w:r>
-    </w:p>
-    <w:p>
-      <w:r>
-        <w:pict>
-          <v:rect style="width:0;height:1.5pt" o:hralign="center" o:hrstd="t" o:hr="t"/>
-        </w:pict>
-      </w:r>
-    </w:p>
-    <w:bookmarkEnd w:id="50"/>
-    <w:bookmarkStart w:id="90" w:name="figure-legends"/>
-    <w:p>
-      <w:pPr>
-        <w:pStyle w:val="Heading2"/>
-      </w:pPr>
-      <w:r>
-        <w:t xml:space="preserve">Figure Legends</w:t>
-      </w:r>
-    </w:p>
-    <w:p>
-      <w:pPr>
-        <w:pStyle w:val="FirstParagraph"/>
-      </w:pPr>
-      <w:r>
-        <w:rPr>
-          <w:b/>
-          <w:bCs/>
-        </w:rPr>
-        <w:t xml:space="preserve">Figure 1.</w:t>
-      </w:r>
-      <w:r>
-        <w:t xml:space="preserve"> </w:t>
-      </w:r>
-      <w:r>
-        <w:t xml:space="preserve">Model performance comparison across six architectures. (A) Accuracy and Macro F1 scores on MHCflurry-labelled test set. (B) Per-class F1 breakdown for the best-performing Deep FFN model.</w:t>
-      </w:r>
-    </w:p>
-    <w:p>
-      <w:pPr>
-        <w:pStyle w:val="CaptionedFigure"/>
-      </w:pPr>
-      <w:r>
-        <w:drawing>
-          <wp:inline>
-            <wp:extent cx="5334000" cy="2667000"/>
-            <wp:effectExtent b="0" l="0" r="0" t="0"/>
-            <wp:docPr descr="Figure 1" title="" id="52" name="Picture"/>
-            <a:graphic>
-              <a:graphicData uri="http://schemas.openxmlformats.org/drawingml/2006/picture">
-                <pic:pic>
-                  <pic:nvPicPr>
-                    <pic:cNvPr descr="../03_Analysis/figures/Figure1_model_comparison.png" id="53" name="Picture"/>
-                    <pic:cNvPicPr>
-                      <a:picLocks noChangeArrowheads="1" noChangeAspect="1"/>
-                    </pic:cNvPicPr>
-                  </pic:nvPicPr>
-                  <pic:blipFill>
-                    <a:blip r:embed="rId51"/>
-                    <a:stretch>
-                      <a:fillRect/>
-                    </a:stretch>
-                  </pic:blipFill>
-                  <pic:spPr bwMode="auto">
-                    <a:xfrm>
-                      <a:off x="0" y="0"/>
-                      <a:ext cx="5334000" cy="2667000"/>
-                    </a:xfrm>
-                    <a:prstGeom prst="rect">
-                      <a:avLst/>
-                    </a:prstGeom>
-                    <a:noFill/>
-                    <a:ln w="9525">
-                      <a:noFill/>
-                      <a:headEnd/>
-                      <a:tailEnd/>
-                    </a:ln>
-                  </pic:spPr>
-                </pic:pic>
-              </a:graphicData>
-            </a:graphic>
-          </wp:inline>
-        </w:drawing>
-      </w:r>
-    </w:p>
-    <w:p>
-      <w:pPr>
-        <w:pStyle w:val="ImageCaption"/>
-      </w:pPr>
-      <w:r>
-        <w:t xml:space="preserve">Figure 1</w:t>
-      </w:r>
-    </w:p>
-    <w:p>
-      <w:pPr>
-        <w:pStyle w:val="BodyText"/>
-      </w:pPr>
-      <w:r>
-        <w:rPr>
-          <w:b/>
-          <w:bCs/>
-        </w:rPr>
-        <w:t xml:space="preserve">Figure 2.</w:t>
-      </w:r>
-      <w:r>
-        <w:t xml:space="preserve"> </w:t>
-      </w:r>
-      <w:r>
-        <w:t xml:space="preserve">Effect of labelling strategy on model performance. PSSM labels (94.8%), MHCflurry labels (91.9%), and random synthetic labels (65.8%). Note the concentration of performance degradation in the WB class.</w:t>
-      </w:r>
-    </w:p>
-    <w:p>
-      <w:pPr>
-        <w:pStyle w:val="CaptionedFigure"/>
-      </w:pPr>
-      <w:r>
-        <w:drawing>
-          <wp:inline>
-            <wp:extent cx="5334000" cy="3000374"/>
-            <wp:effectExtent b="0" l="0" r="0" t="0"/>
-            <wp:docPr descr="Figure 2" title="" id="55" name="Picture"/>
-            <a:graphic>
-              <a:graphicData uri="http://schemas.openxmlformats.org/drawingml/2006/picture">
-                <pic:pic>
-                  <pic:nvPicPr>
-                    <pic:cNvPr descr="../03_Analysis/figures/Figure2_label_comparison.png" id="56" name="Picture"/>
-                    <pic:cNvPicPr>
-                      <a:picLocks noChangeArrowheads="1" noChangeAspect="1"/>
-                    </pic:cNvPicPr>
-                  </pic:nvPicPr>
-                  <pic:blipFill>
-                    <a:blip r:embed="rId54"/>
-                    <a:stretch>
-                      <a:fillRect/>
-                    </a:stretch>
-                  </pic:blipFill>
-                  <pic:spPr bwMode="auto">
-                    <a:xfrm>
-                      <a:off x="0" y="0"/>
-                      <a:ext cx="5334000" cy="3000374"/>
-                    </a:xfrm>
-                    <a:prstGeom prst="rect">
-                      <a:avLst/>
-                    </a:prstGeom>
-                    <a:noFill/>
-                    <a:ln w="9525">
-                      <a:noFill/>
-                      <a:headEnd/>
-                      <a:tailEnd/>
-                    </a:ln>
-                  </pic:spPr>
-                </pic:pic>
-              </a:graphicData>
-            </a:graphic>
-          </wp:inline>
-        </w:drawing>
-      </w:r>
-    </w:p>
-    <w:p>
-      <w:pPr>
-        <w:pStyle w:val="ImageCaption"/>
-      </w:pPr>
-      <w:r>
-        <w:t xml:space="preserve">Figure 2</w:t>
-      </w:r>
-    </w:p>
-    <w:p>
-      <w:pPr>
-        <w:pStyle w:val="BodyText"/>
-      </w:pPr>
-      <w:r>
-        <w:rPr>
-          <w:b/>
-          <w:bCs/>
-        </w:rPr>
-        <w:t xml:space="preserve">Figure 3.</w:t>
-      </w:r>
-      <w:r>
-        <w:t xml:space="preserve"> </w:t>
-      </w:r>
-      <w:r>
-        <w:t xml:space="preserve">IEDB benchmark results. (A) ROC curve showing AUC 0.947. (B) Confusion matrix with counts and row percentages. (C) Per-epitope binding scores colour-coded by prediction outcome.</w:t>
-      </w:r>
-    </w:p>
-    <w:p>
-      <w:pPr>
-        <w:pStyle w:val="CaptionedFigure"/>
-      </w:pPr>
-      <w:r>
-        <w:drawing>
-          <wp:inline>
-            <wp:extent cx="5334000" cy="4800599"/>
-            <wp:effectExtent b="0" l="0" r="0" t="0"/>
-            <wp:docPr descr="Figure 3" title="" id="58" name="Picture"/>
-            <a:graphic>
-              <a:graphicData uri="http://schemas.openxmlformats.org/drawingml/2006/picture">
-                <pic:pic>
-                  <pic:nvPicPr>
-                    <pic:cNvPr descr="../03_Analysis/figures/Figure3_iedb_benchmark.png" id="59" name="Picture"/>
-                    <pic:cNvPicPr>
-                      <a:picLocks noChangeArrowheads="1" noChangeAspect="1"/>
-                    </pic:cNvPicPr>
-                  </pic:nvPicPr>
-                  <pic:blipFill>
-                    <a:blip r:embed="rId57"/>
-                    <a:stretch>
-                      <a:fillRect/>
-                    </a:stretch>
-                  </pic:blipFill>
-                  <pic:spPr bwMode="auto">
-                    <a:xfrm>
-                      <a:off x="0" y="0"/>
-                      <a:ext cx="5334000" cy="4800599"/>
-                    </a:xfrm>
-                    <a:prstGeom prst="rect">
-                      <a:avLst/>
-                    </a:prstGeom>
-                    <a:noFill/>
-                    <a:ln w="9525">
-                      <a:noFill/>
-                      <a:headEnd/>
-                      <a:tailEnd/>
-                    </a:ln>
-                  </pic:spPr>
-                </pic:pic>
-              </a:graphicData>
-            </a:graphic>
-          </wp:inline>
-        </w:drawing>
-      </w:r>
-    </w:p>
-    <w:p>
-      <w:pPr>
-        <w:pStyle w:val="ImageCaption"/>
-      </w:pPr>
-      <w:r>
-        <w:t xml:space="preserve">Figure 3</w:t>
-      </w:r>
-    </w:p>
-    <w:p>
-      <w:pPr>
-        <w:pStyle w:val="BodyText"/>
-      </w:pPr>
-      <w:r>
-        <w:rPr>
-          <w:b/>
-          <w:bCs/>
-        </w:rPr>
-        <w:t xml:space="preserve">Figure 4.</w:t>
-      </w:r>
-      <w:r>
-        <w:t xml:space="preserve"> </w:t>
-      </w:r>
-      <w:r>
-        <w:t xml:space="preserve">Protein epitope scanning summary. (A) SB/WB/NB distribution across 10 proteins. (B) Top 10 epitope candidates ranked by binding score.</w:t>
-      </w:r>
-    </w:p>
-    <w:p>
-      <w:pPr>
-        <w:pStyle w:val="CaptionedFigure"/>
-      </w:pPr>
-      <w:r>
-        <w:drawing>
-          <wp:inline>
-            <wp:extent cx="5334000" cy="3200399"/>
-            <wp:effectExtent b="0" l="0" r="0" t="0"/>
-            <wp:docPr descr="Figure 4" title="" id="61" name="Picture"/>
-            <a:graphic>
-              <a:graphicData uri="http://schemas.openxmlformats.org/drawingml/2006/picture">
-                <pic:pic>
-                  <pic:nvPicPr>
-                    <pic:cNvPr descr="../03_Analysis/figures/Figure4_protein_scan.png" id="62" name="Picture"/>
-                    <pic:cNvPicPr>
-                      <a:picLocks noChangeArrowheads="1" noChangeAspect="1"/>
-                    </pic:cNvPicPr>
-                  </pic:nvPicPr>
-                  <pic:blipFill>
-                    <a:blip r:embed="rId60"/>
-                    <a:stretch>
-                      <a:fillRect/>
-                    </a:stretch>
-                  </pic:blipFill>
-                  <pic:spPr bwMode="auto">
-                    <a:xfrm>
-                      <a:off x="0" y="0"/>
-                      <a:ext cx="5334000" cy="3200399"/>
-                    </a:xfrm>
-                    <a:prstGeom prst="rect">
-                      <a:avLst/>
-                    </a:prstGeom>
-                    <a:noFill/>
-                    <a:ln w="9525">
-                      <a:noFill/>
-                      <a:headEnd/>
-                      <a:tailEnd/>
-                    </a:ln>
-                  </pic:spPr>
-                </pic:pic>
-              </a:graphicData>
-            </a:graphic>
-          </wp:inline>
-        </w:drawing>
-      </w:r>
-    </w:p>
-    <w:p>
-      <w:pPr>
-        <w:pStyle w:val="ImageCaption"/>
-      </w:pPr>
-      <w:r>
-        <w:t xml:space="preserve">Figure 4</w:t>
-      </w:r>
-    </w:p>
-    <w:p>
-      <w:pPr>
-        <w:pStyle w:val="BodyText"/>
-      </w:pPr>
-      <w:r>
-        <w:rPr>
-          <w:b/>
-          <w:bCs/>
-        </w:rPr>
-        <w:t xml:space="preserve">Figure 5.</w:t>
-      </w:r>
-      <w:r>
-        <w:t xml:space="preserve"> </w:t>
-      </w:r>
-      <w:r>
-        <w:t xml:space="preserve">Cancer hotspot mutation analysis. (A) Delta score bar chart for 7 epitope-altering mutations. (B) Wild-type vs. mutant paired binding scores. (C) Mutation map of p53 and KRAS showing epitope-altering positions.</w:t>
-      </w:r>
-    </w:p>
-    <w:p>
-      <w:pPr>
-        <w:pStyle w:val="CaptionedFigure"/>
-      </w:pPr>
-      <w:r>
-        <w:drawing>
-          <wp:inline>
-            <wp:extent cx="5334000" cy="2444750"/>
-            <wp:effectExtent b="0" l="0" r="0" t="0"/>
-            <wp:docPr descr="Figure 5" title="" id="64" name="Picture"/>
-            <a:graphic>
-              <a:graphicData uri="http://schemas.openxmlformats.org/drawingml/2006/picture">
-                <pic:pic>
-                  <pic:nvPicPr>
-                    <pic:cNvPr descr="../03_Analysis/figures/Figure5_mutation_delta.png" id="65" name="Picture"/>
-                    <pic:cNvPicPr>
-                      <a:picLocks noChangeArrowheads="1" noChangeAspect="1"/>
-                    </pic:cNvPicPr>
-                  </pic:nvPicPr>
-                  <pic:blipFill>
-                    <a:blip r:embed="rId63"/>
-                    <a:stretch>
-                      <a:fillRect/>
-                    </a:stretch>
-                  </pic:blipFill>
-                  <pic:spPr bwMode="auto">
-                    <a:xfrm>
-                      <a:off x="0" y="0"/>
-                      <a:ext cx="5334000" cy="2444750"/>
-                    </a:xfrm>
-                    <a:prstGeom prst="rect">
-                      <a:avLst/>
-                    </a:prstGeom>
-                    <a:noFill/>
-                    <a:ln w="9525">
-                      <a:noFill/>
-                      <a:headEnd/>
-                      <a:tailEnd/>
-                    </a:ln>
-                  </pic:spPr>
-                </pic:pic>
-              </a:graphicData>
-            </a:graphic>
-          </wp:inline>
-        </w:drawing>
-      </w:r>
-    </w:p>
-    <w:p>
-      <w:pPr>
-        <w:pStyle w:val="ImageCaption"/>
-      </w:pPr>
-      <w:r>
-        <w:t xml:space="preserve">Figure 5</w:t>
-      </w:r>
-    </w:p>
-    <w:p>
-      <w:pPr>
-        <w:pStyle w:val="BodyText"/>
-      </w:pPr>
-      <w:r>
-        <w:rPr>
-          <w:b/>
-          <w:bCs/>
-        </w:rPr>
-        <w:t xml:space="preserve">Figure 6.</w:t>
-      </w:r>
-      <w:r>
-        <w:t xml:space="preserve"> </w:t>
-      </w:r>
-      <w:r>
-        <w:t xml:space="preserve">Learned feature representations. (A) BLOSUM62 encoding heatmaps (HOT colormap) for top 20 epitopes. (B) t-SNE visualisation of 45-dimensional penultimate-layer features, coloured by true class (SB red, WB green, NB navy). Note the continuous WB transition zone between SB and NB clusters, consistent with the graded affinity boundary. (C) t-SNE coloured by prediction correctness (green = correct, red = incorrect), showing errors concentrated at the WB–NB interface.</w:t>
-      </w:r>
-    </w:p>
-    <w:p>
-      <w:pPr>
-        <w:pStyle w:val="CaptionedFigure"/>
-      </w:pPr>
-      <w:r>
-        <w:drawing>
-          <wp:inline>
-            <wp:extent cx="5334000" cy="5334000"/>
-            <wp:effectExtent b="0" l="0" r="0" t="0"/>
-            <wp:docPr descr="Figure 6" title="" id="67" name="Picture"/>
-            <a:graphic>
-              <a:graphicData uri="http://schemas.openxmlformats.org/drawingml/2006/picture">
-                <pic:pic>
-                  <pic:nvPicPr>
-                    <pic:cNvPr descr="../03_Analysis/figures/Figure6_blosum62_heatmap.png" id="68" name="Picture"/>
-                    <pic:cNvPicPr>
-                      <a:picLocks noChangeArrowheads="1" noChangeAspect="1"/>
-                    </pic:cNvPicPr>
-                  </pic:nvPicPr>
-                  <pic:blipFill>
-                    <a:blip r:embed="rId66"/>
-                    <a:stretch>
-                      <a:fillRect/>
-                    </a:stretch>
-                  </pic:blipFill>
-                  <pic:spPr bwMode="auto">
-                    <a:xfrm>
-                      <a:off x="0" y="0"/>
-                      <a:ext cx="5334000" cy="5334000"/>
-                    </a:xfrm>
-                    <a:prstGeom prst="rect">
-                      <a:avLst/>
-                    </a:prstGeom>
-                    <a:noFill/>
-                    <a:ln w="9525">
-                      <a:noFill/>
-                      <a:headEnd/>
-                      <a:tailEnd/>
-                    </a:ln>
-                  </pic:spPr>
-                </pic:pic>
-              </a:graphicData>
-            </a:graphic>
-          </wp:inline>
-        </w:drawing>
-      </w:r>
-    </w:p>
-    <w:p>
-      <w:pPr>
-        <w:pStyle w:val="ImageCaption"/>
-      </w:pPr>
-      <w:r>
-        <w:t xml:space="preserve">Figure 6</w:t>
-      </w:r>
-    </w:p>
-    <w:p>
-      <w:pPr>
-        <w:pStyle w:val="BodyText"/>
-      </w:pPr>
-      <w:r>
-        <w:rPr>
-          <w:b/>
-          <w:bCs/>
-        </w:rPr>
-        <w:t xml:space="preserve">Figure 7.</w:t>
-      </w:r>
-      <w:r>
-        <w:t xml:space="preserve"> </w:t>
-      </w:r>
-      <w:r>
-        <w:t xml:space="preserve">ESM-2 embedding comparison. (A) Accuracy of five encoding strategies: BLOSUM62 baseline (91.9%, with 5-fold CV), ESM-2 t6 mean-pooled (65.9%), t12 per-position (90.9%), t12 per-position + L2 (91.5%), and t6 per-position (93.3%). Dashed line indicates BLOSUM62 baseline. Note that t12 per-position accuracy (90.9%) is coincidentally identical to the baseline FFN accuracy reported in Table 1 (90.9%); these represent separate models evaluated on the same test split. (B) Encoding dimensionality vs. accuracy, showing the optimal balance achieved by t6 per-position embeddings (2,880 dim). ESM-2 results are from a single train/test split and have not been cross-validated; error bars are not shown due to the single-split evaluation.</w:t>
-      </w:r>
-    </w:p>
-    <w:p>
-      <w:pPr>
-        <w:pStyle w:val="CaptionedFigure"/>
-      </w:pPr>
-      <w:r>
-        <w:drawing>
-          <wp:inline>
-            <wp:extent cx="5334000" cy="2424545"/>
-            <wp:effectExtent b="0" l="0" r="0" t="0"/>
-            <wp:docPr descr="Figure 7" title="" id="70" name="Picture"/>
-            <a:graphic>
-              <a:graphicData uri="http://schemas.openxmlformats.org/drawingml/2006/picture">
-                <pic:pic>
-                  <pic:nvPicPr>
-                    <pic:cNvPr descr="../03_Analysis/figures/Figure7_esm2_comparison.png" id="71" name="Picture"/>
-                    <pic:cNvPicPr>
-                      <a:picLocks noChangeArrowheads="1" noChangeAspect="1"/>
-                    </pic:cNvPicPr>
-                  </pic:nvPicPr>
-                  <pic:blipFill>
-                    <a:blip r:embed="rId69"/>
-                    <a:stretch>
-                      <a:fillRect/>
-                    </a:stretch>
-                  </pic:blipFill>
-                  <pic:spPr bwMode="auto">
-                    <a:xfrm>
-                      <a:off x="0" y="0"/>
-                      <a:ext cx="5334000" cy="2424545"/>
-                    </a:xfrm>
-                    <a:prstGeom prst="rect">
-                      <a:avLst/>
-                    </a:prstGeom>
-                    <a:noFill/>
-                    <a:ln w="9525">
-                      <a:noFill/>
-                      <a:headEnd/>
-                      <a:tailEnd/>
-                    </a:ln>
-                  </pic:spPr>
-                </pic:pic>
-              </a:graphicData>
-            </a:graphic>
-          </wp:inline>
-        </w:drawing>
-      </w:r>
-    </w:p>
-    <w:p>
-      <w:pPr>
-        <w:pStyle w:val="ImageCaption"/>
-      </w:pPr>
-      <w:r>
-        <w:t xml:space="preserve">Figure 7</w:t>
-      </w:r>
-    </w:p>
-    <w:p>
-      <w:pPr>
-        <w:pStyle w:val="BodyText"/>
-      </w:pPr>
-      <w:r>
-        <w:rPr>
-          <w:b/>
-          <w:bCs/>
-        </w:rPr>
-        <w:t xml:space="preserve">Figure 8.</w:t>
-      </w:r>
-      <w:r>
-        <w:t xml:space="preserve"> </w:t>
-      </w:r>
-      <w:r>
-        <w:t xml:space="preserve">Structural docking analysis of KRAS G12V neoepitope presentation by HLA-A*02:01. (A) Overview of the HLA-A*02:01 peptide-binding groove (PDB 1DUZ, molecular surface) with the docked KRAS G12V neoepitope YKLVVVGAV (sticks). (B) B-pocket detail showing the predicted K-E63 interaction. The estimated distance between the P2 lysine Nζ atom and Glu63 OE1/OE2 atoms (2.5-3.5 Å, from the docking pose) falls within salt bridge range (&lt; 4.0 Å). This represents a docking-derived structural hypothesis; experimental validation is required. (C) Schematic of the P2:Cα to E63:OE geometric feasibility assessment (reference threshold: 7.6 Å). The preliminary 10 ns MD simulation exhibited incomplete thermal equilibration and quantitative trajectory-derived distances are not reported.</w:t>
-      </w:r>
-    </w:p>
-    <w:p>
-      <w:pPr>
-        <w:pStyle w:val="CaptionedFigure"/>
-      </w:pPr>
-      <w:r>
-        <w:drawing>
-          <wp:inline>
-            <wp:extent cx="5334000" cy="7162685"/>
-            <wp:effectExtent b="0" l="0" r="0" t="0"/>
-            <wp:docPr descr="Figure 8" title="" id="73" name="Picture"/>
-            <a:graphic>
-              <a:graphicData uri="http://schemas.openxmlformats.org/drawingml/2006/picture">
-                <pic:pic>
-                  <pic:nvPicPr>
-                    <pic:cNvPr descr="../03_Analysis/figures/Figure8_mutation_map.png" id="74" name="Picture"/>
-                    <pic:cNvPicPr>
-                      <a:picLocks noChangeArrowheads="1" noChangeAspect="1"/>
-                    </pic:cNvPicPr>
-                  </pic:nvPicPr>
-                  <pic:blipFill>
-                    <a:blip r:embed="rId72"/>
-                    <a:stretch>
-                      <a:fillRect/>
-                    </a:stretch>
-                  </pic:blipFill>
-                  <pic:spPr bwMode="auto">
-                    <a:xfrm>
-                      <a:off x="0" y="0"/>
-                      <a:ext cx="5334000" cy="7162685"/>
-                    </a:xfrm>
-                    <a:prstGeom prst="rect">
-                      <a:avLst/>
-                    </a:prstGeom>
-                    <a:noFill/>
-                    <a:ln w="9525">
-                      <a:noFill/>
-                      <a:headEnd/>
-                      <a:tailEnd/>
-                    </a:ln>
-                  </pic:spPr>
-                </pic:pic>
-              </a:graphicData>
-            </a:graphic>
-          </wp:inline>
-        </w:drawing>
-      </w:r>
-    </w:p>
-    <w:p>
-      <w:pPr>
-        <w:pStyle w:val="ImageCaption"/>
-      </w:pPr>
-      <w:r>
-        <w:t xml:space="preserve">Figure 8</w:t>
-      </w:r>
-    </w:p>
-    <w:p>
-      <w:pPr>
-        <w:pStyle w:val="BodyText"/>
-      </w:pPr>
-      <w:r>
-        <w:rPr>
-          <w:b/>
-          <w:bCs/>
-        </w:rPr>
-        <w:t xml:space="preserve">Figure S1.</w:t>
-      </w:r>
-      <w:r>
-        <w:t xml:space="preserve"> </w:t>
-      </w:r>
-      <w:r>
-        <w:t xml:space="preserve">5-fold cross-validation fold-by-fold accuracy comparison.</w:t>
-      </w:r>
-    </w:p>
-    <w:p>
-      <w:pPr>
-        <w:pStyle w:val="CaptionedFigure"/>
-      </w:pPr>
-      <w:r>
-        <w:drawing>
-          <wp:inline>
-            <wp:extent cx="5334000" cy="3333749"/>
-            <wp:effectExtent b="0" l="0" r="0" t="0"/>
-            <wp:docPr descr="Figure S1" title="" id="76" name="Picture"/>
-            <a:graphic>
-              <a:graphicData uri="http://schemas.openxmlformats.org/drawingml/2006/picture">
-                <pic:pic>
-                  <pic:nvPicPr>
-                    <pic:cNvPr descr="../03_Analysis/figures/FigureS1_per_class_f1.png" id="77" name="Picture"/>
-                    <pic:cNvPicPr>
-                      <a:picLocks noChangeArrowheads="1" noChangeAspect="1"/>
-                    </pic:cNvPicPr>
-                  </pic:nvPicPr>
-                  <pic:blipFill>
-                    <a:blip r:embed="rId75"/>
-                    <a:stretch>
-                      <a:fillRect/>
-                    </a:stretch>
-                  </pic:blipFill>
-                  <pic:spPr bwMode="auto">
-                    <a:xfrm>
-                      <a:off x="0" y="0"/>
-                      <a:ext cx="5334000" cy="3333749"/>
-                    </a:xfrm>
-                    <a:prstGeom prst="rect">
-                      <a:avLst/>
-                    </a:prstGeom>
-                    <a:noFill/>
-                    <a:ln w="9525">
-                      <a:noFill/>
-                      <a:headEnd/>
-                      <a:tailEnd/>
-                    </a:ln>
-                  </pic:spPr>
-                </pic:pic>
-              </a:graphicData>
-            </a:graphic>
-          </wp:inline>
-        </w:drawing>
-      </w:r>
-    </w:p>
-    <w:p>
-      <w:pPr>
-        <w:pStyle w:val="ImageCaption"/>
-      </w:pPr>
-      <w:r>
-        <w:t xml:space="preserve">Figure S1</w:t>
-      </w:r>
-    </w:p>
-    <w:p>
-      <w:pPr>
-        <w:pStyle w:val="BodyText"/>
-      </w:pPr>
-      <w:r>
-        <w:rPr>
-          <w:b/>
-          <w:bCs/>
-        </w:rPr>
-        <w:t xml:space="preserve">Figure S2.</w:t>
-      </w:r>
-      <w:r>
-        <w:t xml:space="preserve"> </w:t>
-      </w:r>
-      <w:r>
-        <w:t xml:space="preserve">Full IEDB benchmark per-epitope prediction table.</w:t>
-      </w:r>
-    </w:p>
-    <w:p>
-      <w:pPr>
-        <w:pStyle w:val="CaptionedFigure"/>
-      </w:pPr>
-      <w:r>
-        <w:drawing>
-          <wp:inline>
-            <wp:extent cx="5334000" cy="2963333"/>
-            <wp:effectExtent b="0" l="0" r="0" t="0"/>
-            <wp:docPr descr="Figure S2" title="" id="79" name="Picture"/>
-            <a:graphic>
-              <a:graphicData uri="http://schemas.openxmlformats.org/drawingml/2006/picture">
-                <pic:pic>
-                  <pic:nvPicPr>
-                    <pic:cNvPr descr="../03_Analysis/figures/FigureS2_cv_folds.png" id="80" name="Picture"/>
-                    <pic:cNvPicPr>
-                      <a:picLocks noChangeArrowheads="1" noChangeAspect="1"/>
-                    </pic:cNvPicPr>
-                  </pic:nvPicPr>
-                  <pic:blipFill>
-                    <a:blip r:embed="rId78"/>
-                    <a:stretch>
-                      <a:fillRect/>
-                    </a:stretch>
-                  </pic:blipFill>
-                  <pic:spPr bwMode="auto">
-                    <a:xfrm>
-                      <a:off x="0" y="0"/>
-                      <a:ext cx="5334000" cy="2963333"/>
-                    </a:xfrm>
-                    <a:prstGeom prst="rect">
-                      <a:avLst/>
-                    </a:prstGeom>
-                    <a:noFill/>
-                    <a:ln w="9525">
-                      <a:noFill/>
-                      <a:headEnd/>
-                      <a:tailEnd/>
-                    </a:ln>
-                  </pic:spPr>
-                </pic:pic>
-              </a:graphicData>
-            </a:graphic>
-          </wp:inline>
-        </w:drawing>
-      </w:r>
-    </w:p>
-    <w:p>
-      <w:pPr>
-        <w:pStyle w:val="ImageCaption"/>
-      </w:pPr>
-      <w:r>
-        <w:t xml:space="preserve">Figure S2</w:t>
-      </w:r>
-    </w:p>
-    <w:p>
-      <w:pPr>
-        <w:pStyle w:val="BodyText"/>
-      </w:pPr>
-      <w:r>
-        <w:rPr>
-          <w:b/>
-          <w:bCs/>
-        </w:rPr>
-        <w:t xml:space="preserve">Figure S3.</w:t>
-      </w:r>
-      <w:r>
-        <w:t xml:space="preserve"> </w:t>
-      </w:r>
-      <w:r>
-        <w:t xml:space="preserve">Per-protein epitope scan results for all 10 proteins.</w:t>
-      </w:r>
-    </w:p>
-    <w:p>
-      <w:pPr>
-        <w:pStyle w:val="CaptionedFigure"/>
-      </w:pPr>
-      <w:r>
-        <w:drawing>
-          <wp:inline>
-            <wp:extent cx="5334000" cy="3000374"/>
-            <wp:effectExtent b="0" l="0" r="0" t="0"/>
-            <wp:docPr descr="Figure S3" title="" id="82" name="Picture"/>
-            <a:graphic>
-              <a:graphicData uri="http://schemas.openxmlformats.org/drawingml/2006/picture">
-                <pic:pic>
-                  <pic:nvPicPr>
-                    <pic:cNvPr descr="../03_Analysis/figures/FigureS3_confusion_matrix.png" id="83" name="Picture"/>
-                    <pic:cNvPicPr>
-                      <a:picLocks noChangeArrowheads="1" noChangeAspect="1"/>
-                    </pic:cNvPicPr>
-                  </pic:nvPicPr>
-                  <pic:blipFill>
-                    <a:blip r:embed="rId81"/>
-                    <a:stretch>
-                      <a:fillRect/>
-                    </a:stretch>
-                  </pic:blipFill>
-                  <pic:spPr bwMode="auto">
-                    <a:xfrm>
-                      <a:off x="0" y="0"/>
-                      <a:ext cx="5334000" cy="3000374"/>
-                    </a:xfrm>
-                    <a:prstGeom prst="rect">
-                      <a:avLst/>
-                    </a:prstGeom>
-                    <a:noFill/>
-                    <a:ln w="9525">
-                      <a:noFill/>
-                      <a:headEnd/>
-                      <a:tailEnd/>
-                    </a:ln>
-                  </pic:spPr>
-                </pic:pic>
-              </a:graphicData>
-            </a:graphic>
-          </wp:inline>
-        </w:drawing>
-      </w:r>
-    </w:p>
-    <w:p>
-      <w:pPr>
-        <w:pStyle w:val="ImageCaption"/>
-      </w:pPr>
-      <w:r>
-        <w:t xml:space="preserve">Figure S3</w:t>
-      </w:r>
-    </w:p>
-    <w:p>
-      <w:pPr>
-        <w:pStyle w:val="BodyText"/>
-      </w:pPr>
-      <w:r>
-        <w:rPr>
-          <w:b/>
-          <w:bCs/>
-        </w:rPr>
-        <w:t xml:space="preserve">Figure S4.</w:t>
-      </w:r>
-      <w:r>
-        <w:t xml:space="preserve"> </w:t>
-      </w:r>
-      <w:r>
-        <w:t xml:space="preserve">Training history (loss and accuracy) for all neural network models.</w:t>
-      </w:r>
-    </w:p>
-    <w:p>
-      <w:pPr>
-        <w:pStyle w:val="CaptionedFigure"/>
-      </w:pPr>
-      <w:r>
-        <w:drawing>
-          <wp:inline>
-            <wp:extent cx="5334000" cy="1555749"/>
-            <wp:effectExtent b="0" l="0" r="0" t="0"/>
-            <wp:docPr descr="Figure S4" title="" id="85" name="Picture"/>
-            <a:graphic>
-              <a:graphicData uri="http://schemas.openxmlformats.org/drawingml/2006/picture">
-                <pic:pic>
-                  <pic:nvPicPr>
-                    <pic:cNvPr descr="../03_Analysis/figures/FigureS4_mutation_paired.png" id="86" name="Picture"/>
-                    <pic:cNvPicPr>
-                      <a:picLocks noChangeArrowheads="1" noChangeAspect="1"/>
-                    </pic:cNvPicPr>
-                  </pic:nvPicPr>
-                  <pic:blipFill>
-                    <a:blip r:embed="rId84"/>
-                    <a:stretch>
-                      <a:fillRect/>
-                    </a:stretch>
-                  </pic:blipFill>
-                  <pic:spPr bwMode="auto">
-                    <a:xfrm>
-                      <a:off x="0" y="0"/>
-                      <a:ext cx="5334000" cy="1555749"/>
-                    </a:xfrm>
-                    <a:prstGeom prst="rect">
-                      <a:avLst/>
-                    </a:prstGeom>
-                    <a:noFill/>
-                    <a:ln w="9525">
-                      <a:noFill/>
-                      <a:headEnd/>
-                      <a:tailEnd/>
-                    </a:ln>
-                  </pic:spPr>
-                </pic:pic>
-              </a:graphicData>
-            </a:graphic>
-          </wp:inline>
-        </w:drawing>
-      </w:r>
-    </w:p>
-    <w:p>
-      <w:pPr>
-        <w:pStyle w:val="ImageCaption"/>
-      </w:pPr>
-      <w:r>
-        <w:t xml:space="preserve">Figure S4</w:t>
-      </w:r>
-    </w:p>
-    <w:p>
-      <w:pPr>
-        <w:pStyle w:val="BodyText"/>
-      </w:pPr>
-      <w:r>
-        <w:rPr>
-          <w:b/>
-          <w:bCs/>
-        </w:rPr>
-        <w:t xml:space="preserve">Figure S5.</w:t>
-      </w:r>
-      <w:r>
-        <w:t xml:space="preserve"> </w:t>
-      </w:r>
-      <w:r>
-        <w:t xml:space="preserve">Cancer mutation frequency landscape. p53 R248W is among the top 8 most common TP53 hotspots across all cancers (3.5% of all TP53 mutations, IARC R18), with highest prominence in skin SCC, colorectal, and oesophageal adenocarcinoma. KRAS G12V is the second most frequent KRAS mutation after G12D, accounting for 28–36% of KRAS-mutant pancreatic adenocarcinoma (PAAD) and ~19% of KRAS-mutant lung adenocarcinoma. Red-highlighted bars indicate cancer types where the neoepitope candidates identified in this study (p53 R248W:</w:t>
-      </w:r>
-      <w:r>
-        <w:t xml:space="preserve"> </w:t>
-      </w:r>
-      <w:r>
-        <w:rPr>
-          <w:rStyle w:val="VerbatimChar"/>
-        </w:rPr>
-        <w:t xml:space="preserve">MNWRPILTI</w:t>
-      </w:r>
-      <w:r>
-        <w:t xml:space="preserve">; KRAS G12V:</w:t>
-      </w:r>
-      <w:r>
-        <w:t xml:space="preserve"> </w:t>
-      </w:r>
-      <w:r>
-        <w:rPr>
-          <w:rStyle w:val="VerbatimChar"/>
-        </w:rPr>
-        <w:t xml:space="preserve">YKLVVVGAV</w:t>
-      </w:r>
-      <w:r>
-        <w:t xml:space="preserve">) have translational relevance.</w:t>
-      </w:r>
-    </w:p>
-    <w:p>
-      <w:pPr>
-        <w:pStyle w:val="CaptionedFigure"/>
-      </w:pPr>
-      <w:r>
-        <w:drawing>
-          <wp:inline>
-            <wp:extent cx="5334000" cy="2933700"/>
-            <wp:effectExtent b="0" l="0" r="0" t="0"/>
-            <wp:docPr descr="Figure S5" title="" id="88" name="Picture"/>
-            <a:graphic>
-              <a:graphicData uri="http://schemas.openxmlformats.org/drawingml/2006/picture">
-                <pic:pic>
-                  <pic:nvPicPr>
-                    <pic:cNvPr descr="../03_Analysis/figures/FigureS5_tcga_frequency.png" id="89" name="Picture"/>
-                    <pic:cNvPicPr>
-                      <a:picLocks noChangeArrowheads="1" noChangeAspect="1"/>
-                    </pic:cNvPicPr>
-                  </pic:nvPicPr>
-                  <pic:blipFill>
-                    <a:blip r:embed="rId87"/>
-                    <a:stretch>
-                      <a:fillRect/>
-                    </a:stretch>
-                  </pic:blipFill>
-                  <pic:spPr bwMode="auto">
-                    <a:xfrm>
-                      <a:off x="0" y="0"/>
-                      <a:ext cx="5334000" cy="2933700"/>
-                    </a:xfrm>
-                    <a:prstGeom prst="rect">
-                      <a:avLst/>
-                    </a:prstGeom>
-                    <a:noFill/>
-                    <a:ln w="9525">
-                      <a:noFill/>
-                      <a:headEnd/>
-                      <a:tailEnd/>
-                    </a:ln>
-                  </pic:spPr>
-                </pic:pic>
-              </a:graphicData>
-            </a:graphic>
-          </wp:inline>
-        </w:drawing>
-      </w:r>
-    </w:p>
-    <w:p>
-      <w:pPr>
-        <w:pStyle w:val="ImageCaption"/>
-      </w:pPr>
-      <w:r>
-        <w:t xml:space="preserve">Figure S5</w:t>
-      </w:r>
-    </w:p>
-    <w:p>
-      <w:r>
-        <w:pict>
-          <v:rect style="width:0;height:1.5pt" o:hralign="center" o:hrstd="t" o:hr="t"/>
-        </w:pict>
-      </w:r>
-    </w:p>
-    <w:p>
-      <w:r>
-        <w:pict>
-          <v:rect style="width:0;height:1.5pt" o:hralign="center" o:hrstd="t" o:hr="t"/>
-        </w:pict>
-      </w:r>
-    </w:p>
-    <w:p>
-      <w:pPr>
-        <w:pStyle w:val="FirstParagraph"/>
-      </w:pPr>
-      <w:r>
-        <w:rPr>
-          <w:i/>
-          <w:iCs/>
-        </w:rPr>
-        <w:t xml:space="preserve">Manuscript prepared for Briefings in Bioinformatics. Date: July 3, 2026.</w:t>
-      </w:r>
-    </w:p>
-    <w:bookmarkEnd w:id="90"/>
-    <w:bookmarkEnd w:id="91"/>
+    <w:bookmarkEnd w:id="56"/>
+    <w:bookmarkEnd w:id="57"/>
     <w:sectPr>
       <w:footnotePr>
         <w:numRestart w:val="eachSect"/>
@@ -6464,129 +5504,11 @@
       </w:rPr>
     </w:lvl>
   </w:abstractNum>
-  <w:abstractNum w:abstractNumId="99411">
-    <w:nsid w:val="00A99411"/>
-    <w:multiLevelType w:val="multilevel"/>
-    <w:lvl w:ilvl="0">
-      <w:start w:val="1"/>
-      <w:numFmt w:val="decimal"/>
-      <w:lvlText w:val="%1."/>
-      <w:lvlJc w:val="left"/>
-      <w:pPr>
-        <w:ind w:left="720" w:hanging="360"/>
-      </w:pPr>
-    </w:lvl>
-    <w:lvl w:ilvl="1">
-      <w:start w:val="1"/>
-      <w:numFmt w:val="decimal"/>
-      <w:lvlText w:val="%2."/>
-      <w:lvlJc w:val="left"/>
-      <w:pPr>
-        <w:ind w:left="1440" w:hanging="360"/>
-      </w:pPr>
-    </w:lvl>
-    <w:lvl w:ilvl="2">
-      <w:start w:val="1"/>
-      <w:numFmt w:val="decimal"/>
-      <w:lvlText w:val="%3."/>
-      <w:lvlJc w:val="left"/>
-      <w:pPr>
-        <w:ind w:left="2160" w:hanging="360"/>
-      </w:pPr>
-    </w:lvl>
-    <w:lvl w:ilvl="3">
-      <w:start w:val="1"/>
-      <w:numFmt w:val="decimal"/>
-      <w:lvlText w:val="%4."/>
-      <w:lvlJc w:val="left"/>
-      <w:pPr>
-        <w:ind w:left="2880" w:hanging="360"/>
-      </w:pPr>
-    </w:lvl>
-    <w:lvl w:ilvl="4">
-      <w:start w:val="1"/>
-      <w:numFmt w:val="decimal"/>
-      <w:lvlText w:val="%5."/>
-      <w:lvlJc w:val="left"/>
-      <w:pPr>
-        <w:ind w:left="3600" w:hanging="360"/>
-      </w:pPr>
-    </w:lvl>
-    <w:lvl w:ilvl="5">
-      <w:start w:val="1"/>
-      <w:numFmt w:val="decimal"/>
-      <w:lvlText w:val="%6."/>
-      <w:lvlJc w:val="left"/>
-      <w:pPr>
-        <w:ind w:left="4320" w:hanging="360"/>
-      </w:pPr>
-    </w:lvl>
-    <w:lvl w:ilvl="6">
-      <w:start w:val="1"/>
-      <w:numFmt w:val="decimal"/>
-      <w:lvlText w:val="%7."/>
-      <w:lvlJc w:val="left"/>
-      <w:pPr>
-        <w:ind w:left="5040" w:hanging="360"/>
-      </w:pPr>
-    </w:lvl>
-    <w:lvl w:ilvl="7">
-      <w:start w:val="1"/>
-      <w:numFmt w:val="decimal"/>
-      <w:lvlText w:val="%8."/>
-      <w:lvlJc w:val="left"/>
-      <w:pPr>
-        <w:ind w:left="5760" w:hanging="360"/>
-      </w:pPr>
-    </w:lvl>
-    <w:lvl w:ilvl="8">
-      <w:start w:val="1"/>
-      <w:numFmt w:val="decimal"/>
-      <w:lvlText w:val="%9."/>
-      <w:lvlJc w:val="left"/>
-      <w:pPr>
-        <w:ind w:left="6480" w:hanging="360"/>
-      </w:pPr>
-    </w:lvl>
-  </w:abstractNum>
   <w:num w:numId="1000">
     <w:abstractNumId w:val="990"/>
   </w:num>
   <w:num w:numId="1001">
     <w:abstractNumId w:val="991"/>
-  </w:num>
-  <w:num w:numId="1002">
-    <w:abstractNumId w:val="991"/>
-  </w:num>
-  <w:num w:numId="1003">
-    <w:abstractNumId w:val="99411"/>
-    <w:lvlOverride w:ilvl="0">
-      <w:startOverride w:val="1"/>
-    </w:lvlOverride>
-    <w:lvlOverride w:ilvl="1">
-      <w:startOverride w:val="1"/>
-    </w:lvlOverride>
-    <w:lvlOverride w:ilvl="2">
-      <w:startOverride w:val="1"/>
-    </w:lvlOverride>
-    <w:lvlOverride w:ilvl="3">
-      <w:startOverride w:val="1"/>
-    </w:lvlOverride>
-    <w:lvlOverride w:ilvl="4">
-      <w:startOverride w:val="1"/>
-    </w:lvlOverride>
-    <w:lvlOverride w:ilvl="5">
-      <w:startOverride w:val="1"/>
-    </w:lvlOverride>
-    <w:lvlOverride w:ilvl="6">
-      <w:startOverride w:val="1"/>
-    </w:lvlOverride>
-    <w:lvlOverride w:ilvl="7">
-      <w:startOverride w:val="1"/>
-    </w:lvlOverride>
-    <w:lvlOverride w:ilvl="8">
-      <w:startOverride w:val="1"/>
-    </w:lvlOverride>
   </w:num>
 </w:numbering>
 </file>

</xml_diff>